<commit_message>
[문서] 02_Insecure_DOR.docx에 Student/StudentDetail/Department 권한 정책 비교 추가
- af30633, 8cc501f, 7148c83 세 커밋 내용을 "6-1. Student / StudentDetail / Department 권한 정책 재정비" 섹션으로 반영
- 세 엔티티의 전체목록/단건/등록/수정/삭제 권한을 한눈에 비교하는 표 추가
</commit_message>
<xml_diff>
--- a/docs/security/02_Insecure_DOR.docx
+++ b/docs/security/02_Insecure_DOR.docx
@@ -472,8 +472,6 @@
       <w:pPr>
         <w:spacing w:after="100" w:line="276" w:lineRule="auto"/>
       </w:pPr>
-      <w:bookmarkStart w:id="0" w:name="_GoBack"/>
-      <w:bookmarkEnd w:id="0"/>
     </w:p>
     <w:p>
       <w:r>
@@ -1654,6 +1652,1129 @@
     </w:p>
     <w:p>
       <w:pPr>
+        <w:pStyle w:val="3"/>
+        <w:spacing w:before="200" w:after="90"/>
+      </w:pPr>
+      <w:r>
+        <w:rPr>
+          <w:b/>
+          <w:bCs/>
+          <w:color w:val="2E5496"/>
+        </w:rPr>
+        <w:t xml:space="preserve">6-1. Student / StudentDetail / Department </w:t>
+      </w:r>
+      <w:r>
+        <w:rPr>
+          <w:b/>
+          <w:bCs/>
+          <w:color w:val="2E5496"/>
+        </w:rPr>
+        <w:t>권한</w:t>
+      </w:r>
+      <w:r>
+        <w:rPr>
+          <w:b/>
+          <w:bCs/>
+          <w:color w:val="2E5496"/>
+        </w:rPr>
+        <w:t xml:space="preserve"> </w:t>
+      </w:r>
+      <w:r>
+        <w:rPr>
+          <w:b/>
+          <w:bCs/>
+          <w:color w:val="2E5496"/>
+        </w:rPr>
+        <w:t>정책</w:t>
+      </w:r>
+    </w:p>
+    <w:tbl>
+      <w:tblPr>
+        <w:tblW w:w="9000" w:type="dxa"/>
+        <w:tblBorders>
+          <w:top w:val="single" w:sz="4" w:space="0" w:color="auto"/>
+          <w:left w:val="single" w:sz="4" w:space="0" w:color="auto"/>
+          <w:bottom w:val="single" w:sz="4" w:space="0" w:color="auto"/>
+          <w:right w:val="single" w:sz="4" w:space="0" w:color="auto"/>
+          <w:insideH w:val="single" w:sz="4" w:space="0" w:color="auto"/>
+          <w:insideV w:val="single" w:sz="4" w:space="0" w:color="auto"/>
+        </w:tblBorders>
+        <w:tblCellMar>
+          <w:left w:w="10" w:type="dxa"/>
+          <w:right w:w="10" w:type="dxa"/>
+        </w:tblCellMar>
+        <w:tblLook w:val="0000" w:firstRow="0" w:lastRow="0" w:firstColumn="0" w:lastColumn="0" w:noHBand="0" w:noVBand="0"/>
+      </w:tblPr>
+      <w:tblGrid>
+        <w:gridCol w:w="1346"/>
+        <w:gridCol w:w="1722"/>
+        <w:gridCol w:w="1450"/>
+        <w:gridCol w:w="1346"/>
+        <w:gridCol w:w="1790"/>
+        <w:gridCol w:w="1346"/>
+      </w:tblGrid>
+      <w:tr>
+        <w:trPr>
+          <w:tblHeader/>
+        </w:trPr>
+        <w:tc>
+          <w:tcPr>
+            <w:tcW w:w="1346" w:type="dxa"/>
+            <w:shd w:val="clear" w:color="auto" w:fill="2E5496"/>
+            <w:tcMar>
+              <w:top w:w="60" w:type="dxa"/>
+              <w:left w:w="90" w:type="dxa"/>
+              <w:bottom w:w="60" w:type="dxa"/>
+              <w:right w:w="90" w:type="dxa"/>
+            </w:tcMar>
+          </w:tcPr>
+          <w:p>
+            <w:r>
+              <w:rPr>
+                <w:b/>
+                <w:bCs/>
+                <w:color w:val="FFFFFF"/>
+                <w:sz w:val="19"/>
+                <w:szCs w:val="19"/>
+              </w:rPr>
+              <w:t>엔티티</w:t>
+            </w:r>
+          </w:p>
+        </w:tc>
+        <w:tc>
+          <w:tcPr>
+            <w:tcW w:w="1722" w:type="dxa"/>
+            <w:shd w:val="clear" w:color="auto" w:fill="2E5496"/>
+            <w:tcMar>
+              <w:top w:w="60" w:type="dxa"/>
+              <w:left w:w="90" w:type="dxa"/>
+              <w:bottom w:w="60" w:type="dxa"/>
+              <w:right w:w="90" w:type="dxa"/>
+            </w:tcMar>
+          </w:tcPr>
+          <w:p>
+            <w:r>
+              <w:rPr>
+                <w:b/>
+                <w:bCs/>
+                <w:color w:val="FFFFFF"/>
+                <w:sz w:val="19"/>
+                <w:szCs w:val="19"/>
+              </w:rPr>
+              <w:t>전체목록</w:t>
+            </w:r>
+            <w:r>
+              <w:rPr>
+                <w:b/>
+                <w:bCs/>
+                <w:color w:val="FFFFFF"/>
+                <w:sz w:val="19"/>
+                <w:szCs w:val="19"/>
+              </w:rPr>
+              <w:t xml:space="preserve"> </w:t>
+            </w:r>
+            <w:r>
+              <w:rPr>
+                <w:b/>
+                <w:bCs/>
+                <w:color w:val="FFFFFF"/>
+                <w:sz w:val="19"/>
+                <w:szCs w:val="19"/>
+              </w:rPr>
+              <w:t>조회</w:t>
+            </w:r>
+          </w:p>
+        </w:tc>
+        <w:tc>
+          <w:tcPr>
+            <w:tcW w:w="1450" w:type="dxa"/>
+            <w:shd w:val="clear" w:color="auto" w:fill="2E5496"/>
+            <w:tcMar>
+              <w:top w:w="60" w:type="dxa"/>
+              <w:left w:w="90" w:type="dxa"/>
+              <w:bottom w:w="60" w:type="dxa"/>
+              <w:right w:w="90" w:type="dxa"/>
+            </w:tcMar>
+          </w:tcPr>
+          <w:p>
+            <w:r>
+              <w:rPr>
+                <w:b/>
+                <w:bCs/>
+                <w:color w:val="FFFFFF"/>
+                <w:sz w:val="19"/>
+                <w:szCs w:val="19"/>
+              </w:rPr>
+              <w:t>단건</w:t>
+            </w:r>
+            <w:r>
+              <w:rPr>
+                <w:b/>
+                <w:bCs/>
+                <w:color w:val="FFFFFF"/>
+                <w:sz w:val="19"/>
+                <w:szCs w:val="19"/>
+              </w:rPr>
+              <w:t xml:space="preserve"> </w:t>
+            </w:r>
+            <w:r>
+              <w:rPr>
+                <w:b/>
+                <w:bCs/>
+                <w:color w:val="FFFFFF"/>
+                <w:sz w:val="19"/>
+                <w:szCs w:val="19"/>
+              </w:rPr>
+              <w:t>조회</w:t>
+            </w:r>
+          </w:p>
+        </w:tc>
+        <w:tc>
+          <w:tcPr>
+            <w:tcW w:w="1346" w:type="dxa"/>
+            <w:shd w:val="clear" w:color="auto" w:fill="2E5496"/>
+            <w:tcMar>
+              <w:top w:w="60" w:type="dxa"/>
+              <w:left w:w="90" w:type="dxa"/>
+              <w:bottom w:w="60" w:type="dxa"/>
+              <w:right w:w="90" w:type="dxa"/>
+            </w:tcMar>
+          </w:tcPr>
+          <w:p>
+            <w:r>
+              <w:rPr>
+                <w:b/>
+                <w:bCs/>
+                <w:color w:val="FFFFFF"/>
+                <w:sz w:val="19"/>
+                <w:szCs w:val="19"/>
+              </w:rPr>
+              <w:t>등록</w:t>
+            </w:r>
+          </w:p>
+        </w:tc>
+        <w:tc>
+          <w:tcPr>
+            <w:tcW w:w="1790" w:type="dxa"/>
+            <w:shd w:val="clear" w:color="auto" w:fill="2E5496"/>
+            <w:tcMar>
+              <w:top w:w="60" w:type="dxa"/>
+              <w:left w:w="90" w:type="dxa"/>
+              <w:bottom w:w="60" w:type="dxa"/>
+              <w:right w:w="90" w:type="dxa"/>
+            </w:tcMar>
+          </w:tcPr>
+          <w:p>
+            <w:r>
+              <w:rPr>
+                <w:b/>
+                <w:bCs/>
+                <w:color w:val="FFFFFF"/>
+                <w:sz w:val="19"/>
+                <w:szCs w:val="19"/>
+              </w:rPr>
+              <w:t>수정</w:t>
+            </w:r>
+          </w:p>
+        </w:tc>
+        <w:tc>
+          <w:tcPr>
+            <w:tcW w:w="1346" w:type="dxa"/>
+            <w:shd w:val="clear" w:color="auto" w:fill="2E5496"/>
+            <w:tcMar>
+              <w:top w:w="60" w:type="dxa"/>
+              <w:left w:w="90" w:type="dxa"/>
+              <w:bottom w:w="60" w:type="dxa"/>
+              <w:right w:w="90" w:type="dxa"/>
+            </w:tcMar>
+          </w:tcPr>
+          <w:p>
+            <w:r>
+              <w:rPr>
+                <w:b/>
+                <w:bCs/>
+                <w:color w:val="FFFFFF"/>
+                <w:sz w:val="19"/>
+                <w:szCs w:val="19"/>
+              </w:rPr>
+              <w:t>삭제</w:t>
+            </w:r>
+          </w:p>
+        </w:tc>
+      </w:tr>
+      <w:tr>
+        <w:tc>
+          <w:tcPr>
+            <w:tcW w:w="1346" w:type="dxa"/>
+            <w:tcMar>
+              <w:top w:w="60" w:type="dxa"/>
+              <w:left w:w="90" w:type="dxa"/>
+              <w:bottom w:w="60" w:type="dxa"/>
+              <w:right w:w="90" w:type="dxa"/>
+            </w:tcMar>
+          </w:tcPr>
+          <w:p>
+            <w:r>
+              <w:rPr>
+                <w:sz w:val="19"/>
+                <w:szCs w:val="19"/>
+              </w:rPr>
+              <w:t>Student</w:t>
+            </w:r>
+          </w:p>
+        </w:tc>
+        <w:tc>
+          <w:tcPr>
+            <w:tcW w:w="1722" w:type="dxa"/>
+            <w:tcMar>
+              <w:top w:w="60" w:type="dxa"/>
+              <w:left w:w="90" w:type="dxa"/>
+              <w:bottom w:w="60" w:type="dxa"/>
+              <w:right w:w="90" w:type="dxa"/>
+            </w:tcMar>
+          </w:tcPr>
+          <w:p>
+            <w:r>
+              <w:rPr>
+                <w:sz w:val="19"/>
+                <w:szCs w:val="19"/>
+              </w:rPr>
+              <w:t>ROLE_ADMIN</w:t>
+            </w:r>
+          </w:p>
+        </w:tc>
+        <w:tc>
+          <w:tcPr>
+            <w:tcW w:w="1450" w:type="dxa"/>
+            <w:tcMar>
+              <w:top w:w="60" w:type="dxa"/>
+              <w:left w:w="90" w:type="dxa"/>
+              <w:bottom w:w="60" w:type="dxa"/>
+              <w:right w:w="90" w:type="dxa"/>
+            </w:tcMar>
+          </w:tcPr>
+          <w:p>
+            <w:r>
+              <w:rPr>
+                <w:sz w:val="19"/>
+                <w:szCs w:val="19"/>
+              </w:rPr>
+              <w:t>ROLE_USER / ROLE_ADMIN</w:t>
+            </w:r>
+          </w:p>
+        </w:tc>
+        <w:tc>
+          <w:tcPr>
+            <w:tcW w:w="1346" w:type="dxa"/>
+            <w:tcMar>
+              <w:top w:w="60" w:type="dxa"/>
+              <w:left w:w="90" w:type="dxa"/>
+              <w:bottom w:w="60" w:type="dxa"/>
+              <w:right w:w="90" w:type="dxa"/>
+            </w:tcMar>
+          </w:tcPr>
+          <w:p>
+            <w:r>
+              <w:rPr>
+                <w:sz w:val="19"/>
+                <w:szCs w:val="19"/>
+              </w:rPr>
+              <w:t>ROLE_USER / ROLE_ADMIN</w:t>
+            </w:r>
+          </w:p>
+        </w:tc>
+        <w:tc>
+          <w:tcPr>
+            <w:tcW w:w="1790" w:type="dxa"/>
+            <w:tcMar>
+              <w:top w:w="60" w:type="dxa"/>
+              <w:left w:w="90" w:type="dxa"/>
+              <w:bottom w:w="60" w:type="dxa"/>
+              <w:right w:w="90" w:type="dxa"/>
+            </w:tcMar>
+          </w:tcPr>
+          <w:p>
+            <w:r>
+              <w:rPr>
+                <w:sz w:val="19"/>
+                <w:szCs w:val="19"/>
+              </w:rPr>
+              <w:t>ROLE_USER / ROLE_ADMIN (</w:t>
+            </w:r>
+            <w:r>
+              <w:rPr>
+                <w:sz w:val="19"/>
+                <w:szCs w:val="19"/>
+              </w:rPr>
+              <w:t>소유자만</w:t>
+            </w:r>
+            <w:r>
+              <w:rPr>
+                <w:sz w:val="19"/>
+                <w:szCs w:val="19"/>
+              </w:rPr>
+              <w:t>)</w:t>
+            </w:r>
+          </w:p>
+        </w:tc>
+        <w:tc>
+          <w:tcPr>
+            <w:tcW w:w="1346" w:type="dxa"/>
+            <w:tcMar>
+              <w:top w:w="60" w:type="dxa"/>
+              <w:left w:w="90" w:type="dxa"/>
+              <w:bottom w:w="60" w:type="dxa"/>
+              <w:right w:w="90" w:type="dxa"/>
+            </w:tcMar>
+          </w:tcPr>
+          <w:p>
+            <w:r>
+              <w:rPr>
+                <w:sz w:val="19"/>
+                <w:szCs w:val="19"/>
+              </w:rPr>
+              <w:t>ROLE_ADMIN</w:t>
+            </w:r>
+          </w:p>
+        </w:tc>
+      </w:tr>
+      <w:tr>
+        <w:tc>
+          <w:tcPr>
+            <w:tcW w:w="1346" w:type="dxa"/>
+            <w:tcMar>
+              <w:top w:w="60" w:type="dxa"/>
+              <w:left w:w="90" w:type="dxa"/>
+              <w:bottom w:w="60" w:type="dxa"/>
+              <w:right w:w="90" w:type="dxa"/>
+            </w:tcMar>
+          </w:tcPr>
+          <w:p>
+            <w:r>
+              <w:rPr>
+                <w:sz w:val="19"/>
+                <w:szCs w:val="19"/>
+              </w:rPr>
+              <w:t>StudentDetail</w:t>
+            </w:r>
+          </w:p>
+        </w:tc>
+        <w:tc>
+          <w:tcPr>
+            <w:tcW w:w="1722" w:type="dxa"/>
+            <w:tcMar>
+              <w:top w:w="60" w:type="dxa"/>
+              <w:left w:w="90" w:type="dxa"/>
+              <w:bottom w:w="60" w:type="dxa"/>
+              <w:right w:w="90" w:type="dxa"/>
+            </w:tcMar>
+          </w:tcPr>
+          <w:p>
+            <w:pPr>
+              <w:rPr>
+                <w:sz w:val="19"/>
+                <w:szCs w:val="19"/>
+              </w:rPr>
+            </w:pPr>
+            <w:r>
+              <w:rPr>
+                <w:sz w:val="19"/>
+                <w:szCs w:val="19"/>
+              </w:rPr>
+              <w:t xml:space="preserve">ROLE_ADMIN </w:t>
+            </w:r>
+          </w:p>
+          <w:p>
+            <w:r>
+              <w:rPr>
+                <w:sz w:val="19"/>
+                <w:szCs w:val="19"/>
+              </w:rPr>
+              <w:t xml:space="preserve">(PII </w:t>
+            </w:r>
+            <w:r>
+              <w:rPr>
+                <w:sz w:val="19"/>
+                <w:szCs w:val="19"/>
+              </w:rPr>
+              <w:t>포함</w:t>
+            </w:r>
+            <w:r>
+              <w:rPr>
+                <w:sz w:val="19"/>
+                <w:szCs w:val="19"/>
+              </w:rPr>
+              <w:t>)</w:t>
+            </w:r>
+          </w:p>
+        </w:tc>
+        <w:tc>
+          <w:tcPr>
+            <w:tcW w:w="1450" w:type="dxa"/>
+            <w:tcMar>
+              <w:top w:w="60" w:type="dxa"/>
+              <w:left w:w="90" w:type="dxa"/>
+              <w:bottom w:w="60" w:type="dxa"/>
+              <w:right w:w="90" w:type="dxa"/>
+            </w:tcMar>
+          </w:tcPr>
+          <w:p>
+            <w:r>
+              <w:rPr>
+                <w:sz w:val="19"/>
+                <w:szCs w:val="19"/>
+              </w:rPr>
+              <w:t>ROLE_USER / ROLE_ADMIN</w:t>
+            </w:r>
+          </w:p>
+        </w:tc>
+        <w:tc>
+          <w:tcPr>
+            <w:tcW w:w="1346" w:type="dxa"/>
+            <w:tcMar>
+              <w:top w:w="60" w:type="dxa"/>
+              <w:left w:w="90" w:type="dxa"/>
+              <w:bottom w:w="60" w:type="dxa"/>
+              <w:right w:w="90" w:type="dxa"/>
+            </w:tcMar>
+          </w:tcPr>
+          <w:p>
+            <w:r>
+              <w:rPr>
+                <w:sz w:val="19"/>
+                <w:szCs w:val="19"/>
+              </w:rPr>
+              <w:t>ROLE_USER / ROLE_ADMIN</w:t>
+            </w:r>
+          </w:p>
+        </w:tc>
+        <w:tc>
+          <w:tcPr>
+            <w:tcW w:w="1790" w:type="dxa"/>
+            <w:tcMar>
+              <w:top w:w="60" w:type="dxa"/>
+              <w:left w:w="90" w:type="dxa"/>
+              <w:bottom w:w="60" w:type="dxa"/>
+              <w:right w:w="90" w:type="dxa"/>
+            </w:tcMar>
+          </w:tcPr>
+          <w:p>
+            <w:r>
+              <w:rPr>
+                <w:sz w:val="19"/>
+                <w:szCs w:val="19"/>
+              </w:rPr>
+              <w:t>ROLE_USER / ROLE_ADMIN (</w:t>
+            </w:r>
+            <w:r>
+              <w:rPr>
+                <w:sz w:val="19"/>
+                <w:szCs w:val="19"/>
+              </w:rPr>
+              <w:t>소유자만</w:t>
+            </w:r>
+            <w:r>
+              <w:rPr>
+                <w:sz w:val="19"/>
+                <w:szCs w:val="19"/>
+              </w:rPr>
+              <w:t>)</w:t>
+            </w:r>
+          </w:p>
+        </w:tc>
+        <w:tc>
+          <w:tcPr>
+            <w:tcW w:w="1346" w:type="dxa"/>
+            <w:tcMar>
+              <w:top w:w="60" w:type="dxa"/>
+              <w:left w:w="90" w:type="dxa"/>
+              <w:bottom w:w="60" w:type="dxa"/>
+              <w:right w:w="90" w:type="dxa"/>
+            </w:tcMar>
+          </w:tcPr>
+          <w:p>
+            <w:r>
+              <w:rPr>
+                <w:sz w:val="19"/>
+                <w:szCs w:val="19"/>
+              </w:rPr>
+              <w:t>ROLE_ADMIN</w:t>
+            </w:r>
+          </w:p>
+        </w:tc>
+      </w:tr>
+      <w:tr>
+        <w:tc>
+          <w:tcPr>
+            <w:tcW w:w="1346" w:type="dxa"/>
+            <w:tcMar>
+              <w:top w:w="60" w:type="dxa"/>
+              <w:left w:w="90" w:type="dxa"/>
+              <w:bottom w:w="60" w:type="dxa"/>
+              <w:right w:w="90" w:type="dxa"/>
+            </w:tcMar>
+          </w:tcPr>
+          <w:p>
+            <w:r>
+              <w:rPr>
+                <w:sz w:val="19"/>
+                <w:szCs w:val="19"/>
+              </w:rPr>
+              <w:t>Department</w:t>
+            </w:r>
+          </w:p>
+        </w:tc>
+        <w:tc>
+          <w:tcPr>
+            <w:tcW w:w="1722" w:type="dxa"/>
+            <w:tcMar>
+              <w:top w:w="60" w:type="dxa"/>
+              <w:left w:w="90" w:type="dxa"/>
+              <w:bottom w:w="60" w:type="dxa"/>
+              <w:right w:w="90" w:type="dxa"/>
+            </w:tcMar>
+          </w:tcPr>
+          <w:p>
+            <w:r>
+              <w:rPr>
+                <w:sz w:val="19"/>
+                <w:szCs w:val="19"/>
+              </w:rPr>
+              <w:t>ROLE_USER / ROLE_ADMIN (</w:t>
+            </w:r>
+            <w:r>
+              <w:rPr>
+                <w:sz w:val="19"/>
+                <w:szCs w:val="19"/>
+              </w:rPr>
+              <w:t>공용</w:t>
+            </w:r>
+            <w:r>
+              <w:rPr>
+                <w:sz w:val="19"/>
+                <w:szCs w:val="19"/>
+              </w:rPr>
+              <w:t xml:space="preserve"> </w:t>
+            </w:r>
+            <w:r>
+              <w:rPr>
+                <w:sz w:val="19"/>
+                <w:szCs w:val="19"/>
+              </w:rPr>
+              <w:t>기준정보</w:t>
+            </w:r>
+            <w:r>
+              <w:rPr>
+                <w:sz w:val="19"/>
+                <w:szCs w:val="19"/>
+              </w:rPr>
+              <w:t>)</w:t>
+            </w:r>
+          </w:p>
+        </w:tc>
+        <w:tc>
+          <w:tcPr>
+            <w:tcW w:w="1450" w:type="dxa"/>
+            <w:tcMar>
+              <w:top w:w="60" w:type="dxa"/>
+              <w:left w:w="90" w:type="dxa"/>
+              <w:bottom w:w="60" w:type="dxa"/>
+              <w:right w:w="90" w:type="dxa"/>
+            </w:tcMar>
+          </w:tcPr>
+          <w:p>
+            <w:r>
+              <w:rPr>
+                <w:sz w:val="19"/>
+                <w:szCs w:val="19"/>
+              </w:rPr>
+              <w:t>ROLE_USER / ROLE_ADMIN</w:t>
+            </w:r>
+          </w:p>
+        </w:tc>
+        <w:tc>
+          <w:tcPr>
+            <w:tcW w:w="1346" w:type="dxa"/>
+            <w:tcMar>
+              <w:top w:w="60" w:type="dxa"/>
+              <w:left w:w="90" w:type="dxa"/>
+              <w:bottom w:w="60" w:type="dxa"/>
+              <w:right w:w="90" w:type="dxa"/>
+            </w:tcMar>
+          </w:tcPr>
+          <w:p>
+            <w:r>
+              <w:rPr>
+                <w:sz w:val="19"/>
+                <w:szCs w:val="19"/>
+              </w:rPr>
+              <w:t>ROLE_ADMIN</w:t>
+            </w:r>
+          </w:p>
+        </w:tc>
+        <w:tc>
+          <w:tcPr>
+            <w:tcW w:w="1790" w:type="dxa"/>
+            <w:tcMar>
+              <w:top w:w="60" w:type="dxa"/>
+              <w:left w:w="90" w:type="dxa"/>
+              <w:bottom w:w="60" w:type="dxa"/>
+              <w:right w:w="90" w:type="dxa"/>
+            </w:tcMar>
+          </w:tcPr>
+          <w:p>
+            <w:r>
+              <w:rPr>
+                <w:sz w:val="19"/>
+                <w:szCs w:val="19"/>
+              </w:rPr>
+              <w:t>ROLE_ADMIN</w:t>
+            </w:r>
+          </w:p>
+        </w:tc>
+        <w:tc>
+          <w:tcPr>
+            <w:tcW w:w="1346" w:type="dxa"/>
+            <w:tcMar>
+              <w:top w:w="60" w:type="dxa"/>
+              <w:left w:w="90" w:type="dxa"/>
+              <w:bottom w:w="60" w:type="dxa"/>
+              <w:right w:w="90" w:type="dxa"/>
+            </w:tcMar>
+          </w:tcPr>
+          <w:p>
+            <w:r>
+              <w:rPr>
+                <w:sz w:val="19"/>
+                <w:szCs w:val="19"/>
+              </w:rPr>
+              <w:t>ROLE_ADMIN</w:t>
+            </w:r>
+          </w:p>
+        </w:tc>
+      </w:tr>
+    </w:tbl>
+    <w:p>
+      <w:pPr>
+        <w:spacing w:after="60" w:line="264" w:lineRule="auto"/>
+      </w:pPr>
+      <w:r>
+        <w:t>PII는 Personally Identifiable Information(개인식별정보)의 약자입니다. 특정 개인을 식별하거나 식별할 수 있게 하는 정보를 뜻합니다. (예: 이름, 주민번호, 주소, 전화번호, 이메일 등)</w:t>
+      </w:r>
+    </w:p>
+    <w:p>
+      <w:pPr>
+        <w:spacing w:after="60" w:line="264" w:lineRule="auto"/>
+        <w:rPr>
+          <w:rFonts w:hint="eastAsia"/>
+        </w:rPr>
+      </w:pPr>
+    </w:p>
+    <w:p>
+      <w:pPr>
+        <w:pStyle w:val="a4"/>
+        <w:numPr>
+          <w:ilvl w:val="0"/>
+          <w:numId w:val="1"/>
+        </w:numPr>
+        <w:spacing w:after="60" w:line="264" w:lineRule="auto"/>
+      </w:pPr>
+      <w:r>
+        <w:rPr>
+          <w:b/>
+          <w:bCs/>
+        </w:rPr>
+        <w:t>소</w:t>
+      </w:r>
+      <w:r>
+        <w:rPr>
+          <w:b/>
+          <w:bCs/>
+        </w:rPr>
+        <w:t>유자만</w:t>
+      </w:r>
+      <w:r>
+        <w:rPr>
+          <w:b/>
+          <w:bCs/>
+        </w:rPr>
+        <w:t xml:space="preserve"> — </w:t>
+      </w:r>
+      <w:r>
+        <w:t xml:space="preserve">ROLE_USER </w:t>
+      </w:r>
+      <w:r>
+        <w:t>는</w:t>
+      </w:r>
+      <w:r>
+        <w:t xml:space="preserve"> </w:t>
+      </w:r>
+      <w:r>
+        <w:t>본인이</w:t>
+      </w:r>
+      <w:r>
+        <w:t xml:space="preserve"> </w:t>
+      </w:r>
+      <w:r>
+        <w:t>등록한</w:t>
+      </w:r>
+      <w:r>
+        <w:t xml:space="preserve">(student.userInfo) </w:t>
+      </w:r>
+      <w:r>
+        <w:t>리소스만</w:t>
+      </w:r>
+      <w:r>
+        <w:t xml:space="preserve"> </w:t>
+      </w:r>
+      <w:r>
+        <w:t>수정할</w:t>
+      </w:r>
+      <w:r>
+        <w:t xml:space="preserve"> </w:t>
+      </w:r>
+      <w:r>
+        <w:t>수</w:t>
+      </w:r>
+      <w:r>
+        <w:t xml:space="preserve"> </w:t>
+      </w:r>
+      <w:r>
+        <w:t>있으며</w:t>
+      </w:r>
+      <w:r>
+        <w:t xml:space="preserve">, </w:t>
+      </w:r>
+      <w:r>
+        <w:t>위반</w:t>
+      </w:r>
+      <w:r>
+        <w:t xml:space="preserve"> </w:t>
+      </w:r>
+      <w:r>
+        <w:t>시</w:t>
+      </w:r>
+      <w:r>
+        <w:t xml:space="preserve"> AccessDeniedException(403)</w:t>
+      </w:r>
+      <w:r>
+        <w:t>이</w:t>
+      </w:r>
+      <w:r>
+        <w:t xml:space="preserve"> </w:t>
+      </w:r>
+      <w:r>
+        <w:t>발생한다</w:t>
+      </w:r>
+      <w:r>
+        <w:t>.</w:t>
+      </w:r>
+    </w:p>
+    <w:p>
+      <w:pPr>
+        <w:pStyle w:val="a4"/>
+        <w:numPr>
+          <w:ilvl w:val="0"/>
+          <w:numId w:val="1"/>
+        </w:numPr>
+        <w:spacing w:after="60" w:line="264" w:lineRule="auto"/>
+      </w:pPr>
+      <w:r>
+        <w:t xml:space="preserve">Department </w:t>
+      </w:r>
+      <w:r>
+        <w:t>는</w:t>
+      </w:r>
+      <w:r>
+        <w:t xml:space="preserve"> </w:t>
+      </w:r>
+      <w:r>
+        <w:t>소유자</w:t>
+      </w:r>
+      <w:r>
+        <w:t xml:space="preserve"> </w:t>
+      </w:r>
+      <w:r>
+        <w:t>개념이</w:t>
+      </w:r>
+      <w:r>
+        <w:t xml:space="preserve"> </w:t>
+      </w:r>
+      <w:r>
+        <w:t>없는</w:t>
+      </w:r>
+      <w:r>
+        <w:t xml:space="preserve"> </w:t>
+      </w:r>
+      <w:r>
+        <w:t>공용</w:t>
+      </w:r>
+      <w:r>
+        <w:t xml:space="preserve"> </w:t>
+      </w:r>
+      <w:r>
+        <w:t>기준정보</w:t>
+      </w:r>
+      <w:r>
+        <w:rPr>
+          <w:rFonts w:hint="eastAsia"/>
+        </w:rPr>
+        <w:t>이므로</w:t>
+      </w:r>
+      <w:r>
+        <w:t xml:space="preserve"> </w:t>
+      </w:r>
+      <w:r>
+        <w:t>등록</w:t>
+      </w:r>
+      <w:r>
+        <w:t>/</w:t>
+      </w:r>
+      <w:r>
+        <w:t>수정</w:t>
+      </w:r>
+      <w:r>
+        <w:t>/</w:t>
+      </w:r>
+      <w:r>
+        <w:t>삭제를</w:t>
+      </w:r>
+      <w:r>
+        <w:t xml:space="preserve"> ROLE_ADMIN </w:t>
+      </w:r>
+      <w:r>
+        <w:t>전용으로</w:t>
+      </w:r>
+      <w:r>
+        <w:t xml:space="preserve"> </w:t>
+      </w:r>
+      <w:r>
+        <w:t>유지</w:t>
+      </w:r>
+      <w:r>
+        <w:rPr>
+          <w:rFonts w:hint="eastAsia"/>
+        </w:rPr>
+        <w:t>해야 합니다</w:t>
+      </w:r>
+      <w:r>
+        <w:t>.</w:t>
+      </w:r>
+    </w:p>
+    <w:p>
+      <w:pPr>
+        <w:pStyle w:val="a4"/>
+        <w:numPr>
+          <w:ilvl w:val="0"/>
+          <w:numId w:val="1"/>
+        </w:numPr>
+        <w:spacing w:after="60" w:line="264" w:lineRule="auto"/>
+      </w:pPr>
+      <w:r>
+        <w:t>학과별</w:t>
+      </w:r>
+      <w:r>
+        <w:t xml:space="preserve"> </w:t>
+      </w:r>
+      <w:r>
+        <w:t>학생</w:t>
+      </w:r>
+      <w:r>
+        <w:t xml:space="preserve"> </w:t>
+      </w:r>
+      <w:r>
+        <w:t>목록</w:t>
+      </w:r>
+      <w:r>
+        <w:t xml:space="preserve"> </w:t>
+      </w:r>
+      <w:r>
+        <w:t>조회</w:t>
+      </w:r>
+      <w:r>
+        <w:t xml:space="preserve">(GET /api/departments/{id}/students, /paged) </w:t>
+      </w:r>
+      <w:r>
+        <w:t>는</w:t>
+      </w:r>
+      <w:r>
+        <w:t xml:space="preserve"> PII</w:t>
+      </w:r>
+      <w:r>
+        <w:t>를</w:t>
+      </w:r>
+      <w:r>
+        <w:t xml:space="preserve"> </w:t>
+      </w:r>
+      <w:r>
+        <w:t>포함한</w:t>
+      </w:r>
+      <w:r>
+        <w:t xml:space="preserve"> </w:t>
+      </w:r>
+      <w:r>
+        <w:t>전체목록이라</w:t>
+      </w:r>
+      <w:r>
+        <w:t xml:space="preserve"> ROLE_ADMIN </w:t>
+      </w:r>
+      <w:r>
+        <w:t>전용으로</w:t>
+      </w:r>
+      <w:r>
+        <w:t xml:space="preserve"> </w:t>
+      </w:r>
+      <w:r>
+        <w:t>제한</w:t>
+      </w:r>
+      <w:r>
+        <w:rPr>
+          <w:rFonts w:hint="eastAsia"/>
+        </w:rPr>
+        <w:t>하여</w:t>
+      </w:r>
+      <w:r>
+        <w:t>, /a</w:t>
+      </w:r>
+      <w:r>
+        <w:t xml:space="preserve">pi/students </w:t>
+      </w:r>
+      <w:r>
+        <w:t>전체조회</w:t>
+      </w:r>
+      <w:r>
+        <w:t xml:space="preserve"> </w:t>
+      </w:r>
+      <w:r>
+        <w:t>제한의</w:t>
+      </w:r>
+      <w:r>
+        <w:t xml:space="preserve"> </w:t>
+      </w:r>
+      <w:r>
+        <w:t>우회</w:t>
+      </w:r>
+      <w:r>
+        <w:t xml:space="preserve"> </w:t>
+      </w:r>
+      <w:r>
+        <w:t>경로를</w:t>
+      </w:r>
+      <w:r>
+        <w:t xml:space="preserve"> </w:t>
+      </w:r>
+      <w:r>
+        <w:t>차단했다</w:t>
+      </w:r>
+      <w:r>
+        <w:t>.</w:t>
+      </w:r>
+      <w:bookmarkStart w:id="0" w:name="_GoBack"/>
+      <w:bookmarkEnd w:id="0"/>
+    </w:p>
+    <w:p>
+      <w:pPr>
+        <w:pStyle w:val="a4"/>
+        <w:numPr>
+          <w:ilvl w:val="0"/>
+          <w:numId w:val="1"/>
+        </w:numPr>
+        <w:spacing w:after="60" w:line="264" w:lineRule="auto"/>
+      </w:pPr>
+      <w:r>
+        <w:t>검색</w:t>
+      </w:r>
+      <w:r>
+        <w:t xml:space="preserve"> API(StudentSearchService) </w:t>
+      </w:r>
+      <w:r>
+        <w:t>는</w:t>
+      </w:r>
+      <w:r>
+        <w:t xml:space="preserve"> </w:t>
+      </w:r>
+      <w:r>
+        <w:t>빈</w:t>
+      </w:r>
+      <w:r>
+        <w:t xml:space="preserve"> </w:t>
+      </w:r>
+      <w:r>
+        <w:t>검색어</w:t>
+      </w:r>
+      <w:r>
+        <w:t xml:space="preserve">(keyword="") </w:t>
+      </w:r>
+      <w:r>
+        <w:t>입력</w:t>
+      </w:r>
+      <w:r>
+        <w:t xml:space="preserve"> </w:t>
+      </w:r>
+      <w:r>
+        <w:t>시</w:t>
+      </w:r>
+      <w:r>
+        <w:t xml:space="preserve"> </w:t>
+      </w:r>
+      <w:r>
+        <w:t>전체</w:t>
+      </w:r>
+      <w:r>
+        <w:t xml:space="preserve"> </w:t>
+      </w:r>
+      <w:r>
+        <w:t>목록이</w:t>
+      </w:r>
+      <w:r>
+        <w:t xml:space="preserve"> </w:t>
+      </w:r>
+      <w:r>
+        <w:t>그대로</w:t>
+      </w:r>
+      <w:r>
+        <w:t xml:space="preserve"> </w:t>
+      </w:r>
+      <w:r>
+        <w:t>반환되던</w:t>
+      </w:r>
+      <w:r>
+        <w:t xml:space="preserve"> </w:t>
+      </w:r>
+      <w:r>
+        <w:t>우회를</w:t>
+      </w:r>
+      <w:r>
+        <w:t xml:space="preserve"> </w:t>
+      </w:r>
+      <w:r>
+        <w:t>차단했다</w:t>
+      </w:r>
+      <w:r>
+        <w:t>.</w:t>
+      </w:r>
+    </w:p>
+    <w:p>
+      <w:pPr>
+        <w:rPr>
+          <w:b/>
+          <w:bCs/>
+          <w:color w:val="1F3864"/>
+          <w:sz w:val="32"/>
+          <w:szCs w:val="32"/>
+        </w:rPr>
+      </w:pPr>
+      <w:r>
+        <w:rPr>
+          <w:b/>
+          <w:bCs/>
+          <w:color w:val="1F3864"/>
+        </w:rPr>
+        <w:br w:type="page"/>
+      </w:r>
+    </w:p>
+    <w:p>
+      <w:pPr>
         <w:pStyle w:val="1"/>
         <w:spacing w:before="320" w:after="160"/>
       </w:pPr>
@@ -1663,6 +2784,7 @@
           <w:bCs/>
           <w:color w:val="1F3864"/>
         </w:rPr>
+        <w:lastRenderedPageBreak/>
         <w:t>7. 방어 대책 정리</w:t>
       </w:r>
     </w:p>
@@ -2222,7 +3344,6 @@
           <w:sz w:val="18"/>
           <w:szCs w:val="18"/>
         </w:rPr>
-        <w:lastRenderedPageBreak/>
         <w:t>@GetMapping("/{id}")</w:t>
       </w:r>
     </w:p>
@@ -2319,6 +3440,7 @@
           <w:b/>
           <w:bCs/>
         </w:rPr>
+        <w:lastRenderedPageBreak/>
         <w:t xml:space="preserve">• 기본 거부(Deny by default) — </w:t>
       </w:r>
       <w:r>

</xml_diff>

<commit_message>
[문서] 02_Insecure_DOR.docx에 PII 설명, 소유권 검사 코드, curl 실습 보강
- PII(개인식별정보) 설명 추가 (StudentDetail 필드 기준)
- isAdmin/isOwner 코드와 StudentService 클래스 출처 표기 추가
- 전체 목록/단건 조회/수정(PUT)에 대한 역할별·소유자별 curl 검증 시나리오 보강
- OWNER_TOKEN/OTHER_TOKEN 로그인 선언 누락 수정
</commit_message>
<xml_diff>
--- a/docs/security/02_Insecure_DOR.docx
+++ b/docs/security/02_Insecure_DOR.docx
@@ -1571,7 +1571,23 @@
           <w:color w:val="1F3864"/>
         </w:rPr>
         <w:lastRenderedPageBreak/>
-        <w:t>6. 실제 앱과의 연결 (/api/users)</w:t>
+        <w:t>6. 실제 앱과의 연결 (/api/</w:t>
+      </w:r>
+      <w:r>
+        <w:rPr>
+          <w:b/>
+          <w:bCs/>
+          <w:color w:val="1F3864"/>
+        </w:rPr>
+        <w:t>student</w:t>
+      </w:r>
+      <w:r>
+        <w:rPr>
+          <w:b/>
+          <w:bCs/>
+          <w:color w:val="1F3864"/>
+        </w:rPr>
+        <w:t>s)</w:t>
       </w:r>
     </w:p>
     <w:p>
@@ -1661,31 +1677,287 @@
           <w:bCs/>
           <w:color w:val="2E5496"/>
         </w:rPr>
-        <w:t xml:space="preserve">6-1. Student / StudentDetail / Department </w:t>
-      </w:r>
-      <w:r>
-        <w:rPr>
-          <w:b/>
-          <w:bCs/>
-          <w:color w:val="2E5496"/>
-        </w:rPr>
-        <w:t>권한</w:t>
-      </w:r>
-      <w:r>
-        <w:rPr>
-          <w:b/>
-          <w:bCs/>
-          <w:color w:val="2E5496"/>
-        </w:rPr>
-        <w:t xml:space="preserve"> </w:t>
-      </w:r>
-      <w:r>
-        <w:rPr>
-          <w:b/>
-          <w:bCs/>
-          <w:color w:val="2E5496"/>
-        </w:rPr>
-        <w:t>정책</w:t>
+        <w:t>6-1. Student / StudentDetail / Department 권한 정책</w:t>
+      </w:r>
+    </w:p>
+    <w:p>
+      <w:pPr>
+        <w:spacing w:after="100" w:line="276" w:lineRule="auto"/>
+      </w:pPr>
+      <w:r>
+        <w:t xml:space="preserve">PII(Personally Identifiable Information, </w:t>
+      </w:r>
+      <w:r>
+        <w:t>개인식별정보</w:t>
+      </w:r>
+      <w:r>
+        <w:t>)</w:t>
+      </w:r>
+      <w:r>
+        <w:t>란</w:t>
+      </w:r>
+      <w:r>
+        <w:t xml:space="preserve"> </w:t>
+      </w:r>
+      <w:r>
+        <w:rPr>
+          <w:b/>
+          <w:bCs/>
+        </w:rPr>
+        <w:t>개인을</w:t>
+      </w:r>
+      <w:r>
+        <w:rPr>
+          <w:b/>
+          <w:bCs/>
+        </w:rPr>
+        <w:t xml:space="preserve"> </w:t>
+      </w:r>
+      <w:r>
+        <w:rPr>
+          <w:b/>
+          <w:bCs/>
+        </w:rPr>
+        <w:t>식별하거나</w:t>
+      </w:r>
+      <w:r>
+        <w:rPr>
+          <w:b/>
+          <w:bCs/>
+        </w:rPr>
+        <w:t xml:space="preserve"> </w:t>
+      </w:r>
+      <w:r>
+        <w:rPr>
+          <w:b/>
+          <w:bCs/>
+        </w:rPr>
+        <w:t>특정할</w:t>
+      </w:r>
+      <w:r>
+        <w:rPr>
+          <w:b/>
+          <w:bCs/>
+        </w:rPr>
+        <w:t xml:space="preserve"> </w:t>
+      </w:r>
+      <w:r>
+        <w:rPr>
+          <w:b/>
+          <w:bCs/>
+        </w:rPr>
+        <w:t>수</w:t>
+      </w:r>
+      <w:r>
+        <w:rPr>
+          <w:b/>
+          <w:bCs/>
+        </w:rPr>
+        <w:t xml:space="preserve"> </w:t>
+      </w:r>
+      <w:r>
+        <w:rPr>
+          <w:b/>
+          <w:bCs/>
+        </w:rPr>
+        <w:t>있는</w:t>
+      </w:r>
+      <w:r>
+        <w:rPr>
+          <w:b/>
+          <w:bCs/>
+        </w:rPr>
+        <w:t xml:space="preserve"> </w:t>
+      </w:r>
+      <w:r>
+        <w:rPr>
+          <w:b/>
+          <w:bCs/>
+        </w:rPr>
+        <w:t>정보</w:t>
+      </w:r>
+      <w:r>
+        <w:t>를</w:t>
+      </w:r>
+      <w:r>
+        <w:t xml:space="preserve"> </w:t>
+      </w:r>
+      <w:r>
+        <w:t>말한다</w:t>
+      </w:r>
+      <w:r>
+        <w:t xml:space="preserve">. </w:t>
+      </w:r>
+      <w:proofErr w:type="spellStart"/>
+      <w:r>
+        <w:t>StudentD</w:t>
+      </w:r>
+      <w:r>
+        <w:t>etail</w:t>
+      </w:r>
+      <w:proofErr w:type="spellEnd"/>
+      <w:r>
+        <w:t xml:space="preserve"> </w:t>
+      </w:r>
+      <w:r>
+        <w:t>엔티티의</w:t>
+      </w:r>
+      <w:r>
+        <w:t xml:space="preserve"> address, </w:t>
+      </w:r>
+      <w:proofErr w:type="spellStart"/>
+      <w:r>
+        <w:t>phoneNumber</w:t>
+      </w:r>
+      <w:proofErr w:type="spellEnd"/>
+      <w:r>
+        <w:t xml:space="preserve">, email, </w:t>
+      </w:r>
+      <w:proofErr w:type="spellStart"/>
+      <w:r>
+        <w:t>dateOfBirth</w:t>
+      </w:r>
+      <w:proofErr w:type="spellEnd"/>
+      <w:r>
+        <w:t xml:space="preserve"> </w:t>
+      </w:r>
+      <w:r>
+        <w:t>필드가</w:t>
+      </w:r>
+      <w:r>
+        <w:t xml:space="preserve"> </w:t>
+      </w:r>
+      <w:r>
+        <w:t>이에</w:t>
+      </w:r>
+      <w:r>
+        <w:t xml:space="preserve"> </w:t>
+      </w:r>
+      <w:r>
+        <w:t>해당하며</w:t>
+      </w:r>
+      <w:r>
+        <w:t xml:space="preserve">, </w:t>
+      </w:r>
+      <w:r>
+        <w:t>표의</w:t>
+      </w:r>
+      <w:r>
+        <w:t xml:space="preserve"> "(PII </w:t>
+      </w:r>
+      <w:r>
+        <w:t>포함</w:t>
+      </w:r>
+      <w:r>
+        <w:t xml:space="preserve">)" </w:t>
+      </w:r>
+      <w:r>
+        <w:t>표시는</w:t>
+      </w:r>
+      <w:r>
+        <w:t xml:space="preserve"> </w:t>
+      </w:r>
+      <w:r>
+        <w:t>이</w:t>
+      </w:r>
+      <w:r>
+        <w:t xml:space="preserve"> </w:t>
+      </w:r>
+      <w:r>
+        <w:t>필드를</w:t>
+      </w:r>
+      <w:r>
+        <w:t xml:space="preserve"> </w:t>
+      </w:r>
+      <w:r>
+        <w:t>포함한</w:t>
+      </w:r>
+      <w:r>
+        <w:t xml:space="preserve"> </w:t>
+      </w:r>
+      <w:r>
+        <w:t>응답을</w:t>
+      </w:r>
+      <w:r>
+        <w:t xml:space="preserve"> </w:t>
+      </w:r>
+      <w:r>
+        <w:t>의미한다</w:t>
+      </w:r>
+      <w:r>
+        <w:t xml:space="preserve">. </w:t>
+      </w:r>
+      <w:r>
+        <w:t>전체목록</w:t>
+      </w:r>
+      <w:r>
+        <w:t xml:space="preserve"> </w:t>
+      </w:r>
+      <w:r>
+        <w:t>조회를</w:t>
+      </w:r>
+      <w:r>
+        <w:t xml:space="preserve"> ROLE_ADMIN </w:t>
+      </w:r>
+      <w:r>
+        <w:t>전용으로</w:t>
+      </w:r>
+      <w:r>
+        <w:t xml:space="preserve"> </w:t>
+      </w:r>
+      <w:r>
+        <w:t>제한한</w:t>
+      </w:r>
+      <w:r>
+        <w:t xml:space="preserve"> </w:t>
+      </w:r>
+      <w:r>
+        <w:t>이유도</w:t>
+      </w:r>
+      <w:r>
+        <w:t xml:space="preserve"> </w:t>
+      </w:r>
+      <w:r>
+        <w:t>이</w:t>
+      </w:r>
+      <w:r>
+        <w:t xml:space="preserve"> PII</w:t>
+      </w:r>
+      <w:r>
+        <w:t>가</w:t>
+      </w:r>
+      <w:r>
+        <w:t xml:space="preserve"> </w:t>
+      </w:r>
+      <w:r>
+        <w:t>다수</w:t>
+      </w:r>
+      <w:r>
+        <w:t xml:space="preserve"> </w:t>
+      </w:r>
+      <w:r>
+        <w:t>노출되는</w:t>
+      </w:r>
+      <w:r>
+        <w:t xml:space="preserve"> </w:t>
+      </w:r>
+      <w:r>
+        <w:t>것을</w:t>
+      </w:r>
+      <w:r>
+        <w:t xml:space="preserve"> </w:t>
+      </w:r>
+      <w:r>
+        <w:t>막기</w:t>
+      </w:r>
+      <w:r>
+        <w:t xml:space="preserve"> </w:t>
+      </w:r>
+      <w:r>
+        <w:t>위해서다</w:t>
+      </w:r>
+      <w:r>
+        <w:t>.</w:t>
       </w:r>
     </w:p>
     <w:tbl>
@@ -1761,27 +2033,7 @@
                 <w:sz w:val="19"/>
                 <w:szCs w:val="19"/>
               </w:rPr>
-              <w:t>전체목록</w:t>
-            </w:r>
-            <w:r>
-              <w:rPr>
-                <w:b/>
-                <w:bCs/>
-                <w:color w:val="FFFFFF"/>
-                <w:sz w:val="19"/>
-                <w:szCs w:val="19"/>
-              </w:rPr>
-              <w:t xml:space="preserve"> </w:t>
-            </w:r>
-            <w:r>
-              <w:rPr>
-                <w:b/>
-                <w:bCs/>
-                <w:color w:val="FFFFFF"/>
-                <w:sz w:val="19"/>
-                <w:szCs w:val="19"/>
-              </w:rPr>
-              <w:t>조회</w:t>
+              <w:t>전체목록 조회</w:t>
             </w:r>
           </w:p>
         </w:tc>
@@ -1805,27 +2057,7 @@
                 <w:sz w:val="19"/>
                 <w:szCs w:val="19"/>
               </w:rPr>
-              <w:t>단건</w:t>
-            </w:r>
-            <w:r>
-              <w:rPr>
-                <w:b/>
-                <w:bCs/>
-                <w:color w:val="FFFFFF"/>
-                <w:sz w:val="19"/>
-                <w:szCs w:val="19"/>
-              </w:rPr>
-              <w:t xml:space="preserve"> </w:t>
-            </w:r>
-            <w:r>
-              <w:rPr>
-                <w:b/>
-                <w:bCs/>
-                <w:color w:val="FFFFFF"/>
-                <w:sz w:val="19"/>
-                <w:szCs w:val="19"/>
-              </w:rPr>
-              <w:t>조회</w:t>
+              <w:t>단건 조회</w:t>
             </w:r>
           </w:p>
         </w:tc>
@@ -1959,7 +2191,7 @@
                 <w:sz w:val="19"/>
                 <w:szCs w:val="19"/>
               </w:rPr>
-              <w:t>ROLE_USER / ROLE_ADMIN</w:t>
+              <w:t>본인 또는 ROLE_ADMIN</w:t>
             </w:r>
           </w:p>
         </w:tc>
@@ -1999,21 +2231,7 @@
                 <w:sz w:val="19"/>
                 <w:szCs w:val="19"/>
               </w:rPr>
-              <w:t>ROLE_USER / ROLE_ADMIN (</w:t>
-            </w:r>
-            <w:r>
-              <w:rPr>
-                <w:sz w:val="19"/>
-                <w:szCs w:val="19"/>
-              </w:rPr>
-              <w:t>소유자만</w:t>
-            </w:r>
-            <w:r>
-              <w:rPr>
-                <w:sz w:val="19"/>
-                <w:szCs w:val="19"/>
-              </w:rPr>
-              <w:t>)</w:t>
+              <w:t>ROLE_USER / ROLE_ADMIN (소유자만)</w:t>
             </w:r>
           </w:p>
         </w:tc>
@@ -2090,21 +2308,7 @@
                 <w:sz w:val="19"/>
                 <w:szCs w:val="19"/>
               </w:rPr>
-              <w:t xml:space="preserve">(PII </w:t>
-            </w:r>
-            <w:r>
-              <w:rPr>
-                <w:sz w:val="19"/>
-                <w:szCs w:val="19"/>
-              </w:rPr>
-              <w:t>포함</w:t>
-            </w:r>
-            <w:r>
-              <w:rPr>
-                <w:sz w:val="19"/>
-                <w:szCs w:val="19"/>
-              </w:rPr>
-              <w:t>)</w:t>
+              <w:t>(PII 포함)</w:t>
             </w:r>
           </w:p>
         </w:tc>
@@ -2124,7 +2328,7 @@
                 <w:sz w:val="19"/>
                 <w:szCs w:val="19"/>
               </w:rPr>
-              <w:t>ROLE_USER / ROLE_ADMIN</w:t>
+              <w:t>본인 또는 ROLE_ADMIN</w:t>
             </w:r>
           </w:p>
         </w:tc>
@@ -2164,21 +2368,7 @@
                 <w:sz w:val="19"/>
                 <w:szCs w:val="19"/>
               </w:rPr>
-              <w:t>ROLE_USER / ROLE_ADMIN (</w:t>
-            </w:r>
-            <w:r>
-              <w:rPr>
-                <w:sz w:val="19"/>
-                <w:szCs w:val="19"/>
-              </w:rPr>
-              <w:t>소유자만</w:t>
-            </w:r>
-            <w:r>
-              <w:rPr>
-                <w:sz w:val="19"/>
-                <w:szCs w:val="19"/>
-              </w:rPr>
-              <w:t>)</w:t>
+              <w:t>ROLE_USER / ROLE_ADMIN (소유자만)</w:t>
             </w:r>
           </w:p>
         </w:tc>
@@ -2240,35 +2430,7 @@
                 <w:sz w:val="19"/>
                 <w:szCs w:val="19"/>
               </w:rPr>
-              <w:t>ROLE_USER / ROLE_ADMIN (</w:t>
-            </w:r>
-            <w:r>
-              <w:rPr>
-                <w:sz w:val="19"/>
-                <w:szCs w:val="19"/>
-              </w:rPr>
-              <w:t>공용</w:t>
-            </w:r>
-            <w:r>
-              <w:rPr>
-                <w:sz w:val="19"/>
-                <w:szCs w:val="19"/>
-              </w:rPr>
-              <w:t xml:space="preserve"> </w:t>
-            </w:r>
-            <w:r>
-              <w:rPr>
-                <w:sz w:val="19"/>
-                <w:szCs w:val="19"/>
-              </w:rPr>
-              <w:t>기준정보</w:t>
-            </w:r>
-            <w:r>
-              <w:rPr>
-                <w:sz w:val="19"/>
-                <w:szCs w:val="19"/>
-              </w:rPr>
-              <w:t>)</w:t>
+              <w:t>ROLE_USER / ROLE_ADMIN (공용 기준정보)</w:t>
             </w:r>
           </w:p>
         </w:tc>
@@ -2356,22 +2518,6 @@
     </w:tbl>
     <w:p>
       <w:pPr>
-        <w:spacing w:after="60" w:line="264" w:lineRule="auto"/>
-      </w:pPr>
-      <w:r>
-        <w:t>PII는 Personally Identifiable Information(개인식별정보)의 약자입니다. 특정 개인을 식별하거나 식별할 수 있게 하는 정보를 뜻합니다. (예: 이름, 주민번호, 주소, 전화번호, 이메일 등)</w:t>
-      </w:r>
-    </w:p>
-    <w:p>
-      <w:pPr>
-        <w:spacing w:after="60" w:line="264" w:lineRule="auto"/>
-        <w:rPr>
-          <w:rFonts w:hint="eastAsia"/>
-        </w:rPr>
-      </w:pPr>
-    </w:p>
-    <w:p>
-      <w:pPr>
         <w:pStyle w:val="a4"/>
         <w:numPr>
           <w:ilvl w:val="0"/>
@@ -2384,90 +2530,10 @@
           <w:b/>
           <w:bCs/>
         </w:rPr>
-        <w:t>소</w:t>
-      </w:r>
-      <w:r>
-        <w:rPr>
-          <w:b/>
-          <w:bCs/>
-        </w:rPr>
-        <w:t>유자만</w:t>
-      </w:r>
-      <w:r>
-        <w:rPr>
-          <w:b/>
-          <w:bCs/>
-        </w:rPr>
-        <w:t xml:space="preserve"> — </w:t>
-      </w:r>
-      <w:r>
-        <w:t xml:space="preserve">ROLE_USER </w:t>
-      </w:r>
-      <w:r>
-        <w:t>는</w:t>
-      </w:r>
-      <w:r>
-        <w:t xml:space="preserve"> </w:t>
-      </w:r>
-      <w:r>
-        <w:t>본인이</w:t>
-      </w:r>
-      <w:r>
-        <w:t xml:space="preserve"> </w:t>
-      </w:r>
-      <w:r>
-        <w:t>등록한</w:t>
-      </w:r>
-      <w:r>
-        <w:t xml:space="preserve">(student.userInfo) </w:t>
-      </w:r>
-      <w:r>
-        <w:t>리소스만</w:t>
-      </w:r>
-      <w:r>
-        <w:t xml:space="preserve"> </w:t>
-      </w:r>
-      <w:r>
-        <w:t>수정할</w:t>
-      </w:r>
-      <w:r>
-        <w:t xml:space="preserve"> </w:t>
-      </w:r>
-      <w:r>
-        <w:t>수</w:t>
-      </w:r>
-      <w:r>
-        <w:t xml:space="preserve"> </w:t>
-      </w:r>
-      <w:r>
-        <w:t>있으며</w:t>
-      </w:r>
-      <w:r>
-        <w:t xml:space="preserve">, </w:t>
-      </w:r>
-      <w:r>
-        <w:t>위반</w:t>
-      </w:r>
-      <w:r>
-        <w:t xml:space="preserve"> </w:t>
-      </w:r>
-      <w:r>
-        <w:t>시</w:t>
-      </w:r>
-      <w:r>
-        <w:t xml:space="preserve"> AccessDeniedException(403)</w:t>
-      </w:r>
-      <w:r>
-        <w:t>이</w:t>
-      </w:r>
-      <w:r>
-        <w:t xml:space="preserve"> </w:t>
-      </w:r>
-      <w:r>
-        <w:t>발생한다</w:t>
-      </w:r>
-      <w:r>
-        <w:t>.</w:t>
+        <w:t xml:space="preserve">소유자만 — </w:t>
+      </w:r>
+      <w:r>
+        <w:t>ROLE_USER 는 본인이 등록한(student.userInfo) 리소스만 수정할 수 있으며, 위반 시 AccessDeniedException(403)이 발생한다.</w:t>
       </w:r>
     </w:p>
     <w:p>
@@ -2480,40 +2546,7 @@
         <w:spacing w:after="60" w:line="264" w:lineRule="auto"/>
       </w:pPr>
       <w:r>
-        <w:t xml:space="preserve">Department </w:t>
-      </w:r>
-      <w:r>
-        <w:t>는</w:t>
-      </w:r>
-      <w:r>
-        <w:t xml:space="preserve"> </w:t>
-      </w:r>
-      <w:r>
-        <w:t>소유자</w:t>
-      </w:r>
-      <w:r>
-        <w:t xml:space="preserve"> </w:t>
-      </w:r>
-      <w:r>
-        <w:t>개념이</w:t>
-      </w:r>
-      <w:r>
-        <w:t xml:space="preserve"> </w:t>
-      </w:r>
-      <w:r>
-        <w:t>없는</w:t>
-      </w:r>
-      <w:r>
-        <w:t xml:space="preserve"> </w:t>
-      </w:r>
-      <w:r>
-        <w:t>공용</w:t>
-      </w:r>
-      <w:r>
-        <w:t xml:space="preserve"> </w:t>
-      </w:r>
-      <w:r>
-        <w:t>기준정보</w:t>
+        <w:t>Department 는 소유자 개념이 없는 공용 기준정보</w:t>
       </w:r>
       <w:r>
         <w:rPr>
@@ -2522,34 +2555,7 @@
         <w:t>이므로</w:t>
       </w:r>
       <w:r>
-        <w:t xml:space="preserve"> </w:t>
-      </w:r>
-      <w:r>
-        <w:t>등록</w:t>
-      </w:r>
-      <w:r>
-        <w:t>/</w:t>
-      </w:r>
-      <w:r>
-        <w:t>수정</w:t>
-      </w:r>
-      <w:r>
-        <w:t>/</w:t>
-      </w:r>
-      <w:r>
-        <w:t>삭제를</w:t>
-      </w:r>
-      <w:r>
-        <w:t xml:space="preserve"> ROLE_ADMIN </w:t>
-      </w:r>
-      <w:r>
-        <w:t>전용으로</w:t>
-      </w:r>
-      <w:r>
-        <w:t xml:space="preserve"> </w:t>
-      </w:r>
-      <w:r>
-        <w:t>유지</w:t>
+        <w:t xml:space="preserve"> 등록/수정/삭제를 ROLE_ADMIN 전용으로 유지</w:t>
       </w:r>
       <w:r>
         <w:rPr>
@@ -2571,61 +2577,7 @@
         <w:spacing w:after="60" w:line="264" w:lineRule="auto"/>
       </w:pPr>
       <w:r>
-        <w:t>학과별</w:t>
-      </w:r>
-      <w:r>
-        <w:t xml:space="preserve"> </w:t>
-      </w:r>
-      <w:r>
-        <w:t>학생</w:t>
-      </w:r>
-      <w:r>
-        <w:t xml:space="preserve"> </w:t>
-      </w:r>
-      <w:r>
-        <w:t>목록</w:t>
-      </w:r>
-      <w:r>
-        <w:t xml:space="preserve"> </w:t>
-      </w:r>
-      <w:r>
-        <w:t>조회</w:t>
-      </w:r>
-      <w:r>
-        <w:t xml:space="preserve">(GET /api/departments/{id}/students, /paged) </w:t>
-      </w:r>
-      <w:r>
-        <w:t>는</w:t>
-      </w:r>
-      <w:r>
-        <w:t xml:space="preserve"> PII</w:t>
-      </w:r>
-      <w:r>
-        <w:t>를</w:t>
-      </w:r>
-      <w:r>
-        <w:t xml:space="preserve"> </w:t>
-      </w:r>
-      <w:r>
-        <w:t>포함한</w:t>
-      </w:r>
-      <w:r>
-        <w:t xml:space="preserve"> </w:t>
-      </w:r>
-      <w:r>
-        <w:t>전체목록이라</w:t>
-      </w:r>
-      <w:r>
-        <w:t xml:space="preserve"> ROLE_ADMIN </w:t>
-      </w:r>
-      <w:r>
-        <w:t>전용으로</w:t>
-      </w:r>
-      <w:r>
-        <w:t xml:space="preserve"> </w:t>
-      </w:r>
-      <w:r>
-        <w:t>제한</w:t>
+        <w:t>학과별 학생 목록 조회(GET /api/departments/{id}/students, /paged) 는 PII를 포함한 전체목록이라 ROLE_ADMIN 전용으로 제한</w:t>
       </w:r>
       <w:r>
         <w:rPr>
@@ -2634,43 +2586,8 @@
         <w:t>하여</w:t>
       </w:r>
       <w:r>
-        <w:t>, /a</w:t>
-      </w:r>
-      <w:r>
-        <w:t xml:space="preserve">pi/students </w:t>
-      </w:r>
-      <w:r>
-        <w:t>전체조회</w:t>
-      </w:r>
-      <w:r>
-        <w:t xml:space="preserve"> </w:t>
-      </w:r>
-      <w:r>
-        <w:t>제한의</w:t>
-      </w:r>
-      <w:r>
-        <w:t xml:space="preserve"> </w:t>
-      </w:r>
-      <w:r>
-        <w:t>우회</w:t>
-      </w:r>
-      <w:r>
-        <w:t xml:space="preserve"> </w:t>
-      </w:r>
-      <w:r>
-        <w:t>경로를</w:t>
-      </w:r>
-      <w:r>
-        <w:t xml:space="preserve"> </w:t>
-      </w:r>
-      <w:r>
-        <w:t>차단했다</w:t>
-      </w:r>
-      <w:r>
-        <w:t>.</w:t>
-      </w:r>
-      <w:bookmarkStart w:id="0" w:name="_GoBack"/>
-      <w:bookmarkEnd w:id="0"/>
+        <w:t>, /api/students 전체조회 제한의 우회 경로를 차단했다.</w:t>
+      </w:r>
     </w:p>
     <w:p>
       <w:pPr>
@@ -2682,41 +2599,661 @@
         <w:spacing w:after="60" w:line="264" w:lineRule="auto"/>
       </w:pPr>
       <w:r>
-        <w:t>검색</w:t>
-      </w:r>
-      <w:r>
-        <w:t xml:space="preserve"> API(StudentSearchService) </w:t>
-      </w:r>
-      <w:r>
+        <w:t>검색 API(StudentSearchService) 는 빈 검색어(keyword="") 입력 시 전체 목록이 그대로 반환되던 우회를 차단했다.</w:t>
+      </w:r>
+    </w:p>
+    <w:p>
+      <w:pPr>
+        <w:rPr>
+          <w:b/>
+          <w:bCs/>
+          <w:color w:val="2E5496"/>
+          <w:sz w:val="24"/>
+          <w:szCs w:val="24"/>
+        </w:rPr>
+      </w:pPr>
+      <w:r>
+        <w:rPr>
+          <w:b/>
+          <w:bCs/>
+          <w:color w:val="2E5496"/>
+        </w:rPr>
+        <w:br w:type="page"/>
+      </w:r>
+    </w:p>
+    <w:p>
+      <w:pPr>
+        <w:pStyle w:val="3"/>
+        <w:spacing w:before="200" w:after="90"/>
+      </w:pPr>
+      <w:r>
+        <w:rPr>
+          <w:b/>
+          <w:bCs/>
+          <w:color w:val="2E5496"/>
+        </w:rPr>
+        <w:lastRenderedPageBreak/>
+        <w:t>6-2. 단건 조회도 IDOR이었다 — 소유권 검사로 전환</w:t>
+      </w:r>
+    </w:p>
+    <w:p>
+      <w:pPr>
+        <w:spacing w:after="100" w:line="276" w:lineRule="auto"/>
+      </w:pPr>
+      <w:r>
+        <w:t xml:space="preserve">전체목록 조회만 ROLE_ADMIN 전용으로 막았을 뿐, 단건 조회(GET /{id})는 로그인한 사용자라면 누구나 허용되어 있었다. </w:t>
+      </w:r>
+      <w:r>
+        <w:rPr>
+          <w:b/>
+          <w:bCs/>
+        </w:rPr>
+        <w:t>이는 IdorDemoService.getProfileVulnerable() 와 같은 패턴</w:t>
+      </w:r>
+      <w:r>
+        <w:t xml:space="preserve"> — 요청자와 대상을 대조하지 않는 것 — 이라, </w:t>
+      </w:r>
+      <w:r>
+        <w:rPr>
+          <w:b/>
+          <w:bCs/>
+        </w:rPr>
+        <w:t>본인 또는 관리자만 조회할 수 있도록</w:t>
+      </w:r>
+      <w:r>
+        <w:t xml:space="preserve"> </w:t>
+      </w:r>
+      <w:r>
+        <w:rPr>
+          <w:rFonts w:hint="eastAsia"/>
+        </w:rPr>
+        <w:t xml:space="preserve">변경함 </w:t>
+      </w:r>
+      <w:bookmarkStart w:id="0" w:name="_GoBack"/>
+      <w:bookmarkEnd w:id="0"/>
+      <w:r>
+        <w:t>(StudentController, StudentDetailController 동일 적용).</w:t>
+      </w:r>
+    </w:p>
+    <w:p>
+      <w:pPr>
+        <w:pBdr>
+          <w:top w:val="single" w:sz="4" w:space="3" w:color="D9D9D9"/>
+          <w:left w:val="single" w:sz="18" w:space="6" w:color="C0C0C0"/>
+        </w:pBdr>
+        <w:shd w:val="clear" w:color="auto" w:fill="F4F4F4"/>
+      </w:pPr>
+      <w:r>
+        <w:rPr>
+          <w:rFonts w:ascii="Consolas" w:eastAsia="Consolas" w:hAnsi="Consolas" w:cs="Consolas"/>
+          <w:sz w:val="18"/>
+          <w:szCs w:val="18"/>
+        </w:rPr>
+        <w:t>if (!isAdmin(currentUser) &amp;&amp; !isOwner(student, currentUser)) {</w:t>
+      </w:r>
+    </w:p>
+    <w:p>
+      <w:pPr>
+        <w:pBdr>
+          <w:left w:val="single" w:sz="18" w:space="6" w:color="C0C0C0"/>
+        </w:pBdr>
+        <w:shd w:val="clear" w:color="auto" w:fill="F4F4F4"/>
+      </w:pPr>
+      <w:r>
+        <w:rPr>
+          <w:rFonts w:ascii="Consolas" w:eastAsia="Consolas" w:hAnsi="Consolas" w:cs="Consolas"/>
+          <w:sz w:val="18"/>
+          <w:szCs w:val="18"/>
+        </w:rPr>
+        <w:t xml:space="preserve">    throw new AccessDeniedException("본인 정보만 조회할 수 있습니다");</w:t>
+      </w:r>
+    </w:p>
+    <w:p>
+      <w:pPr>
+        <w:pBdr>
+          <w:left w:val="single" w:sz="18" w:space="6" w:color="C0C0C0"/>
+          <w:bottom w:val="single" w:sz="4" w:space="3" w:color="D9D9D9"/>
+        </w:pBdr>
+        <w:shd w:val="clear" w:color="auto" w:fill="F4F4F4"/>
+      </w:pPr>
+      <w:r>
+        <w:rPr>
+          <w:rFonts w:ascii="Consolas" w:eastAsia="Consolas" w:hAnsi="Consolas" w:cs="Consolas"/>
+          <w:sz w:val="18"/>
+          <w:szCs w:val="18"/>
+        </w:rPr>
+        <w:t>}</w:t>
+      </w:r>
+    </w:p>
+    <w:p>
+      <w:pPr>
+        <w:spacing w:after="100" w:line="276" w:lineRule="auto"/>
+      </w:pPr>
+      <w:r>
+        <w:t>위</w:t>
+      </w:r>
+      <w:r>
+        <w:t xml:space="preserve"> </w:t>
+      </w:r>
+      <w:r>
+        <w:t>코드는</w:t>
+      </w:r>
+      <w:r>
+        <w:t xml:space="preserve"> </w:t>
+      </w:r>
+      <w:r>
+        <w:rPr>
+          <w:b/>
+          <w:bCs/>
+        </w:rPr>
+        <w:t>StudentService</w:t>
+      </w:r>
+      <w:r>
+        <w:t xml:space="preserve"> </w:t>
+      </w:r>
+      <w:r>
+        <w:t>클래스의</w:t>
+      </w:r>
+      <w:r>
+        <w:t xml:space="preserve"> getStudentById()/getStudentByStudentNumber() </w:t>
+      </w:r>
+      <w:r>
+        <w:t>에</w:t>
+      </w:r>
+      <w:r>
+        <w:t xml:space="preserve"> </w:t>
+      </w:r>
+      <w:r>
+        <w:t>있으며</w:t>
+      </w:r>
+      <w:r>
+        <w:t xml:space="preserve">, </w:t>
+      </w:r>
+      <w:r>
+        <w:t>아래</w:t>
+      </w:r>
+      <w:r>
+        <w:t xml:space="preserve"> </w:t>
+      </w:r>
+      <w:r>
+        <w:t>두</w:t>
+      </w:r>
+      <w:r>
+        <w:t xml:space="preserve"> private </w:t>
+      </w:r>
+      <w:r>
+        <w:t>메서드를</w:t>
+      </w:r>
+      <w:r>
+        <w:t xml:space="preserve"> </w:t>
+      </w:r>
+      <w:r>
+        <w:t>사용한다</w:t>
+      </w:r>
+      <w:r>
+        <w:t>.</w:t>
+      </w:r>
+    </w:p>
+    <w:p>
+      <w:pPr>
+        <w:pBdr>
+          <w:top w:val="single" w:sz="4" w:space="3" w:color="D9D9D9"/>
+          <w:left w:val="single" w:sz="18" w:space="6" w:color="C0C0C0"/>
+        </w:pBdr>
+        <w:shd w:val="clear" w:color="auto" w:fill="F4F4F4"/>
+      </w:pPr>
+      <w:r>
+        <w:rPr>
+          <w:rFonts w:ascii="Consolas" w:eastAsia="Consolas" w:hAnsi="Consolas" w:cs="Consolas"/>
+          <w:sz w:val="18"/>
+          <w:szCs w:val="18"/>
+        </w:rPr>
+        <w:t xml:space="preserve">// roles </w:t>
+      </w:r>
+      <w:r>
+        <w:rPr>
+          <w:rFonts w:ascii="Consolas" w:eastAsia="Consolas" w:hAnsi="Consolas" w:cs="Consolas"/>
+          <w:sz w:val="18"/>
+          <w:szCs w:val="18"/>
+        </w:rPr>
         <w:t>는</w:t>
       </w:r>
       <w:r>
-        <w:t xml:space="preserve"> </w:t>
-      </w:r>
-      <w:r>
-        <w:t>빈</w:t>
-      </w:r>
-      <w:r>
-        <w:t xml:space="preserve"> </w:t>
-      </w:r>
-      <w:r>
-        <w:t>검색어</w:t>
-      </w:r>
-      <w:r>
-        <w:t xml:space="preserve">(keyword="") </w:t>
-      </w:r>
-      <w:r>
-        <w:t>입력</w:t>
-      </w:r>
-      <w:r>
-        <w:t xml:space="preserve"> </w:t>
-      </w:r>
-      <w:r>
-        <w:t>시</w:t>
-      </w:r>
-      <w:r>
-        <w:t xml:space="preserve"> </w:t>
-      </w:r>
+        <w:rPr>
+          <w:rFonts w:ascii="Consolas" w:eastAsia="Consolas" w:hAnsi="Consolas" w:cs="Consolas"/>
+          <w:sz w:val="18"/>
+          <w:szCs w:val="18"/>
+        </w:rPr>
+        <w:t xml:space="preserve"> "ROLE_USER" </w:t>
+      </w:r>
+      <w:r>
+        <w:rPr>
+          <w:rFonts w:ascii="Consolas" w:eastAsia="Consolas" w:hAnsi="Consolas" w:cs="Consolas"/>
+          <w:sz w:val="18"/>
+          <w:szCs w:val="18"/>
+        </w:rPr>
+        <w:t>또는</w:t>
+      </w:r>
+      <w:r>
+        <w:rPr>
+          <w:rFonts w:ascii="Consolas" w:eastAsia="Consolas" w:hAnsi="Consolas" w:cs="Consolas"/>
+          <w:sz w:val="18"/>
+          <w:szCs w:val="18"/>
+        </w:rPr>
+        <w:t xml:space="preserve"> "ROLE_ADMIN,ROLE_USER" </w:t>
+      </w:r>
+      <w:r>
+        <w:rPr>
+          <w:rFonts w:ascii="Consolas" w:eastAsia="Consolas" w:hAnsi="Consolas" w:cs="Consolas"/>
+          <w:sz w:val="18"/>
+          <w:szCs w:val="18"/>
+        </w:rPr>
+        <w:t>처럼</w:t>
+      </w:r>
+      <w:r>
+        <w:rPr>
+          <w:rFonts w:ascii="Consolas" w:eastAsia="Consolas" w:hAnsi="Consolas" w:cs="Consolas"/>
+          <w:sz w:val="18"/>
+          <w:szCs w:val="18"/>
+        </w:rPr>
+        <w:t xml:space="preserve"> </w:t>
+      </w:r>
+      <w:r>
+        <w:rPr>
+          <w:rFonts w:ascii="Consolas" w:eastAsia="Consolas" w:hAnsi="Consolas" w:cs="Consolas"/>
+          <w:sz w:val="18"/>
+          <w:szCs w:val="18"/>
+        </w:rPr>
+        <w:t>쉼표로</w:t>
+      </w:r>
+      <w:r>
+        <w:rPr>
+          <w:rFonts w:ascii="Consolas" w:eastAsia="Consolas" w:hAnsi="Consolas" w:cs="Consolas"/>
+          <w:sz w:val="18"/>
+          <w:szCs w:val="18"/>
+        </w:rPr>
+        <w:t xml:space="preserve"> </w:t>
+      </w:r>
+      <w:r>
+        <w:rPr>
+          <w:rFonts w:ascii="Consolas" w:eastAsia="Consolas" w:hAnsi="Consolas" w:cs="Consolas"/>
+          <w:sz w:val="18"/>
+          <w:szCs w:val="18"/>
+        </w:rPr>
+        <w:t>구분된</w:t>
+      </w:r>
+      <w:r>
+        <w:rPr>
+          <w:rFonts w:ascii="Consolas" w:eastAsia="Consolas" w:hAnsi="Consolas" w:cs="Consolas"/>
+          <w:sz w:val="18"/>
+          <w:szCs w:val="18"/>
+        </w:rPr>
+        <w:t xml:space="preserve"> </w:t>
+      </w:r>
+      <w:r>
+        <w:rPr>
+          <w:rFonts w:ascii="Consolas" w:eastAsia="Consolas" w:hAnsi="Consolas" w:cs="Consolas"/>
+          <w:sz w:val="18"/>
+          <w:szCs w:val="18"/>
+        </w:rPr>
+        <w:t>문자열이다</w:t>
+      </w:r>
+    </w:p>
+    <w:p>
+      <w:pPr>
+        <w:pBdr>
+          <w:left w:val="single" w:sz="18" w:space="6" w:color="C0C0C0"/>
+        </w:pBdr>
+        <w:shd w:val="clear" w:color="auto" w:fill="F4F4F4"/>
+      </w:pPr>
+      <w:r>
+        <w:rPr>
+          <w:rFonts w:ascii="Consolas" w:eastAsia="Consolas" w:hAnsi="Consolas" w:cs="Consolas"/>
+          <w:sz w:val="18"/>
+          <w:szCs w:val="18"/>
+        </w:rPr>
+        <w:t>private boolean isAdmin(UserInfo user) {</w:t>
+      </w:r>
+    </w:p>
+    <w:p>
+      <w:pPr>
+        <w:pBdr>
+          <w:left w:val="single" w:sz="18" w:space="6" w:color="C0C0C0"/>
+        </w:pBdr>
+        <w:shd w:val="clear" w:color="auto" w:fill="F4F4F4"/>
+      </w:pPr>
+      <w:r>
+        <w:rPr>
+          <w:rFonts w:ascii="Consolas" w:eastAsia="Consolas" w:hAnsi="Consolas" w:cs="Consolas"/>
+          <w:sz w:val="18"/>
+          <w:szCs w:val="18"/>
+        </w:rPr>
+        <w:t xml:space="preserve">    String roles = user.getRoles()</w:t>
+      </w:r>
+      <w:r>
+        <w:rPr>
+          <w:rFonts w:ascii="Consolas" w:eastAsia="Consolas" w:hAnsi="Consolas" w:cs="Consolas"/>
+          <w:sz w:val="18"/>
+          <w:szCs w:val="18"/>
+        </w:rPr>
+        <w:t xml:space="preserve"> == null ? "" : user.getRoles();</w:t>
+      </w:r>
+    </w:p>
+    <w:p>
+      <w:pPr>
+        <w:pBdr>
+          <w:left w:val="single" w:sz="18" w:space="6" w:color="C0C0C0"/>
+        </w:pBdr>
+        <w:shd w:val="clear" w:color="auto" w:fill="F4F4F4"/>
+      </w:pPr>
+      <w:r>
+        <w:rPr>
+          <w:rFonts w:ascii="Consolas" w:eastAsia="Consolas" w:hAnsi="Consolas" w:cs="Consolas"/>
+          <w:sz w:val="18"/>
+          <w:szCs w:val="18"/>
+        </w:rPr>
+        <w:t xml:space="preserve">    return Arrays.stream(roles.split(","))</w:t>
+      </w:r>
+    </w:p>
+    <w:p>
+      <w:pPr>
+        <w:pBdr>
+          <w:left w:val="single" w:sz="18" w:space="6" w:color="C0C0C0"/>
+        </w:pBdr>
+        <w:shd w:val="clear" w:color="auto" w:fill="F4F4F4"/>
+      </w:pPr>
+      <w:r>
+        <w:rPr>
+          <w:rFonts w:ascii="Consolas" w:eastAsia="Consolas" w:hAnsi="Consolas" w:cs="Consolas"/>
+          <w:sz w:val="18"/>
+          <w:szCs w:val="18"/>
+        </w:rPr>
+        <w:t xml:space="preserve">            .map(String::trim)</w:t>
+      </w:r>
+    </w:p>
+    <w:p>
+      <w:pPr>
+        <w:pBdr>
+          <w:left w:val="single" w:sz="18" w:space="6" w:color="C0C0C0"/>
+        </w:pBdr>
+        <w:shd w:val="clear" w:color="auto" w:fill="F4F4F4"/>
+      </w:pPr>
+      <w:r>
+        <w:rPr>
+          <w:rFonts w:ascii="Consolas" w:eastAsia="Consolas" w:hAnsi="Consolas" w:cs="Consolas"/>
+          <w:sz w:val="18"/>
+          <w:szCs w:val="18"/>
+        </w:rPr>
+        <w:t xml:space="preserve">            .anyMatch("ROLE_ADMIN"::equals);</w:t>
+      </w:r>
+    </w:p>
+    <w:p>
+      <w:pPr>
+        <w:pBdr>
+          <w:left w:val="single" w:sz="18" w:space="6" w:color="C0C0C0"/>
+        </w:pBdr>
+        <w:shd w:val="clear" w:color="auto" w:fill="F4F4F4"/>
+      </w:pPr>
+      <w:r>
+        <w:rPr>
+          <w:rFonts w:ascii="Consolas" w:eastAsia="Consolas" w:hAnsi="Consolas" w:cs="Consolas"/>
+          <w:sz w:val="18"/>
+          <w:szCs w:val="18"/>
+        </w:rPr>
+        <w:t>}</w:t>
+      </w:r>
+    </w:p>
+    <w:p>
+      <w:pPr>
+        <w:pBdr>
+          <w:left w:val="single" w:sz="18" w:space="6" w:color="C0C0C0"/>
+        </w:pBdr>
+        <w:shd w:val="clear" w:color="auto" w:fill="F4F4F4"/>
+      </w:pPr>
+    </w:p>
+    <w:p>
+      <w:pPr>
+        <w:pBdr>
+          <w:left w:val="single" w:sz="18" w:space="6" w:color="C0C0C0"/>
+        </w:pBdr>
+        <w:shd w:val="clear" w:color="auto" w:fill="F4F4F4"/>
+      </w:pPr>
+      <w:r>
+        <w:rPr>
+          <w:rFonts w:ascii="Consolas" w:eastAsia="Consolas" w:hAnsi="Consolas" w:cs="Consolas"/>
+          <w:sz w:val="18"/>
+          <w:szCs w:val="18"/>
+        </w:rPr>
+        <w:t xml:space="preserve">// </w:t>
+      </w:r>
+      <w:r>
+        <w:rPr>
+          <w:rFonts w:ascii="Consolas" w:eastAsia="Consolas" w:hAnsi="Consolas" w:cs="Consolas"/>
+          <w:sz w:val="18"/>
+          <w:szCs w:val="18"/>
+        </w:rPr>
+        <w:t>학생을</w:t>
+      </w:r>
+      <w:r>
+        <w:rPr>
+          <w:rFonts w:ascii="Consolas" w:eastAsia="Consolas" w:hAnsi="Consolas" w:cs="Consolas"/>
+          <w:sz w:val="18"/>
+          <w:szCs w:val="18"/>
+        </w:rPr>
+        <w:t xml:space="preserve"> </w:t>
+      </w:r>
+      <w:r>
+        <w:rPr>
+          <w:rFonts w:ascii="Consolas" w:eastAsia="Consolas" w:hAnsi="Consolas" w:cs="Consolas"/>
+          <w:sz w:val="18"/>
+          <w:szCs w:val="18"/>
+        </w:rPr>
+        <w:t>등록한</w:t>
+      </w:r>
+      <w:r>
+        <w:rPr>
+          <w:rFonts w:ascii="Consolas" w:eastAsia="Consolas" w:hAnsi="Consolas" w:cs="Consolas"/>
+          <w:sz w:val="18"/>
+          <w:szCs w:val="18"/>
+        </w:rPr>
+        <w:t xml:space="preserve"> </w:t>
+      </w:r>
+      <w:r>
+        <w:rPr>
+          <w:rFonts w:ascii="Consolas" w:eastAsia="Consolas" w:hAnsi="Consolas" w:cs="Consolas"/>
+          <w:sz w:val="18"/>
+          <w:szCs w:val="18"/>
+        </w:rPr>
+        <w:t>사용자</w:t>
+      </w:r>
+      <w:r>
+        <w:rPr>
+          <w:rFonts w:ascii="Consolas" w:eastAsia="Consolas" w:hAnsi="Consolas" w:cs="Consolas"/>
+          <w:sz w:val="18"/>
+          <w:szCs w:val="18"/>
+        </w:rPr>
+        <w:t xml:space="preserve">(student.userInfo) </w:t>
+      </w:r>
+      <w:r>
+        <w:rPr>
+          <w:rFonts w:ascii="Consolas" w:eastAsia="Consolas" w:hAnsi="Consolas" w:cs="Consolas"/>
+          <w:sz w:val="18"/>
+          <w:szCs w:val="18"/>
+        </w:rPr>
+        <w:t>와</w:t>
+      </w:r>
+      <w:r>
+        <w:rPr>
+          <w:rFonts w:ascii="Consolas" w:eastAsia="Consolas" w:hAnsi="Consolas" w:cs="Consolas"/>
+          <w:sz w:val="18"/>
+          <w:szCs w:val="18"/>
+        </w:rPr>
+        <w:t xml:space="preserve"> </w:t>
+      </w:r>
+      <w:r>
+        <w:rPr>
+          <w:rFonts w:ascii="Consolas" w:eastAsia="Consolas" w:hAnsi="Consolas" w:cs="Consolas"/>
+          <w:sz w:val="18"/>
+          <w:szCs w:val="18"/>
+        </w:rPr>
+        <w:t>현재</w:t>
+      </w:r>
+      <w:r>
+        <w:rPr>
+          <w:rFonts w:ascii="Consolas" w:eastAsia="Consolas" w:hAnsi="Consolas" w:cs="Consolas"/>
+          <w:sz w:val="18"/>
+          <w:szCs w:val="18"/>
+        </w:rPr>
+        <w:t xml:space="preserve"> </w:t>
+      </w:r>
+      <w:r>
+        <w:rPr>
+          <w:rFonts w:ascii="Consolas" w:eastAsia="Consolas" w:hAnsi="Consolas" w:cs="Consolas"/>
+          <w:sz w:val="18"/>
+          <w:szCs w:val="18"/>
+        </w:rPr>
+        <w:t>로그인한</w:t>
+      </w:r>
+      <w:r>
+        <w:rPr>
+          <w:rFonts w:ascii="Consolas" w:eastAsia="Consolas" w:hAnsi="Consolas" w:cs="Consolas"/>
+          <w:sz w:val="18"/>
+          <w:szCs w:val="18"/>
+        </w:rPr>
+        <w:t xml:space="preserve"> </w:t>
+      </w:r>
+      <w:r>
+        <w:rPr>
+          <w:rFonts w:ascii="Consolas" w:eastAsia="Consolas" w:hAnsi="Consolas" w:cs="Consolas"/>
+          <w:sz w:val="18"/>
+          <w:szCs w:val="18"/>
+        </w:rPr>
+        <w:t>사용자가</w:t>
+      </w:r>
+      <w:r>
+        <w:rPr>
+          <w:rFonts w:ascii="Consolas" w:eastAsia="Consolas" w:hAnsi="Consolas" w:cs="Consolas"/>
+          <w:sz w:val="18"/>
+          <w:szCs w:val="18"/>
+        </w:rPr>
+        <w:t xml:space="preserve"> </w:t>
+      </w:r>
+      <w:r>
+        <w:rPr>
+          <w:rFonts w:ascii="Consolas" w:eastAsia="Consolas" w:hAnsi="Consolas" w:cs="Consolas"/>
+          <w:sz w:val="18"/>
+          <w:szCs w:val="18"/>
+        </w:rPr>
+        <w:t>같은지</w:t>
+      </w:r>
+      <w:r>
+        <w:rPr>
+          <w:rFonts w:ascii="Consolas" w:eastAsia="Consolas" w:hAnsi="Consolas" w:cs="Consolas"/>
+          <w:sz w:val="18"/>
+          <w:szCs w:val="18"/>
+        </w:rPr>
+        <w:t xml:space="preserve"> </w:t>
+      </w:r>
+      <w:r>
+        <w:rPr>
+          <w:rFonts w:ascii="Consolas" w:eastAsia="Consolas" w:hAnsi="Consolas" w:cs="Consolas"/>
+          <w:sz w:val="18"/>
+          <w:szCs w:val="18"/>
+        </w:rPr>
+        <w:t>확인한다</w:t>
+      </w:r>
+    </w:p>
+    <w:p>
+      <w:pPr>
+        <w:pBdr>
+          <w:left w:val="single" w:sz="18" w:space="6" w:color="C0C0C0"/>
+        </w:pBdr>
+        <w:shd w:val="clear" w:color="auto" w:fill="F4F4F4"/>
+      </w:pPr>
+      <w:r>
+        <w:rPr>
+          <w:rFonts w:ascii="Consolas" w:eastAsia="Consolas" w:hAnsi="Consolas" w:cs="Consolas"/>
+          <w:sz w:val="18"/>
+          <w:szCs w:val="18"/>
+        </w:rPr>
+        <w:t>private boolean isOwner(Student student, Use</w:t>
+      </w:r>
+      <w:r>
+        <w:rPr>
+          <w:rFonts w:ascii="Consolas" w:eastAsia="Consolas" w:hAnsi="Consolas" w:cs="Consolas"/>
+          <w:sz w:val="18"/>
+          <w:szCs w:val="18"/>
+        </w:rPr>
+        <w:t>rInfo user) {</w:t>
+      </w:r>
+    </w:p>
+    <w:p>
+      <w:pPr>
+        <w:pBdr>
+          <w:left w:val="single" w:sz="18" w:space="6" w:color="C0C0C0"/>
+        </w:pBdr>
+        <w:shd w:val="clear" w:color="auto" w:fill="F4F4F4"/>
+      </w:pPr>
+      <w:r>
+        <w:rPr>
+          <w:rFonts w:ascii="Consolas" w:eastAsia="Consolas" w:hAnsi="Consolas" w:cs="Consolas"/>
+          <w:sz w:val="18"/>
+          <w:szCs w:val="18"/>
+        </w:rPr>
+        <w:t xml:space="preserve">    return student.getUserInfo() != null</w:t>
+      </w:r>
+    </w:p>
+    <w:p>
+      <w:pPr>
+        <w:pBdr>
+          <w:left w:val="single" w:sz="18" w:space="6" w:color="C0C0C0"/>
+        </w:pBdr>
+        <w:shd w:val="clear" w:color="auto" w:fill="F4F4F4"/>
+      </w:pPr>
+      <w:r>
+        <w:rPr>
+          <w:rFonts w:ascii="Consolas" w:eastAsia="Consolas" w:hAnsi="Consolas" w:cs="Consolas"/>
+          <w:sz w:val="18"/>
+          <w:szCs w:val="18"/>
+        </w:rPr>
+        <w:t xml:space="preserve">            &amp;&amp; student.getUserInfo().getId().equals(user.getId());</w:t>
+      </w:r>
+    </w:p>
+    <w:p>
+      <w:pPr>
+        <w:pBdr>
+          <w:left w:val="single" w:sz="18" w:space="6" w:color="C0C0C0"/>
+          <w:bottom w:val="single" w:sz="4" w:space="3" w:color="D9D9D9"/>
+        </w:pBdr>
+        <w:shd w:val="clear" w:color="auto" w:fill="F4F4F4"/>
+      </w:pPr>
+      <w:r>
+        <w:rPr>
+          <w:rFonts w:ascii="Consolas" w:eastAsia="Consolas" w:hAnsi="Consolas" w:cs="Consolas"/>
+          <w:sz w:val="18"/>
+          <w:szCs w:val="18"/>
+        </w:rPr>
+        <w:t>}</w:t>
+      </w:r>
+    </w:p>
+    <w:p>
+      <w:pPr>
+        <w:pStyle w:val="3"/>
+        <w:spacing w:before="200" w:after="90"/>
+      </w:pPr>
+      <w:r>
+        <w:rPr>
+          <w:b/>
+          <w:bCs/>
+          <w:color w:val="2E5496"/>
+        </w:rPr>
+        <w:t>실습: curl로 검증</w:t>
+      </w:r>
+    </w:p>
+    <w:p>
+      <w:pPr>
+        <w:spacing w:after="100" w:line="276" w:lineRule="auto"/>
+      </w:pPr>
       <w:r>
         <w:t>전체</w:t>
       </w:r>
@@ -2724,34 +3261,1475 @@
         <w:t xml:space="preserve"> </w:t>
       </w:r>
       <w:r>
+        <w:t>목록</w:t>
+      </w:r>
+      <w:r>
+        <w:t xml:space="preserve"> </w:t>
+      </w:r>
+      <w:r>
+        <w:t>조회</w:t>
+      </w:r>
+      <w:r>
+        <w:t>(GET /api/students)</w:t>
+      </w:r>
+      <w:r>
+        <w:t>와</w:t>
+      </w:r>
+      <w:r>
+        <w:t xml:space="preserve"> </w:t>
+      </w:r>
+      <w:r>
+        <w:t>단건</w:t>
+      </w:r>
+      <w:r>
+        <w:t xml:space="preserve"> </w:t>
+      </w:r>
+      <w:r>
+        <w:t>조회</w:t>
+      </w:r>
+      <w:r>
+        <w:t xml:space="preserve"> </w:t>
+      </w:r>
+      <w:r>
+        <w:t>모두</w:t>
+      </w:r>
+      <w:r>
+        <w:t xml:space="preserve"> </w:t>
+      </w:r>
+      <w:r>
+        <w:t>역할</w:t>
+      </w:r>
+      <w:r>
+        <w:t>·</w:t>
+      </w:r>
+      <w:r>
+        <w:t>소유권에</w:t>
+      </w:r>
+      <w:r>
+        <w:t xml:space="preserve"> </w:t>
+      </w:r>
+      <w:r>
+        <w:t>따라</w:t>
+      </w:r>
+      <w:r>
+        <w:t xml:space="preserve"> </w:t>
+      </w:r>
+      <w:r>
+        <w:t>응답이</w:t>
+      </w:r>
+      <w:r>
+        <w:t xml:space="preserve"> </w:t>
+      </w:r>
+      <w:r>
+        <w:t>달라지는</w:t>
+      </w:r>
+      <w:r>
+        <w:t xml:space="preserve"> </w:t>
+      </w:r>
+      <w:r>
+        <w:t>것을</w:t>
+      </w:r>
+      <w:r>
+        <w:t xml:space="preserve"> </w:t>
+      </w:r>
+      <w:r>
+        <w:t>확인한다</w:t>
+      </w:r>
+      <w:r>
+        <w:t>.</w:t>
+      </w:r>
+    </w:p>
+    <w:p>
+      <w:pPr>
+        <w:spacing w:after="100" w:line="276" w:lineRule="auto"/>
+      </w:pPr>
+      <w:r>
+        <w:t xml:space="preserve">(1) </w:t>
+      </w:r>
+      <w:r>
+        <w:t>관리자</w:t>
+      </w:r>
+      <w:r>
+        <w:t>(admin@aa.com)</w:t>
+      </w:r>
+      <w:r>
+        <w:t>로</w:t>
+      </w:r>
+      <w:r>
+        <w:t xml:space="preserve"> </w:t>
+      </w:r>
+      <w:r>
+        <w:t>전체</w:t>
+      </w:r>
+      <w:r>
+        <w:t xml:space="preserve"> </w:t>
+      </w:r>
+      <w:r>
+        <w:t>목록</w:t>
+      </w:r>
+      <w:r>
+        <w:t xml:space="preserve"> </w:t>
+      </w:r>
+      <w:r>
+        <w:t>조회</w:t>
+      </w:r>
+      <w:r>
+        <w:t xml:space="preserve"> → 200</w:t>
+      </w:r>
+    </w:p>
+    <w:p>
+      <w:pPr>
+        <w:pBdr>
+          <w:top w:val="single" w:sz="4" w:space="3" w:color="D9D9D9"/>
+          <w:left w:val="single" w:sz="18" w:space="6" w:color="C0C0C0"/>
+        </w:pBdr>
+        <w:shd w:val="clear" w:color="auto" w:fill="F4F4F4"/>
+      </w:pPr>
+      <w:r>
+        <w:rPr>
+          <w:rFonts w:ascii="Consolas" w:eastAsia="Consolas" w:hAnsi="Consolas" w:cs="Consolas"/>
+          <w:sz w:val="18"/>
+          <w:szCs w:val="18"/>
+        </w:rPr>
+        <w:t>ADMIN_TOKEN=$(curl -s -X POST http://localhost:8080/api/userinfos/login \</w:t>
+      </w:r>
+    </w:p>
+    <w:p>
+      <w:pPr>
+        <w:pBdr>
+          <w:left w:val="single" w:sz="18" w:space="6" w:color="C0C0C0"/>
+        </w:pBdr>
+        <w:shd w:val="clear" w:color="auto" w:fill="F4F4F4"/>
+      </w:pPr>
+      <w:r>
+        <w:rPr>
+          <w:rFonts w:ascii="Consolas" w:eastAsia="Consolas" w:hAnsi="Consolas" w:cs="Consolas"/>
+          <w:sz w:val="18"/>
+          <w:szCs w:val="18"/>
+        </w:rPr>
+        <w:t xml:space="preserve">  -H "Content-Type: application/json" \</w:t>
+      </w:r>
+    </w:p>
+    <w:p>
+      <w:pPr>
+        <w:pBdr>
+          <w:left w:val="single" w:sz="18" w:space="6" w:color="C0C0C0"/>
+        </w:pBdr>
+        <w:shd w:val="clear" w:color="auto" w:fill="F4F4F4"/>
+      </w:pPr>
+      <w:r>
+        <w:rPr>
+          <w:rFonts w:ascii="Consolas" w:eastAsia="Consolas" w:hAnsi="Consolas" w:cs="Consolas"/>
+          <w:sz w:val="18"/>
+          <w:szCs w:val="18"/>
+        </w:rPr>
+        <w:t xml:space="preserve">  -d '{"email":"admin@aa.com","password":"pwd1"}' \</w:t>
+      </w:r>
+    </w:p>
+    <w:p>
+      <w:pPr>
+        <w:pBdr>
+          <w:left w:val="single" w:sz="18" w:space="6" w:color="C0C0C0"/>
+          <w:bottom w:val="single" w:sz="4" w:space="3" w:color="D9D9D9"/>
+        </w:pBdr>
+        <w:shd w:val="clear" w:color="auto" w:fill="F4F4F4"/>
+      </w:pPr>
+      <w:r>
+        <w:rPr>
+          <w:rFonts w:ascii="Consolas" w:eastAsia="Consolas" w:hAnsi="Consolas" w:cs="Consolas"/>
+          <w:sz w:val="18"/>
+          <w:szCs w:val="18"/>
+        </w:rPr>
+        <w:t xml:space="preserve">  | sed -n 's/.*"accessToken":"\([^"]*\)".*/\1/p')</w:t>
+      </w:r>
+    </w:p>
+    <w:p>
+      <w:pPr>
+        <w:pBdr>
+          <w:top w:val="single" w:sz="4" w:space="3" w:color="D9D9D9"/>
+          <w:left w:val="single" w:sz="18" w:space="6" w:color="C0C0C0"/>
+          <w:bottom w:val="single" w:sz="4" w:space="3" w:color="D9D9D9"/>
+        </w:pBdr>
+        <w:shd w:val="clear" w:color="auto" w:fill="F4F4F4"/>
+      </w:pPr>
+      <w:r>
+        <w:rPr>
+          <w:rFonts w:ascii="Consolas" w:eastAsia="Consolas" w:hAnsi="Consolas" w:cs="Consolas"/>
+          <w:sz w:val="18"/>
+          <w:szCs w:val="18"/>
+        </w:rPr>
+        <w:t>curl -H "Authorization: Bearer $ADMIN_T</w:t>
+      </w:r>
+      <w:r>
+        <w:rPr>
+          <w:rFonts w:ascii="Consolas" w:eastAsia="Consolas" w:hAnsi="Consolas" w:cs="Consolas"/>
+          <w:sz w:val="18"/>
+          <w:szCs w:val="18"/>
+        </w:rPr>
+        <w:t>OKEN" http://localhost:8080/api/students</w:t>
+      </w:r>
+    </w:p>
+    <w:p>
+      <w:pPr>
+        <w:pBdr>
+          <w:top w:val="single" w:sz="4" w:space="3" w:color="D9D9D9"/>
+          <w:left w:val="single" w:sz="18" w:space="6" w:color="C0C0C0"/>
+          <w:bottom w:val="single" w:sz="4" w:space="3" w:color="D9D9D9"/>
+        </w:pBdr>
+        <w:shd w:val="clear" w:color="auto" w:fill="F4F4F4"/>
+      </w:pPr>
+      <w:r>
+        <w:rPr>
+          <w:rFonts w:ascii="Consolas" w:eastAsia="Consolas" w:hAnsi="Consolas" w:cs="Consolas"/>
+          <w:sz w:val="18"/>
+          <w:szCs w:val="18"/>
+        </w:rPr>
+        <w:t>HTTP 200  (</w:t>
+      </w:r>
+      <w:r>
+        <w:rPr>
+          <w:rFonts w:ascii="Consolas" w:eastAsia="Consolas" w:hAnsi="Consolas" w:cs="Consolas"/>
+          <w:sz w:val="18"/>
+          <w:szCs w:val="18"/>
+        </w:rPr>
+        <w:t>전체</w:t>
+      </w:r>
+      <w:r>
+        <w:rPr>
+          <w:rFonts w:ascii="Consolas" w:eastAsia="Consolas" w:hAnsi="Consolas" w:cs="Consolas"/>
+          <w:sz w:val="18"/>
+          <w:szCs w:val="18"/>
+        </w:rPr>
+        <w:t xml:space="preserve"> </w:t>
+      </w:r>
+      <w:r>
+        <w:rPr>
+          <w:rFonts w:ascii="Consolas" w:eastAsia="Consolas" w:hAnsi="Consolas" w:cs="Consolas"/>
+          <w:sz w:val="18"/>
+          <w:szCs w:val="18"/>
+        </w:rPr>
+        <w:t>학생</w:t>
+      </w:r>
+      <w:r>
+        <w:rPr>
+          <w:rFonts w:ascii="Consolas" w:eastAsia="Consolas" w:hAnsi="Consolas" w:cs="Consolas"/>
+          <w:sz w:val="18"/>
+          <w:szCs w:val="18"/>
+        </w:rPr>
+        <w:t xml:space="preserve"> </w:t>
+      </w:r>
+      <w:r>
+        <w:rPr>
+          <w:rFonts w:ascii="Consolas" w:eastAsia="Consolas" w:hAnsi="Consolas" w:cs="Consolas"/>
+          <w:sz w:val="18"/>
+          <w:szCs w:val="18"/>
+        </w:rPr>
         <w:t>목록이</w:t>
       </w:r>
       <w:r>
-        <w:t xml:space="preserve"> </w:t>
-      </w:r>
-      <w:r>
+        <w:rPr>
+          <w:rFonts w:ascii="Consolas" w:eastAsia="Consolas" w:hAnsi="Consolas" w:cs="Consolas"/>
+          <w:sz w:val="18"/>
+          <w:szCs w:val="18"/>
+        </w:rPr>
+        <w:t xml:space="preserve"> </w:t>
+      </w:r>
+      <w:r>
+        <w:rPr>
+          <w:rFonts w:ascii="Consolas" w:eastAsia="Consolas" w:hAnsi="Consolas" w:cs="Consolas"/>
+          <w:sz w:val="18"/>
+          <w:szCs w:val="18"/>
+        </w:rPr>
         <w:t>그대로</w:t>
       </w:r>
       <w:r>
-        <w:t xml:space="preserve"> </w:t>
-      </w:r>
-      <w:r>
-        <w:t>반환되던</w:t>
-      </w:r>
-      <w:r>
-        <w:t xml:space="preserve"> </w:t>
-      </w:r>
-      <w:r>
-        <w:t>우회를</w:t>
-      </w:r>
-      <w:r>
-        <w:t xml:space="preserve"> </w:t>
-      </w:r>
-      <w:r>
-        <w:t>차단했다</w:t>
+        <w:rPr>
+          <w:rFonts w:ascii="Consolas" w:eastAsia="Consolas" w:hAnsi="Consolas" w:cs="Consolas"/>
+          <w:sz w:val="18"/>
+          <w:szCs w:val="18"/>
+        </w:rPr>
+        <w:t xml:space="preserve"> </w:t>
+      </w:r>
+      <w:r>
+        <w:rPr>
+          <w:rFonts w:ascii="Consolas" w:eastAsia="Consolas" w:hAnsi="Consolas" w:cs="Consolas"/>
+          <w:sz w:val="18"/>
+          <w:szCs w:val="18"/>
+        </w:rPr>
+        <w:t>반환된다</w:t>
+      </w:r>
+      <w:r>
+        <w:rPr>
+          <w:rFonts w:ascii="Consolas" w:eastAsia="Consolas" w:hAnsi="Consolas" w:cs="Consolas"/>
+          <w:sz w:val="18"/>
+          <w:szCs w:val="18"/>
+        </w:rPr>
+        <w:t>)</w:t>
+      </w:r>
+    </w:p>
+    <w:p>
+      <w:pPr>
+        <w:spacing w:after="100" w:line="276" w:lineRule="auto"/>
+      </w:pPr>
+      <w:r>
+        <w:t xml:space="preserve">(2) </w:t>
+      </w:r>
+      <w:r>
+        <w:t>일반</w:t>
+      </w:r>
+      <w:r>
+        <w:t xml:space="preserve"> </w:t>
+      </w:r>
+      <w:r>
+        <w:t>사용자</w:t>
+      </w:r>
+      <w:r>
+        <w:t>(user@aa.com)</w:t>
+      </w:r>
+      <w:r>
+        <w:t>로</w:t>
+      </w:r>
+      <w:r>
+        <w:t xml:space="preserve"> </w:t>
+      </w:r>
+      <w:r>
+        <w:t>전체</w:t>
+      </w:r>
+      <w:r>
+        <w:t xml:space="preserve"> </w:t>
+      </w:r>
+      <w:r>
+        <w:t>목록</w:t>
+      </w:r>
+      <w:r>
+        <w:t xml:space="preserve"> </w:t>
+      </w:r>
+      <w:r>
+        <w:t>조회</w:t>
+      </w:r>
+      <w:r>
+        <w:t xml:space="preserve"> → 403</w:t>
+      </w:r>
+    </w:p>
+    <w:p>
+      <w:pPr>
+        <w:pBdr>
+          <w:top w:val="single" w:sz="4" w:space="3" w:color="D9D9D9"/>
+          <w:left w:val="single" w:sz="18" w:space="6" w:color="C0C0C0"/>
+          <w:bottom w:val="single" w:sz="4" w:space="3" w:color="D9D9D9"/>
+        </w:pBdr>
+        <w:shd w:val="clear" w:color="auto" w:fill="F4F4F4"/>
+      </w:pPr>
+      <w:r>
+        <w:rPr>
+          <w:rFonts w:ascii="Consolas" w:eastAsia="Consolas" w:hAnsi="Consolas" w:cs="Consolas"/>
+          <w:sz w:val="18"/>
+          <w:szCs w:val="18"/>
+        </w:rPr>
+        <w:t>curl -H "Authorization: Bearer $USER_TOKEN" http://localhost:8080/api/students</w:t>
+      </w:r>
+    </w:p>
+    <w:p>
+      <w:pPr>
+        <w:pBdr>
+          <w:top w:val="single" w:sz="4" w:space="3" w:color="D9D9D9"/>
+          <w:left w:val="single" w:sz="18" w:space="6" w:color="C0C0C0"/>
+          <w:bottom w:val="single" w:sz="4" w:space="3" w:color="D9D9D9"/>
+        </w:pBdr>
+        <w:shd w:val="clear" w:color="auto" w:fill="F4F4F4"/>
+      </w:pPr>
+      <w:r>
+        <w:rPr>
+          <w:rFonts w:ascii="Consolas" w:eastAsia="Consolas" w:hAnsi="Consolas" w:cs="Consolas"/>
+          <w:sz w:val="18"/>
+          <w:szCs w:val="18"/>
+        </w:rPr>
+        <w:t>{"statusCode":403,"message":"Access Denied", ...}</w:t>
+      </w:r>
+    </w:p>
+    <w:p>
+      <w:pPr>
+        <w:spacing w:after="100" w:line="276" w:lineRule="auto"/>
+      </w:pPr>
+      <w:r>
+        <w:t xml:space="preserve">(3) </w:t>
+      </w:r>
+      <w:r>
+        <w:t>일반</w:t>
+      </w:r>
+      <w:r>
+        <w:t xml:space="preserve"> </w:t>
+      </w:r>
+      <w:r>
+        <w:t>사용자</w:t>
+      </w:r>
+      <w:r>
+        <w:t>(user</w:t>
+      </w:r>
+      <w:r>
+        <w:t>@aa.com)</w:t>
+      </w:r>
+      <w:r>
+        <w:t>로</w:t>
+      </w:r>
+      <w:r>
+        <w:t xml:space="preserve"> </w:t>
+      </w:r>
+      <w:r>
+        <w:t>단건</w:t>
+      </w:r>
+      <w:r>
+        <w:t xml:space="preserve"> </w:t>
+      </w:r>
+      <w:r>
+        <w:t>조회</w:t>
+      </w:r>
+      <w:r>
+        <w:t>(</w:t>
+      </w:r>
+      <w:r>
+        <w:t>학생</w:t>
+      </w:r>
+      <w:r>
+        <w:t xml:space="preserve"> 1</w:t>
+      </w:r>
+      <w:r>
+        <w:t>번</w:t>
+      </w:r>
+      <w:r>
+        <w:t>) → 403</w:t>
+      </w:r>
+    </w:p>
+    <w:p>
+      <w:pPr>
+        <w:pBdr>
+          <w:top w:val="single" w:sz="4" w:space="3" w:color="D9D9D9"/>
+          <w:left w:val="single" w:sz="18" w:space="6" w:color="C0C0C0"/>
+          <w:bottom w:val="single" w:sz="4" w:space="3" w:color="D9D9D9"/>
+        </w:pBdr>
+        <w:shd w:val="clear" w:color="auto" w:fill="F4F4F4"/>
+      </w:pPr>
+      <w:r>
+        <w:rPr>
+          <w:rFonts w:ascii="Consolas" w:eastAsia="Consolas" w:hAnsi="Consolas" w:cs="Consolas"/>
+          <w:sz w:val="18"/>
+          <w:szCs w:val="18"/>
+        </w:rPr>
+        <w:t>curl -H "Authorization: Bearer $USER_TOKEN" http://localhost:8080/api/students/1</w:t>
+      </w:r>
+    </w:p>
+    <w:p>
+      <w:pPr>
+        <w:pBdr>
+          <w:top w:val="single" w:sz="4" w:space="3" w:color="D9D9D9"/>
+          <w:left w:val="single" w:sz="18" w:space="6" w:color="C0C0C0"/>
+          <w:bottom w:val="single" w:sz="4" w:space="3" w:color="D9D9D9"/>
+        </w:pBdr>
+        <w:shd w:val="clear" w:color="auto" w:fill="F4F4F4"/>
+      </w:pPr>
+      <w:r>
+        <w:rPr>
+          <w:rFonts w:ascii="Consolas" w:eastAsia="Consolas" w:hAnsi="Consolas" w:cs="Consolas"/>
+          <w:sz w:val="18"/>
+          <w:szCs w:val="18"/>
+        </w:rPr>
+        <w:t>{"statusCode":403,"message":"</w:t>
+      </w:r>
+      <w:r>
+        <w:rPr>
+          <w:rFonts w:ascii="Consolas" w:eastAsia="Consolas" w:hAnsi="Consolas" w:cs="Consolas"/>
+          <w:sz w:val="18"/>
+          <w:szCs w:val="18"/>
+        </w:rPr>
+        <w:t>본인</w:t>
+      </w:r>
+      <w:r>
+        <w:rPr>
+          <w:rFonts w:ascii="Consolas" w:eastAsia="Consolas" w:hAnsi="Consolas" w:cs="Consolas"/>
+          <w:sz w:val="18"/>
+          <w:szCs w:val="18"/>
+        </w:rPr>
+        <w:t xml:space="preserve"> </w:t>
+      </w:r>
+      <w:r>
+        <w:rPr>
+          <w:rFonts w:ascii="Consolas" w:eastAsia="Consolas" w:hAnsi="Consolas" w:cs="Consolas"/>
+          <w:sz w:val="18"/>
+          <w:szCs w:val="18"/>
+        </w:rPr>
+        <w:t>정보만</w:t>
+      </w:r>
+      <w:r>
+        <w:rPr>
+          <w:rFonts w:ascii="Consolas" w:eastAsia="Consolas" w:hAnsi="Consolas" w:cs="Consolas"/>
+          <w:sz w:val="18"/>
+          <w:szCs w:val="18"/>
+        </w:rPr>
+        <w:t xml:space="preserve"> </w:t>
+      </w:r>
+      <w:r>
+        <w:rPr>
+          <w:rFonts w:ascii="Consolas" w:eastAsia="Consolas" w:hAnsi="Consolas" w:cs="Consolas"/>
+          <w:sz w:val="18"/>
+          <w:szCs w:val="18"/>
+        </w:rPr>
+        <w:t>조회할</w:t>
+      </w:r>
+      <w:r>
+        <w:rPr>
+          <w:rFonts w:ascii="Consolas" w:eastAsia="Consolas" w:hAnsi="Consolas" w:cs="Consolas"/>
+          <w:sz w:val="18"/>
+          <w:szCs w:val="18"/>
+        </w:rPr>
+        <w:t xml:space="preserve"> </w:t>
+      </w:r>
+      <w:r>
+        <w:rPr>
+          <w:rFonts w:ascii="Consolas" w:eastAsia="Consolas" w:hAnsi="Consolas" w:cs="Consolas"/>
+          <w:sz w:val="18"/>
+          <w:szCs w:val="18"/>
+        </w:rPr>
+        <w:t>수</w:t>
+      </w:r>
+      <w:r>
+        <w:rPr>
+          <w:rFonts w:ascii="Consolas" w:eastAsia="Consolas" w:hAnsi="Consolas" w:cs="Consolas"/>
+          <w:sz w:val="18"/>
+          <w:szCs w:val="18"/>
+        </w:rPr>
+        <w:t xml:space="preserve"> </w:t>
+      </w:r>
+      <w:r>
+        <w:rPr>
+          <w:rFonts w:ascii="Consolas" w:eastAsia="Consolas" w:hAnsi="Consolas" w:cs="Consolas"/>
+          <w:sz w:val="18"/>
+          <w:szCs w:val="18"/>
+        </w:rPr>
+        <w:t>있습니다</w:t>
+      </w:r>
+      <w:r>
+        <w:rPr>
+          <w:rFonts w:ascii="Consolas" w:eastAsia="Consolas" w:hAnsi="Consolas" w:cs="Consolas"/>
+          <w:sz w:val="18"/>
+          <w:szCs w:val="18"/>
+        </w:rPr>
+        <w:t>", ...}</w:t>
+      </w:r>
+    </w:p>
+    <w:p>
+      <w:pPr>
+        <w:spacing w:after="100" w:line="276" w:lineRule="auto"/>
+      </w:pPr>
+      <w:r>
+        <w:t>본인 소유 계정(cs001@aa.com, 1번 학생 Alice의 소유자)으로 로그인한다.</w:t>
+      </w:r>
+    </w:p>
+    <w:p>
+      <w:pPr>
+        <w:pBdr>
+          <w:top w:val="single" w:sz="4" w:space="3" w:color="D9D9D9"/>
+          <w:left w:val="single" w:sz="18" w:space="6" w:color="C0C0C0"/>
+        </w:pBdr>
+        <w:shd w:val="clear" w:color="auto" w:fill="F4F4F4"/>
+      </w:pPr>
+      <w:r>
+        <w:rPr>
+          <w:rFonts w:ascii="Consolas" w:eastAsia="Consolas" w:hAnsi="Consolas" w:cs="Consolas"/>
+          <w:sz w:val="18"/>
+          <w:szCs w:val="18"/>
+        </w:rPr>
+        <w:t>TOKEN=$(curl -s -X POST http://localhost:8080/api/userinfos/login \</w:t>
+      </w:r>
+    </w:p>
+    <w:p>
+      <w:pPr>
+        <w:pBdr>
+          <w:left w:val="single" w:sz="18" w:space="6" w:color="C0C0C0"/>
+        </w:pBdr>
+        <w:shd w:val="clear" w:color="auto" w:fill="F4F4F4"/>
+      </w:pPr>
+      <w:r>
+        <w:rPr>
+          <w:rFonts w:ascii="Consolas" w:eastAsia="Consolas" w:hAnsi="Consolas" w:cs="Consolas"/>
+          <w:sz w:val="18"/>
+          <w:szCs w:val="18"/>
+        </w:rPr>
+        <w:t xml:space="preserve">  -H "Content-Type: application/json" \</w:t>
+      </w:r>
+    </w:p>
+    <w:p>
+      <w:pPr>
+        <w:pBdr>
+          <w:left w:val="single" w:sz="18" w:space="6" w:color="C0C0C0"/>
+        </w:pBdr>
+        <w:shd w:val="clear" w:color="auto" w:fill="F4F4F4"/>
+      </w:pPr>
+      <w:r>
+        <w:rPr>
+          <w:rFonts w:ascii="Consolas" w:eastAsia="Consolas" w:hAnsi="Consolas" w:cs="Consolas"/>
+          <w:sz w:val="18"/>
+          <w:szCs w:val="18"/>
+        </w:rPr>
+        <w:t xml:space="preserve">  -d '{"email":"cs001@aa.com","password":"pwd1234"}' \</w:t>
+      </w:r>
+    </w:p>
+    <w:p>
+      <w:pPr>
+        <w:pBdr>
+          <w:left w:val="single" w:sz="18" w:space="6" w:color="C0C0C0"/>
+          <w:bottom w:val="single" w:sz="4" w:space="3" w:color="D9D9D9"/>
+        </w:pBdr>
+        <w:shd w:val="clear" w:color="auto" w:fill="F4F4F4"/>
+      </w:pPr>
+      <w:r>
+        <w:rPr>
+          <w:rFonts w:ascii="Consolas" w:eastAsia="Consolas" w:hAnsi="Consolas" w:cs="Consolas"/>
+          <w:sz w:val="18"/>
+          <w:szCs w:val="18"/>
+        </w:rPr>
+        <w:t xml:space="preserve">  | sed -n 's/.*"accessToken":"\([^"]*\)".*/\1/p')</w:t>
+      </w:r>
+    </w:p>
+    <w:p>
+      <w:pPr>
+        <w:spacing w:after="100" w:line="276" w:lineRule="auto"/>
+      </w:pPr>
+      <w:r>
+        <w:t>본인 학생(1번) 조회 → 200</w:t>
+      </w:r>
+    </w:p>
+    <w:p>
+      <w:pPr>
+        <w:pBdr>
+          <w:top w:val="single" w:sz="4" w:space="3" w:color="D9D9D9"/>
+          <w:left w:val="single" w:sz="18" w:space="6" w:color="C0C0C0"/>
+          <w:bottom w:val="single" w:sz="4" w:space="3" w:color="D9D9D9"/>
+        </w:pBdr>
+        <w:shd w:val="clear" w:color="auto" w:fill="F4F4F4"/>
+      </w:pPr>
+      <w:r>
+        <w:rPr>
+          <w:rFonts w:ascii="Consolas" w:eastAsia="Consolas" w:hAnsi="Consolas" w:cs="Consolas"/>
+          <w:sz w:val="18"/>
+          <w:szCs w:val="18"/>
+        </w:rPr>
+        <w:lastRenderedPageBreak/>
+        <w:t>curl -H "Authorization: Bearer $TOKEN" http://localhost:8080/api/students/1</w:t>
+      </w:r>
+    </w:p>
+    <w:p>
+      <w:pPr>
+        <w:pBdr>
+          <w:top w:val="single" w:sz="4" w:space="3" w:color="D9D9D9"/>
+          <w:left w:val="single" w:sz="18" w:space="6" w:color="C0C0C0"/>
+          <w:bottom w:val="single" w:sz="4" w:space="3" w:color="D9D9D9"/>
+        </w:pBdr>
+        <w:shd w:val="clear" w:color="auto" w:fill="F4F4F4"/>
+      </w:pPr>
+      <w:r>
+        <w:rPr>
+          <w:rFonts w:ascii="Consolas" w:eastAsia="Consolas" w:hAnsi="Consolas" w:cs="Consolas"/>
+          <w:sz w:val="18"/>
+          <w:szCs w:val="18"/>
+        </w:rPr>
+        <w:t>{"id":1,"name":"Alice Johnson","studentNumber":"CS001","department":{"id":1,"name":"Computer Science","code":"CS"},"detail":{"id":1,"address":"123 Tech Street","phoneNumber":"010-1234-5678","email":"alice@example.com","dateOfBirth":"1998-03-15"}}</w:t>
+      </w:r>
+    </w:p>
+    <w:p>
+      <w:pPr>
+        <w:spacing w:after="100" w:line="276" w:lineRule="auto"/>
+      </w:pPr>
+      <w:r>
+        <w:t>타인 학생(2번, Bob) 조회 → 403</w:t>
+      </w:r>
+    </w:p>
+    <w:p>
+      <w:pPr>
+        <w:pBdr>
+          <w:top w:val="single" w:sz="4" w:space="3" w:color="D9D9D9"/>
+          <w:left w:val="single" w:sz="18" w:space="6" w:color="C0C0C0"/>
+          <w:bottom w:val="single" w:sz="4" w:space="3" w:color="D9D9D9"/>
+        </w:pBdr>
+        <w:shd w:val="clear" w:color="auto" w:fill="F4F4F4"/>
+      </w:pPr>
+      <w:r>
+        <w:rPr>
+          <w:rFonts w:ascii="Consolas" w:eastAsia="Consolas" w:hAnsi="Consolas" w:cs="Consolas"/>
+          <w:sz w:val="18"/>
+          <w:szCs w:val="18"/>
+        </w:rPr>
+        <w:t>curl -H "Authorization: Bearer $TOKEN" http://localhost:8080/api/students/2</w:t>
+      </w:r>
+    </w:p>
+    <w:p>
+      <w:pPr>
+        <w:pBdr>
+          <w:top w:val="single" w:sz="4" w:space="3" w:color="D9D9D9"/>
+          <w:left w:val="single" w:sz="18" w:space="6" w:color="C0C0C0"/>
+          <w:bottom w:val="single" w:sz="4" w:space="3" w:color="D9D9D9"/>
+        </w:pBdr>
+        <w:shd w:val="clear" w:color="auto" w:fill="F4F4F4"/>
+      </w:pPr>
+      <w:r>
+        <w:rPr>
+          <w:rFonts w:ascii="Consolas" w:eastAsia="Consolas" w:hAnsi="Consolas" w:cs="Consolas"/>
+          <w:sz w:val="18"/>
+          <w:szCs w:val="18"/>
+        </w:rPr>
+        <w:t>{"statusCode":403,"message":"본인 정보만 조회할 수 있습니다", ...}</w:t>
+      </w:r>
+    </w:p>
+    <w:p>
+      <w:pPr>
+        <w:spacing w:after="100" w:line="276" w:lineRule="auto"/>
+      </w:pPr>
+      <w:r>
+        <w:rPr>
+          <w:b/>
+          <w:bCs/>
+        </w:rPr>
+        <w:t xml:space="preserve">참고: </w:t>
+      </w:r>
+      <w:r>
+        <w:t>자신의 학생이 없는 일반 사용자(user@aa.com)로 로그인</w:t>
+      </w:r>
+      <w:r>
+        <w:rPr>
+          <w:rFonts w:hint="eastAsia"/>
+        </w:rPr>
+        <w:t xml:space="preserve"> </w:t>
+      </w:r>
+      <w:r>
+        <w:t>하면 1번이든 2번이든 모두 403이다.</w:t>
+      </w:r>
+    </w:p>
+    <w:p>
+      <w:pPr>
+        <w:pStyle w:val="3"/>
+        <w:spacing w:before="200" w:after="90"/>
+      </w:pPr>
+      <w:r>
+        <w:rPr>
+          <w:b/>
+          <w:bCs/>
+          <w:color w:val="2E5496"/>
+        </w:rPr>
+        <w:t>실습</w:t>
+      </w:r>
+      <w:r>
+        <w:rPr>
+          <w:b/>
+          <w:bCs/>
+          <w:color w:val="2E5496"/>
+        </w:rPr>
+        <w:t xml:space="preserve">: </w:t>
+      </w:r>
+      <w:r>
+        <w:rPr>
+          <w:b/>
+          <w:bCs/>
+          <w:color w:val="2E5496"/>
+        </w:rPr>
+        <w:t>수정</w:t>
+      </w:r>
+      <w:r>
+        <w:rPr>
+          <w:b/>
+          <w:bCs/>
+          <w:color w:val="2E5496"/>
+        </w:rPr>
+        <w:t>(PUT)</w:t>
+      </w:r>
+      <w:r>
+        <w:rPr>
+          <w:b/>
+          <w:bCs/>
+          <w:color w:val="2E5496"/>
+        </w:rPr>
+        <w:t>도</w:t>
+      </w:r>
+      <w:r>
+        <w:rPr>
+          <w:b/>
+          <w:bCs/>
+          <w:color w:val="2E5496"/>
+        </w:rPr>
+        <w:t xml:space="preserve"> </w:t>
+      </w:r>
+      <w:r>
+        <w:rPr>
+          <w:b/>
+          <w:bCs/>
+          <w:color w:val="2E5496"/>
+        </w:rPr>
+        <w:t>소유자만</w:t>
+      </w:r>
+      <w:r>
+        <w:rPr>
+          <w:b/>
+          <w:bCs/>
+          <w:color w:val="2E5496"/>
+        </w:rPr>
+        <w:t xml:space="preserve"> </w:t>
+      </w:r>
+      <w:r>
+        <w:rPr>
+          <w:b/>
+          <w:bCs/>
+          <w:color w:val="2E5496"/>
+        </w:rPr>
+        <w:t>가능</w:t>
+      </w:r>
+    </w:p>
+    <w:p>
+      <w:pPr>
+        <w:spacing w:after="100" w:line="276" w:lineRule="auto"/>
+      </w:pPr>
+      <w:r>
+        <w:t>단건</w:t>
+      </w:r>
+      <w:r>
+        <w:t xml:space="preserve"> </w:t>
+      </w:r>
+      <w:r>
+        <w:t>조회뿐</w:t>
+      </w:r>
+      <w:r>
+        <w:t xml:space="preserve"> </w:t>
+      </w:r>
+      <w:r>
+        <w:t>아니라</w:t>
+      </w:r>
+      <w:r>
+        <w:t xml:space="preserve"> </w:t>
+      </w:r>
+      <w:r>
+        <w:t>수정</w:t>
+      </w:r>
+      <w:r>
+        <w:t>(PUT /api/students/{id})</w:t>
+      </w:r>
+      <w:r>
+        <w:t>도</w:t>
+      </w:r>
+      <w:r>
+        <w:t xml:space="preserve"> updateStudent() </w:t>
+      </w:r>
+      <w:r>
+        <w:t>에서</w:t>
+      </w:r>
+      <w:r>
+        <w:t xml:space="preserve"> </w:t>
+      </w:r>
+      <w:r>
+        <w:t>동일하게</w:t>
+      </w:r>
+      <w:r>
+        <w:t xml:space="preserve"> </w:t>
+      </w:r>
+      <w:r>
+        <w:t>소유권을</w:t>
+      </w:r>
+      <w:r>
+        <w:t xml:space="preserve"> </w:t>
+      </w:r>
+      <w:r>
+        <w:t>검사한다</w:t>
       </w:r>
       <w:r>
         <w:t>.</w:t>
+      </w:r>
+    </w:p>
+    <w:p>
+      <w:pPr>
+        <w:spacing w:after="100" w:line="276" w:lineRule="auto"/>
+      </w:pPr>
+      <w:r>
+        <w:t xml:space="preserve">(1) </w:t>
+      </w:r>
+      <w:r>
+        <w:t>소유자</w:t>
+      </w:r>
+      <w:r>
+        <w:t xml:space="preserve"> </w:t>
+      </w:r>
+      <w:r>
+        <w:t>계정</w:t>
+      </w:r>
+      <w:r>
+        <w:t>(cs001@aa.com)</w:t>
+      </w:r>
+      <w:r>
+        <w:t>으로</w:t>
+      </w:r>
+      <w:r>
+        <w:t xml:space="preserve"> </w:t>
+      </w:r>
+      <w:r>
+        <w:t>본인</w:t>
+      </w:r>
+      <w:r>
+        <w:t xml:space="preserve"> </w:t>
+      </w:r>
+      <w:r>
+        <w:t>학생</w:t>
+      </w:r>
+      <w:r>
+        <w:t>(1</w:t>
+      </w:r>
+      <w:r>
+        <w:t>번</w:t>
+      </w:r>
+      <w:r>
+        <w:t xml:space="preserve">) </w:t>
+      </w:r>
+      <w:r>
+        <w:t>수정</w:t>
+      </w:r>
+      <w:r>
+        <w:t xml:space="preserve"> → 200</w:t>
+      </w:r>
+    </w:p>
+    <w:p>
+      <w:pPr>
+        <w:pBdr>
+          <w:top w:val="single" w:sz="4" w:space="3" w:color="D9D9D9"/>
+          <w:left w:val="single" w:sz="18" w:space="6" w:color="C0C0C0"/>
+        </w:pBdr>
+        <w:shd w:val="clear" w:color="auto" w:fill="F4F4F4"/>
+      </w:pPr>
+      <w:r>
+        <w:rPr>
+          <w:rFonts w:ascii="Consolas" w:eastAsia="Consolas" w:hAnsi="Consolas" w:cs="Consolas"/>
+          <w:sz w:val="18"/>
+          <w:szCs w:val="18"/>
+        </w:rPr>
+        <w:t>OWNER_TOKEN=$(curl -s -X POST http://localhost:8080/api/userinfos/login \</w:t>
+      </w:r>
+    </w:p>
+    <w:p>
+      <w:pPr>
+        <w:pBdr>
+          <w:left w:val="single" w:sz="18" w:space="6" w:color="C0C0C0"/>
+        </w:pBdr>
+        <w:shd w:val="clear" w:color="auto" w:fill="F4F4F4"/>
+      </w:pPr>
+      <w:r>
+        <w:rPr>
+          <w:rFonts w:ascii="Consolas" w:eastAsia="Consolas" w:hAnsi="Consolas" w:cs="Consolas"/>
+          <w:sz w:val="18"/>
+          <w:szCs w:val="18"/>
+        </w:rPr>
+        <w:t xml:space="preserve">  -H "Content-Type: application/json" \</w:t>
+      </w:r>
+    </w:p>
+    <w:p>
+      <w:pPr>
+        <w:pBdr>
+          <w:left w:val="single" w:sz="18" w:space="6" w:color="C0C0C0"/>
+        </w:pBdr>
+        <w:shd w:val="clear" w:color="auto" w:fill="F4F4F4"/>
+      </w:pPr>
+      <w:r>
+        <w:rPr>
+          <w:rFonts w:ascii="Consolas" w:eastAsia="Consolas" w:hAnsi="Consolas" w:cs="Consolas"/>
+          <w:sz w:val="18"/>
+          <w:szCs w:val="18"/>
+        </w:rPr>
+        <w:t xml:space="preserve">  -d '{"email":"cs001@aa.com","password":"pwd1234"}' \</w:t>
+      </w:r>
+    </w:p>
+    <w:p>
+      <w:pPr>
+        <w:pBdr>
+          <w:left w:val="single" w:sz="18" w:space="6" w:color="C0C0C0"/>
+          <w:bottom w:val="single" w:sz="4" w:space="3" w:color="D9D9D9"/>
+        </w:pBdr>
+        <w:shd w:val="clear" w:color="auto" w:fill="F4F4F4"/>
+      </w:pPr>
+      <w:r>
+        <w:rPr>
+          <w:rFonts w:ascii="Consolas" w:eastAsia="Consolas" w:hAnsi="Consolas" w:cs="Consolas"/>
+          <w:sz w:val="18"/>
+          <w:szCs w:val="18"/>
+        </w:rPr>
+        <w:t xml:space="preserve">  | sed -n 's/.*"accessToken":"\([^"]*\)".*/\1/p')</w:t>
+      </w:r>
+    </w:p>
+    <w:p>
+      <w:pPr>
+        <w:pBdr>
+          <w:top w:val="single" w:sz="4" w:space="3" w:color="D9D9D9"/>
+          <w:left w:val="single" w:sz="18" w:space="6" w:color="C0C0C0"/>
+        </w:pBdr>
+        <w:shd w:val="clear" w:color="auto" w:fill="F4F4F4"/>
+      </w:pPr>
+      <w:r>
+        <w:rPr>
+          <w:rFonts w:ascii="Consolas" w:eastAsia="Consolas" w:hAnsi="Consolas" w:cs="Consolas"/>
+          <w:sz w:val="18"/>
+          <w:szCs w:val="18"/>
+        </w:rPr>
+        <w:t>curl -X PUT -H "Authorization: Bearer $OWNER_TOKEN" -H "Content-Type: application/json" \</w:t>
+      </w:r>
+    </w:p>
+    <w:p>
+      <w:pPr>
+        <w:pBdr>
+          <w:left w:val="single" w:sz="18" w:space="6" w:color="C0C0C0"/>
+        </w:pBdr>
+        <w:shd w:val="clear" w:color="auto" w:fill="F4F4F4"/>
+      </w:pPr>
+      <w:r>
+        <w:rPr>
+          <w:rFonts w:ascii="Consolas" w:eastAsia="Consolas" w:hAnsi="Consolas" w:cs="Consolas"/>
+          <w:sz w:val="18"/>
+          <w:szCs w:val="18"/>
+        </w:rPr>
+        <w:t xml:space="preserve">  -d '{"name":"Alice Johnson","stude</w:t>
+      </w:r>
+      <w:r>
+        <w:rPr>
+          <w:rFonts w:ascii="Consolas" w:eastAsia="Consolas" w:hAnsi="Consolas" w:cs="Consolas"/>
+          <w:sz w:val="18"/>
+          <w:szCs w:val="18"/>
+        </w:rPr>
+        <w:t>ntNumber":"CS001","departmentId":1,</w:t>
+      </w:r>
+    </w:p>
+    <w:p>
+      <w:pPr>
+        <w:pBdr>
+          <w:left w:val="single" w:sz="18" w:space="6" w:color="C0C0C0"/>
+        </w:pBdr>
+        <w:shd w:val="clear" w:color="auto" w:fill="F4F4F4"/>
+      </w:pPr>
+      <w:r>
+        <w:rPr>
+          <w:rFonts w:ascii="Consolas" w:eastAsia="Consolas" w:hAnsi="Consolas" w:cs="Consolas"/>
+          <w:sz w:val="18"/>
+          <w:szCs w:val="18"/>
+        </w:rPr>
+        <w:t xml:space="preserve">       "detailRequest":{"address":"123 Tech Street","phoneNumber":"010-1234-5678",</w:t>
+      </w:r>
+    </w:p>
+    <w:p>
+      <w:pPr>
+        <w:pBdr>
+          <w:left w:val="single" w:sz="18" w:space="6" w:color="C0C0C0"/>
+        </w:pBdr>
+        <w:shd w:val="clear" w:color="auto" w:fill="F4F4F4"/>
+      </w:pPr>
+      <w:r>
+        <w:rPr>
+          <w:rFonts w:ascii="Consolas" w:eastAsia="Consolas" w:hAnsi="Consolas" w:cs="Consolas"/>
+          <w:sz w:val="18"/>
+          <w:szCs w:val="18"/>
+        </w:rPr>
+        <w:t xml:space="preserve">                         "email":"alice@example.com","dateOfBirth":"1998-03-15"}}' \</w:t>
+      </w:r>
+    </w:p>
+    <w:p>
+      <w:pPr>
+        <w:pBdr>
+          <w:left w:val="single" w:sz="18" w:space="6" w:color="C0C0C0"/>
+          <w:bottom w:val="single" w:sz="4" w:space="3" w:color="D9D9D9"/>
+        </w:pBdr>
+        <w:shd w:val="clear" w:color="auto" w:fill="F4F4F4"/>
+      </w:pPr>
+      <w:r>
+        <w:rPr>
+          <w:rFonts w:ascii="Consolas" w:eastAsia="Consolas" w:hAnsi="Consolas" w:cs="Consolas"/>
+          <w:sz w:val="18"/>
+          <w:szCs w:val="18"/>
+        </w:rPr>
+        <w:t xml:space="preserve">  http://localhost:8080/api/students/1</w:t>
+      </w:r>
+    </w:p>
+    <w:p>
+      <w:pPr>
+        <w:pBdr>
+          <w:top w:val="single" w:sz="4" w:space="3" w:color="D9D9D9"/>
+          <w:left w:val="single" w:sz="18" w:space="6" w:color="C0C0C0"/>
+          <w:bottom w:val="single" w:sz="4" w:space="3" w:color="D9D9D9"/>
+        </w:pBdr>
+        <w:shd w:val="clear" w:color="auto" w:fill="F4F4F4"/>
+      </w:pPr>
+      <w:r>
+        <w:rPr>
+          <w:rFonts w:ascii="Consolas" w:eastAsia="Consolas" w:hAnsi="Consolas" w:cs="Consolas"/>
+          <w:sz w:val="18"/>
+          <w:szCs w:val="18"/>
+        </w:rPr>
+        <w:t>HTTP 200  (</w:t>
+      </w:r>
+      <w:r>
+        <w:rPr>
+          <w:rFonts w:ascii="Consolas" w:eastAsia="Consolas" w:hAnsi="Consolas" w:cs="Consolas"/>
+          <w:sz w:val="18"/>
+          <w:szCs w:val="18"/>
+        </w:rPr>
+        <w:t>본인</w:t>
+      </w:r>
+      <w:r>
+        <w:rPr>
+          <w:rFonts w:ascii="Consolas" w:eastAsia="Consolas" w:hAnsi="Consolas" w:cs="Consolas"/>
+          <w:sz w:val="18"/>
+          <w:szCs w:val="18"/>
+        </w:rPr>
+        <w:t xml:space="preserve"> </w:t>
+      </w:r>
+      <w:r>
+        <w:rPr>
+          <w:rFonts w:ascii="Consolas" w:eastAsia="Consolas" w:hAnsi="Consolas" w:cs="Consolas"/>
+          <w:sz w:val="18"/>
+          <w:szCs w:val="18"/>
+        </w:rPr>
+        <w:t>소유</w:t>
+      </w:r>
+      <w:r>
+        <w:rPr>
+          <w:rFonts w:ascii="Consolas" w:eastAsia="Consolas" w:hAnsi="Consolas" w:cs="Consolas"/>
+          <w:sz w:val="18"/>
+          <w:szCs w:val="18"/>
+        </w:rPr>
+        <w:t xml:space="preserve"> </w:t>
+      </w:r>
+      <w:r>
+        <w:rPr>
+          <w:rFonts w:ascii="Consolas" w:eastAsia="Consolas" w:hAnsi="Consolas" w:cs="Consolas"/>
+          <w:sz w:val="18"/>
+          <w:szCs w:val="18"/>
+        </w:rPr>
+        <w:t>학생이라</w:t>
+      </w:r>
+      <w:r>
+        <w:rPr>
+          <w:rFonts w:ascii="Consolas" w:eastAsia="Consolas" w:hAnsi="Consolas" w:cs="Consolas"/>
+          <w:sz w:val="18"/>
+          <w:szCs w:val="18"/>
+        </w:rPr>
+        <w:t xml:space="preserve"> </w:t>
+      </w:r>
+      <w:r>
+        <w:rPr>
+          <w:rFonts w:ascii="Consolas" w:eastAsia="Consolas" w:hAnsi="Consolas" w:cs="Consolas"/>
+          <w:sz w:val="18"/>
+          <w:szCs w:val="18"/>
+        </w:rPr>
+        <w:t>정상</w:t>
+      </w:r>
+      <w:r>
+        <w:rPr>
+          <w:rFonts w:ascii="Consolas" w:eastAsia="Consolas" w:hAnsi="Consolas" w:cs="Consolas"/>
+          <w:sz w:val="18"/>
+          <w:szCs w:val="18"/>
+        </w:rPr>
+        <w:t xml:space="preserve"> </w:t>
+      </w:r>
+      <w:r>
+        <w:rPr>
+          <w:rFonts w:ascii="Consolas" w:eastAsia="Consolas" w:hAnsi="Consolas" w:cs="Consolas"/>
+          <w:sz w:val="18"/>
+          <w:szCs w:val="18"/>
+        </w:rPr>
+        <w:t>수정된다</w:t>
+      </w:r>
+      <w:r>
+        <w:rPr>
+          <w:rFonts w:ascii="Consolas" w:eastAsia="Consolas" w:hAnsi="Consolas" w:cs="Consolas"/>
+          <w:sz w:val="18"/>
+          <w:szCs w:val="18"/>
+        </w:rPr>
+        <w:t>)</w:t>
+      </w:r>
+    </w:p>
+    <w:p>
+      <w:pPr>
+        <w:spacing w:after="100" w:line="276" w:lineRule="auto"/>
+      </w:pPr>
+      <w:r>
+        <w:t xml:space="preserve">(2) </w:t>
+      </w:r>
+      <w:r>
+        <w:t>비소유자</w:t>
+      </w:r>
+      <w:r>
+        <w:t xml:space="preserve"> </w:t>
+      </w:r>
+      <w:r>
+        <w:t>계정</w:t>
+      </w:r>
+      <w:r>
+        <w:t>(cs002@aa.com, 2</w:t>
+      </w:r>
+      <w:r>
+        <w:t>번</w:t>
+      </w:r>
+      <w:r>
+        <w:t xml:space="preserve"> </w:t>
+      </w:r>
+      <w:r>
+        <w:t>학생</w:t>
+      </w:r>
+      <w:r>
+        <w:t xml:space="preserve"> Bob</w:t>
+      </w:r>
+      <w:r>
+        <w:t>의</w:t>
+      </w:r>
+      <w:r>
+        <w:t xml:space="preserve"> </w:t>
+      </w:r>
+      <w:r>
+        <w:t>소유자</w:t>
+      </w:r>
+      <w:r>
+        <w:t>)</w:t>
+      </w:r>
+      <w:r>
+        <w:t>으로</w:t>
+      </w:r>
+      <w:r>
+        <w:t xml:space="preserve"> 1</w:t>
+      </w:r>
+      <w:r>
+        <w:t>번</w:t>
+      </w:r>
+      <w:r>
+        <w:t xml:space="preserve"> </w:t>
+      </w:r>
+      <w:r>
+        <w:t>학생</w:t>
+      </w:r>
+      <w:r>
+        <w:t xml:space="preserve">(Alice) </w:t>
+      </w:r>
+      <w:r>
+        <w:t>수정</w:t>
+      </w:r>
+      <w:r>
+        <w:t xml:space="preserve"> </w:t>
+      </w:r>
+      <w:r>
+        <w:t>시도</w:t>
+      </w:r>
+      <w:r>
+        <w:t xml:space="preserve"> → 403</w:t>
+      </w:r>
+    </w:p>
+    <w:p>
+      <w:pPr>
+        <w:pBdr>
+          <w:top w:val="single" w:sz="4" w:space="3" w:color="D9D9D9"/>
+          <w:left w:val="single" w:sz="18" w:space="6" w:color="C0C0C0"/>
+        </w:pBdr>
+        <w:shd w:val="clear" w:color="auto" w:fill="F4F4F4"/>
+      </w:pPr>
+      <w:r>
+        <w:rPr>
+          <w:rFonts w:ascii="Consolas" w:eastAsia="Consolas" w:hAnsi="Consolas" w:cs="Consolas"/>
+          <w:sz w:val="18"/>
+          <w:szCs w:val="18"/>
+        </w:rPr>
+        <w:t>OTHER_TOKEN=$(curl -s -X POST http://localhost:8080/api/userinfos/login \</w:t>
+      </w:r>
+    </w:p>
+    <w:p>
+      <w:pPr>
+        <w:pBdr>
+          <w:left w:val="single" w:sz="18" w:space="6" w:color="C0C0C0"/>
+        </w:pBdr>
+        <w:shd w:val="clear" w:color="auto" w:fill="F4F4F4"/>
+      </w:pPr>
+      <w:r>
+        <w:rPr>
+          <w:rFonts w:ascii="Consolas" w:eastAsia="Consolas" w:hAnsi="Consolas" w:cs="Consolas"/>
+          <w:sz w:val="18"/>
+          <w:szCs w:val="18"/>
+        </w:rPr>
+        <w:t xml:space="preserve">  -H "Content-Type: application/json" \</w:t>
+      </w:r>
+    </w:p>
+    <w:p>
+      <w:pPr>
+        <w:pBdr>
+          <w:left w:val="single" w:sz="18" w:space="6" w:color="C0C0C0"/>
+        </w:pBdr>
+        <w:shd w:val="clear" w:color="auto" w:fill="F4F4F4"/>
+      </w:pPr>
+      <w:r>
+        <w:rPr>
+          <w:rFonts w:ascii="Consolas" w:eastAsia="Consolas" w:hAnsi="Consolas" w:cs="Consolas"/>
+          <w:sz w:val="18"/>
+          <w:szCs w:val="18"/>
+        </w:rPr>
+        <w:t xml:space="preserve">  -d '{"email":"cs002@aa.com","password":"pwd1234"}' \</w:t>
+      </w:r>
+    </w:p>
+    <w:p>
+      <w:pPr>
+        <w:pBdr>
+          <w:left w:val="single" w:sz="18" w:space="6" w:color="C0C0C0"/>
+          <w:bottom w:val="single" w:sz="4" w:space="3" w:color="D9D9D9"/>
+        </w:pBdr>
+        <w:shd w:val="clear" w:color="auto" w:fill="F4F4F4"/>
+      </w:pPr>
+      <w:r>
+        <w:rPr>
+          <w:rFonts w:ascii="Consolas" w:eastAsia="Consolas" w:hAnsi="Consolas" w:cs="Consolas"/>
+          <w:sz w:val="18"/>
+          <w:szCs w:val="18"/>
+        </w:rPr>
+        <w:t xml:space="preserve">  | sed -n 's/.*"accessToken":"\([^"]*\)".*/\1/p')</w:t>
+      </w:r>
+    </w:p>
+    <w:p>
+      <w:pPr>
+        <w:pBdr>
+          <w:top w:val="single" w:sz="4" w:space="3" w:color="D9D9D9"/>
+          <w:left w:val="single" w:sz="18" w:space="6" w:color="C0C0C0"/>
+          <w:bottom w:val="single" w:sz="4" w:space="3" w:color="D9D9D9"/>
+        </w:pBdr>
+        <w:shd w:val="clear" w:color="auto" w:fill="F4F4F4"/>
+      </w:pPr>
+      <w:r>
+        <w:rPr>
+          <w:rFonts w:ascii="Consolas" w:eastAsia="Consolas" w:hAnsi="Consolas" w:cs="Consolas"/>
+          <w:sz w:val="18"/>
+          <w:szCs w:val="18"/>
+        </w:rPr>
+        <w:t>curl -X PUT -H "Authorization: Bearer $OTHER_TOKEN" ... http://localhost:8080/api/students/1</w:t>
+      </w:r>
+    </w:p>
+    <w:p>
+      <w:pPr>
+        <w:pBdr>
+          <w:top w:val="single" w:sz="4" w:space="3" w:color="D9D9D9"/>
+          <w:left w:val="single" w:sz="18" w:space="6" w:color="C0C0C0"/>
+          <w:bottom w:val="single" w:sz="4" w:space="3" w:color="D9D9D9"/>
+        </w:pBdr>
+        <w:shd w:val="clear" w:color="auto" w:fill="F4F4F4"/>
+      </w:pPr>
+      <w:r>
+        <w:rPr>
+          <w:rFonts w:ascii="Consolas" w:eastAsia="Consolas" w:hAnsi="Consolas" w:cs="Consolas"/>
+          <w:sz w:val="18"/>
+          <w:szCs w:val="18"/>
+        </w:rPr>
+        <w:t>{"statusCode":403,"message":"</w:t>
+      </w:r>
+      <w:r>
+        <w:rPr>
+          <w:rFonts w:ascii="Consolas" w:eastAsia="Consolas" w:hAnsi="Consolas" w:cs="Consolas"/>
+          <w:sz w:val="18"/>
+          <w:szCs w:val="18"/>
+        </w:rPr>
+        <w:t>본인이</w:t>
+      </w:r>
+      <w:r>
+        <w:rPr>
+          <w:rFonts w:ascii="Consolas" w:eastAsia="Consolas" w:hAnsi="Consolas" w:cs="Consolas"/>
+          <w:sz w:val="18"/>
+          <w:szCs w:val="18"/>
+        </w:rPr>
+        <w:t xml:space="preserve"> </w:t>
+      </w:r>
+      <w:r>
+        <w:rPr>
+          <w:rFonts w:ascii="Consolas" w:eastAsia="Consolas" w:hAnsi="Consolas" w:cs="Consolas"/>
+          <w:sz w:val="18"/>
+          <w:szCs w:val="18"/>
+        </w:rPr>
+        <w:t>등록한</w:t>
+      </w:r>
+      <w:r>
+        <w:rPr>
+          <w:rFonts w:ascii="Consolas" w:eastAsia="Consolas" w:hAnsi="Consolas" w:cs="Consolas"/>
+          <w:sz w:val="18"/>
+          <w:szCs w:val="18"/>
+        </w:rPr>
+        <w:t xml:space="preserve"> </w:t>
+      </w:r>
+      <w:r>
+        <w:rPr>
+          <w:rFonts w:ascii="Consolas" w:eastAsia="Consolas" w:hAnsi="Consolas" w:cs="Consolas"/>
+          <w:sz w:val="18"/>
+          <w:szCs w:val="18"/>
+        </w:rPr>
+        <w:t>학생</w:t>
+      </w:r>
+      <w:r>
+        <w:rPr>
+          <w:rFonts w:ascii="Consolas" w:eastAsia="Consolas" w:hAnsi="Consolas" w:cs="Consolas"/>
+          <w:sz w:val="18"/>
+          <w:szCs w:val="18"/>
+        </w:rPr>
+        <w:t xml:space="preserve"> </w:t>
+      </w:r>
+      <w:r>
+        <w:rPr>
+          <w:rFonts w:ascii="Consolas" w:eastAsia="Consolas" w:hAnsi="Consolas" w:cs="Consolas"/>
+          <w:sz w:val="18"/>
+          <w:szCs w:val="18"/>
+        </w:rPr>
+        <w:t>정보만</w:t>
+      </w:r>
+      <w:r>
+        <w:rPr>
+          <w:rFonts w:ascii="Consolas" w:eastAsia="Consolas" w:hAnsi="Consolas" w:cs="Consolas"/>
+          <w:sz w:val="18"/>
+          <w:szCs w:val="18"/>
+        </w:rPr>
+        <w:t xml:space="preserve"> </w:t>
+      </w:r>
+      <w:r>
+        <w:rPr>
+          <w:rFonts w:ascii="Consolas" w:eastAsia="Consolas" w:hAnsi="Consolas" w:cs="Consolas"/>
+          <w:sz w:val="18"/>
+          <w:szCs w:val="18"/>
+        </w:rPr>
+        <w:t>수정할</w:t>
+      </w:r>
+      <w:r>
+        <w:rPr>
+          <w:rFonts w:ascii="Consolas" w:eastAsia="Consolas" w:hAnsi="Consolas" w:cs="Consolas"/>
+          <w:sz w:val="18"/>
+          <w:szCs w:val="18"/>
+        </w:rPr>
+        <w:t xml:space="preserve"> </w:t>
+      </w:r>
+      <w:r>
+        <w:rPr>
+          <w:rFonts w:ascii="Consolas" w:eastAsia="Consolas" w:hAnsi="Consolas" w:cs="Consolas"/>
+          <w:sz w:val="18"/>
+          <w:szCs w:val="18"/>
+        </w:rPr>
+        <w:t>수</w:t>
+      </w:r>
+      <w:r>
+        <w:rPr>
+          <w:rFonts w:ascii="Consolas" w:eastAsia="Consolas" w:hAnsi="Consolas" w:cs="Consolas"/>
+          <w:sz w:val="18"/>
+          <w:szCs w:val="18"/>
+        </w:rPr>
+        <w:t xml:space="preserve"> </w:t>
+      </w:r>
+      <w:r>
+        <w:rPr>
+          <w:rFonts w:ascii="Consolas" w:eastAsia="Consolas" w:hAnsi="Consolas" w:cs="Consolas"/>
+          <w:sz w:val="18"/>
+          <w:szCs w:val="18"/>
+        </w:rPr>
+        <w:t>있습니다</w:t>
+      </w:r>
+      <w:r>
+        <w:rPr>
+          <w:rFonts w:ascii="Consolas" w:eastAsia="Consolas" w:hAnsi="Consolas" w:cs="Consolas"/>
+          <w:sz w:val="18"/>
+          <w:szCs w:val="18"/>
+        </w:rPr>
+        <w:t>", ...}</w:t>
       </w:r>
     </w:p>
     <w:p>

</xml_diff>

<commit_message>
[문서] 02_Insecure_DOR.docx에 isAdmin/isOwner 중복 제거 리팩터링 반영
- 기존 isAdmin()/isOwner() 코드는 유지
- UserInfo.isAdmin(), AccessControl.isOwner() 로 분리한 내용과 바뀐 호출부 추가
</commit_message>
<xml_diff>
--- a/docs/security/02_Insecure_DOR.docx
+++ b/docs/security/02_Insecure_DOR.docx
@@ -1685,279 +1685,33 @@
         <w:spacing w:after="100" w:line="276" w:lineRule="auto"/>
       </w:pPr>
       <w:r>
-        <w:t xml:space="preserve">PII(Personally Identifiable Information, </w:t>
-      </w:r>
-      <w:r>
-        <w:t>개인식별정보</w:t>
-      </w:r>
-      <w:r>
-        <w:t>)</w:t>
-      </w:r>
-      <w:r>
-        <w:t>란</w:t>
-      </w:r>
-      <w:r>
-        <w:t xml:space="preserve"> </w:t>
-      </w:r>
-      <w:r>
-        <w:rPr>
-          <w:b/>
-          <w:bCs/>
-        </w:rPr>
-        <w:t>개인을</w:t>
-      </w:r>
-      <w:r>
-        <w:rPr>
-          <w:b/>
-          <w:bCs/>
-        </w:rPr>
-        <w:t xml:space="preserve"> </w:t>
-      </w:r>
-      <w:r>
-        <w:rPr>
-          <w:b/>
-          <w:bCs/>
-        </w:rPr>
-        <w:t>식별하거나</w:t>
-      </w:r>
-      <w:r>
-        <w:rPr>
-          <w:b/>
-          <w:bCs/>
-        </w:rPr>
-        <w:t xml:space="preserve"> </w:t>
-      </w:r>
-      <w:r>
-        <w:rPr>
-          <w:b/>
-          <w:bCs/>
-        </w:rPr>
-        <w:t>특정할</w:t>
-      </w:r>
-      <w:r>
-        <w:rPr>
-          <w:b/>
-          <w:bCs/>
-        </w:rPr>
-        <w:t xml:space="preserve"> </w:t>
-      </w:r>
-      <w:r>
-        <w:rPr>
-          <w:b/>
-          <w:bCs/>
-        </w:rPr>
-        <w:t>수</w:t>
-      </w:r>
-      <w:r>
-        <w:rPr>
-          <w:b/>
-          <w:bCs/>
-        </w:rPr>
-        <w:t xml:space="preserve"> </w:t>
-      </w:r>
-      <w:r>
-        <w:rPr>
-          <w:b/>
-          <w:bCs/>
-        </w:rPr>
-        <w:t>있는</w:t>
-      </w:r>
-      <w:r>
-        <w:rPr>
-          <w:b/>
-          <w:bCs/>
-        </w:rPr>
-        <w:t xml:space="preserve"> </w:t>
-      </w:r>
-      <w:r>
-        <w:rPr>
-          <w:b/>
-          <w:bCs/>
-        </w:rPr>
-        <w:t>정보</w:t>
-      </w:r>
-      <w:r>
-        <w:t>를</w:t>
-      </w:r>
-      <w:r>
-        <w:t xml:space="preserve"> </w:t>
-      </w:r>
-      <w:r>
-        <w:t>말한다</w:t>
-      </w:r>
-      <w:r>
-        <w:t xml:space="preserve">. </w:t>
+        <w:t xml:space="preserve">PII(Personally Identifiable Information, 개인식별정보)란 </w:t>
+      </w:r>
+      <w:r>
+        <w:rPr>
+          <w:b/>
+          <w:bCs/>
+        </w:rPr>
+        <w:t>개인을 식별하거나 특정할 수 있는 정보</w:t>
+      </w:r>
+      <w:r>
+        <w:t xml:space="preserve">를 말한다. StudentDetail 엔티티의 address, </w:t>
       </w:r>
       <w:proofErr w:type="spellStart"/>
       <w:r>
-        <w:t>StudentD</w:t>
-      </w:r>
-      <w:r>
-        <w:t>etail</w:t>
+        <w:t>phoneNumber</w:t>
       </w:r>
       <w:proofErr w:type="spellEnd"/>
       <w:r>
-        <w:t xml:space="preserve"> </w:t>
-      </w:r>
-      <w:r>
-        <w:t>엔티티의</w:t>
-      </w:r>
-      <w:r>
-        <w:t xml:space="preserve"> address, </w:t>
+        <w:t xml:space="preserve">, email, </w:t>
       </w:r>
       <w:proofErr w:type="spellStart"/>
       <w:r>
-        <w:t>phoneNumber</w:t>
+        <w:t>dateOfBirth</w:t>
       </w:r>
       <w:proofErr w:type="spellEnd"/>
       <w:r>
-        <w:t xml:space="preserve">, email, </w:t>
-      </w:r>
-      <w:proofErr w:type="spellStart"/>
-      <w:r>
-        <w:t>dateOfBirth</w:t>
-      </w:r>
-      <w:proofErr w:type="spellEnd"/>
-      <w:r>
-        <w:t xml:space="preserve"> </w:t>
-      </w:r>
-      <w:r>
-        <w:t>필드가</w:t>
-      </w:r>
-      <w:r>
-        <w:t xml:space="preserve"> </w:t>
-      </w:r>
-      <w:r>
-        <w:t>이에</w:t>
-      </w:r>
-      <w:r>
-        <w:t xml:space="preserve"> </w:t>
-      </w:r>
-      <w:r>
-        <w:t>해당하며</w:t>
-      </w:r>
-      <w:r>
-        <w:t xml:space="preserve">, </w:t>
-      </w:r>
-      <w:r>
-        <w:t>표의</w:t>
-      </w:r>
-      <w:r>
-        <w:t xml:space="preserve"> "(PII </w:t>
-      </w:r>
-      <w:r>
-        <w:t>포함</w:t>
-      </w:r>
-      <w:r>
-        <w:t xml:space="preserve">)" </w:t>
-      </w:r>
-      <w:r>
-        <w:t>표시는</w:t>
-      </w:r>
-      <w:r>
-        <w:t xml:space="preserve"> </w:t>
-      </w:r>
-      <w:r>
-        <w:t>이</w:t>
-      </w:r>
-      <w:r>
-        <w:t xml:space="preserve"> </w:t>
-      </w:r>
-      <w:r>
-        <w:t>필드를</w:t>
-      </w:r>
-      <w:r>
-        <w:t xml:space="preserve"> </w:t>
-      </w:r>
-      <w:r>
-        <w:t>포함한</w:t>
-      </w:r>
-      <w:r>
-        <w:t xml:space="preserve"> </w:t>
-      </w:r>
-      <w:r>
-        <w:t>응답을</w:t>
-      </w:r>
-      <w:r>
-        <w:t xml:space="preserve"> </w:t>
-      </w:r>
-      <w:r>
-        <w:t>의미한다</w:t>
-      </w:r>
-      <w:r>
-        <w:t xml:space="preserve">. </w:t>
-      </w:r>
-      <w:r>
-        <w:t>전체목록</w:t>
-      </w:r>
-      <w:r>
-        <w:t xml:space="preserve"> </w:t>
-      </w:r>
-      <w:r>
-        <w:t>조회를</w:t>
-      </w:r>
-      <w:r>
-        <w:t xml:space="preserve"> ROLE_ADMIN </w:t>
-      </w:r>
-      <w:r>
-        <w:t>전용으로</w:t>
-      </w:r>
-      <w:r>
-        <w:t xml:space="preserve"> </w:t>
-      </w:r>
-      <w:r>
-        <w:t>제한한</w:t>
-      </w:r>
-      <w:r>
-        <w:t xml:space="preserve"> </w:t>
-      </w:r>
-      <w:r>
-        <w:t>이유도</w:t>
-      </w:r>
-      <w:r>
-        <w:t xml:space="preserve"> </w:t>
-      </w:r>
-      <w:r>
-        <w:t>이</w:t>
-      </w:r>
-      <w:r>
-        <w:t xml:space="preserve"> PII</w:t>
-      </w:r>
-      <w:r>
-        <w:t>가</w:t>
-      </w:r>
-      <w:r>
-        <w:t xml:space="preserve"> </w:t>
-      </w:r>
-      <w:r>
-        <w:t>다수</w:t>
-      </w:r>
-      <w:r>
-        <w:t xml:space="preserve"> </w:t>
-      </w:r>
-      <w:r>
-        <w:t>노출되는</w:t>
-      </w:r>
-      <w:r>
-        <w:t xml:space="preserve"> </w:t>
-      </w:r>
-      <w:r>
-        <w:t>것을</w:t>
-      </w:r>
-      <w:r>
-        <w:t xml:space="preserve"> </w:t>
-      </w:r>
-      <w:r>
-        <w:t>막기</w:t>
-      </w:r>
-      <w:r>
-        <w:t xml:space="preserve"> </w:t>
-      </w:r>
-      <w:r>
-        <w:t>위해서다</w:t>
-      </w:r>
-      <w:r>
-        <w:t>.</w:t>
+        <w:t xml:space="preserve"> 필드가 이에 해당하며, 표의 "(PII 포함)" 표시는 이 필드를 포함한 응답을 의미한다. 전체목록 조회를 ROLE_ADMIN 전용으로 제한한 이유도 이 PII가 다수 노출되는 것을 막기 위해서다.</w:t>
       </w:r>
     </w:p>
     <w:tbl>
@@ -2669,10 +2423,936 @@
         </w:rPr>
         <w:t xml:space="preserve">변경함 </w:t>
       </w:r>
+      <w:r>
+        <w:t>(StudentController, StudentDetailController 동일 적용).</w:t>
+      </w:r>
+    </w:p>
+    <w:p>
+      <w:pPr>
+        <w:pBdr>
+          <w:top w:val="single" w:sz="4" w:space="3" w:color="D9D9D9"/>
+          <w:left w:val="single" w:sz="18" w:space="6" w:color="C0C0C0"/>
+        </w:pBdr>
+        <w:shd w:val="clear" w:color="auto" w:fill="F4F4F4"/>
+      </w:pPr>
+      <w:r>
+        <w:rPr>
+          <w:rFonts w:ascii="Consolas" w:eastAsia="Consolas" w:hAnsi="Consolas" w:cs="Consolas"/>
+          <w:sz w:val="18"/>
+          <w:szCs w:val="18"/>
+        </w:rPr>
+        <w:t>if (!isAdmin(currentUser) &amp;&amp; !isOwner(student, currentUser)) {</w:t>
+      </w:r>
+    </w:p>
+    <w:p>
+      <w:pPr>
+        <w:pBdr>
+          <w:left w:val="single" w:sz="18" w:space="6" w:color="C0C0C0"/>
+        </w:pBdr>
+        <w:shd w:val="clear" w:color="auto" w:fill="F4F4F4"/>
+      </w:pPr>
+      <w:r>
+        <w:rPr>
+          <w:rFonts w:ascii="Consolas" w:eastAsia="Consolas" w:hAnsi="Consolas" w:cs="Consolas"/>
+          <w:sz w:val="18"/>
+          <w:szCs w:val="18"/>
+        </w:rPr>
+        <w:t xml:space="preserve">    throw new AccessDeniedException("본인 정보만 조회할 수 있습니다");</w:t>
+      </w:r>
+    </w:p>
+    <w:p>
+      <w:pPr>
+        <w:pBdr>
+          <w:left w:val="single" w:sz="18" w:space="6" w:color="C0C0C0"/>
+          <w:bottom w:val="single" w:sz="4" w:space="3" w:color="D9D9D9"/>
+        </w:pBdr>
+        <w:shd w:val="clear" w:color="auto" w:fill="F4F4F4"/>
+      </w:pPr>
+      <w:r>
+        <w:rPr>
+          <w:rFonts w:ascii="Consolas" w:eastAsia="Consolas" w:hAnsi="Consolas" w:cs="Consolas"/>
+          <w:sz w:val="18"/>
+          <w:szCs w:val="18"/>
+        </w:rPr>
+        <w:t>}</w:t>
+      </w:r>
+    </w:p>
+    <w:p>
+      <w:pPr>
+        <w:spacing w:after="100" w:line="276" w:lineRule="auto"/>
+      </w:pPr>
+      <w:r>
+        <w:t xml:space="preserve">위 코드는 </w:t>
+      </w:r>
+      <w:r>
+        <w:rPr>
+          <w:b/>
+          <w:bCs/>
+        </w:rPr>
+        <w:t>StudentService</w:t>
+      </w:r>
+      <w:r>
+        <w:t xml:space="preserve"> 클래스의 getStudentById()/getStudentByStudentNumber() 에 있으며, 아래 두 private 메서드를 사용한다.</w:t>
+      </w:r>
+    </w:p>
+    <w:p>
+      <w:pPr>
+        <w:pBdr>
+          <w:top w:val="single" w:sz="4" w:space="3" w:color="D9D9D9"/>
+          <w:left w:val="single" w:sz="18" w:space="6" w:color="C0C0C0"/>
+        </w:pBdr>
+        <w:shd w:val="clear" w:color="auto" w:fill="F4F4F4"/>
+      </w:pPr>
+      <w:r>
+        <w:rPr>
+          <w:rFonts w:ascii="Consolas" w:eastAsia="Consolas" w:hAnsi="Consolas" w:cs="Consolas"/>
+          <w:sz w:val="18"/>
+          <w:szCs w:val="18"/>
+        </w:rPr>
+        <w:t>// roles 는 "ROLE_USER" 또는 "ROLE_ADMIN,ROLE_USER" 처럼 쉼표로 구분된 문자열이다</w:t>
+      </w:r>
+    </w:p>
+    <w:p>
+      <w:pPr>
+        <w:pBdr>
+          <w:left w:val="single" w:sz="18" w:space="6" w:color="C0C0C0"/>
+        </w:pBdr>
+        <w:shd w:val="clear" w:color="auto" w:fill="F4F4F4"/>
+      </w:pPr>
+      <w:r>
+        <w:rPr>
+          <w:rFonts w:ascii="Consolas" w:eastAsia="Consolas" w:hAnsi="Consolas" w:cs="Consolas"/>
+          <w:sz w:val="18"/>
+          <w:szCs w:val="18"/>
+        </w:rPr>
+        <w:t>private boolean isAdmin(UserInfo user) {</w:t>
+      </w:r>
+    </w:p>
+    <w:p>
+      <w:pPr>
+        <w:pBdr>
+          <w:left w:val="single" w:sz="18" w:space="6" w:color="C0C0C0"/>
+        </w:pBdr>
+        <w:shd w:val="clear" w:color="auto" w:fill="F4F4F4"/>
+      </w:pPr>
+      <w:r>
+        <w:rPr>
+          <w:rFonts w:ascii="Consolas" w:eastAsia="Consolas" w:hAnsi="Consolas" w:cs="Consolas"/>
+          <w:sz w:val="18"/>
+          <w:szCs w:val="18"/>
+        </w:rPr>
+        <w:t xml:space="preserve">    String roles = user.getRoles() == null ? "" : user.getRoles();</w:t>
+      </w:r>
+    </w:p>
+    <w:p>
+      <w:pPr>
+        <w:pBdr>
+          <w:left w:val="single" w:sz="18" w:space="6" w:color="C0C0C0"/>
+        </w:pBdr>
+        <w:shd w:val="clear" w:color="auto" w:fill="F4F4F4"/>
+      </w:pPr>
+      <w:r>
+        <w:rPr>
+          <w:rFonts w:ascii="Consolas" w:eastAsia="Consolas" w:hAnsi="Consolas" w:cs="Consolas"/>
+          <w:sz w:val="18"/>
+          <w:szCs w:val="18"/>
+        </w:rPr>
+        <w:t xml:space="preserve">    return Arrays.stream(roles.split(","))</w:t>
+      </w:r>
+    </w:p>
+    <w:p>
+      <w:pPr>
+        <w:pBdr>
+          <w:left w:val="single" w:sz="18" w:space="6" w:color="C0C0C0"/>
+        </w:pBdr>
+        <w:shd w:val="clear" w:color="auto" w:fill="F4F4F4"/>
+      </w:pPr>
+      <w:r>
+        <w:rPr>
+          <w:rFonts w:ascii="Consolas" w:eastAsia="Consolas" w:hAnsi="Consolas" w:cs="Consolas"/>
+          <w:sz w:val="18"/>
+          <w:szCs w:val="18"/>
+        </w:rPr>
+        <w:t xml:space="preserve">            .map(String::trim)</w:t>
+      </w:r>
+    </w:p>
+    <w:p>
+      <w:pPr>
+        <w:pBdr>
+          <w:left w:val="single" w:sz="18" w:space="6" w:color="C0C0C0"/>
+        </w:pBdr>
+        <w:shd w:val="clear" w:color="auto" w:fill="F4F4F4"/>
+      </w:pPr>
+      <w:r>
+        <w:rPr>
+          <w:rFonts w:ascii="Consolas" w:eastAsia="Consolas" w:hAnsi="Consolas" w:cs="Consolas"/>
+          <w:sz w:val="18"/>
+          <w:szCs w:val="18"/>
+        </w:rPr>
+        <w:t xml:space="preserve">            .anyMatch("ROLE_ADMIN"::equals);</w:t>
+      </w:r>
+    </w:p>
+    <w:p>
+      <w:pPr>
+        <w:pBdr>
+          <w:left w:val="single" w:sz="18" w:space="6" w:color="C0C0C0"/>
+        </w:pBdr>
+        <w:shd w:val="clear" w:color="auto" w:fill="F4F4F4"/>
+      </w:pPr>
+      <w:r>
+        <w:rPr>
+          <w:rFonts w:ascii="Consolas" w:eastAsia="Consolas" w:hAnsi="Consolas" w:cs="Consolas"/>
+          <w:sz w:val="18"/>
+          <w:szCs w:val="18"/>
+        </w:rPr>
+        <w:t>}</w:t>
+      </w:r>
+    </w:p>
+    <w:p>
+      <w:pPr>
+        <w:pBdr>
+          <w:left w:val="single" w:sz="18" w:space="6" w:color="C0C0C0"/>
+        </w:pBdr>
+        <w:shd w:val="clear" w:color="auto" w:fill="F4F4F4"/>
+      </w:pPr>
+    </w:p>
+    <w:p>
+      <w:pPr>
+        <w:pBdr>
+          <w:left w:val="single" w:sz="18" w:space="6" w:color="C0C0C0"/>
+        </w:pBdr>
+        <w:shd w:val="clear" w:color="auto" w:fill="F4F4F4"/>
+      </w:pPr>
+      <w:r>
+        <w:rPr>
+          <w:rFonts w:ascii="Consolas" w:eastAsia="Consolas" w:hAnsi="Consolas" w:cs="Consolas"/>
+          <w:sz w:val="18"/>
+          <w:szCs w:val="18"/>
+        </w:rPr>
+        <w:t>// 학생을 등록한 사용자(student.userInfo) 와 현재 로그인한 사용자가 같은지 확인한다</w:t>
+      </w:r>
+    </w:p>
+    <w:p>
+      <w:pPr>
+        <w:pBdr>
+          <w:left w:val="single" w:sz="18" w:space="6" w:color="C0C0C0"/>
+        </w:pBdr>
+        <w:shd w:val="clear" w:color="auto" w:fill="F4F4F4"/>
+      </w:pPr>
+      <w:r>
+        <w:rPr>
+          <w:rFonts w:ascii="Consolas" w:eastAsia="Consolas" w:hAnsi="Consolas" w:cs="Consolas"/>
+          <w:sz w:val="18"/>
+          <w:szCs w:val="18"/>
+        </w:rPr>
+        <w:t>private boolean isOwner(Student student, UserInfo user) {</w:t>
+      </w:r>
+    </w:p>
+    <w:p>
+      <w:pPr>
+        <w:pBdr>
+          <w:left w:val="single" w:sz="18" w:space="6" w:color="C0C0C0"/>
+        </w:pBdr>
+        <w:shd w:val="clear" w:color="auto" w:fill="F4F4F4"/>
+      </w:pPr>
+      <w:r>
+        <w:rPr>
+          <w:rFonts w:ascii="Consolas" w:eastAsia="Consolas" w:hAnsi="Consolas" w:cs="Consolas"/>
+          <w:sz w:val="18"/>
+          <w:szCs w:val="18"/>
+        </w:rPr>
+        <w:t xml:space="preserve">    return student.getUserInfo() != null</w:t>
+      </w:r>
+    </w:p>
+    <w:p>
+      <w:pPr>
+        <w:pBdr>
+          <w:left w:val="single" w:sz="18" w:space="6" w:color="C0C0C0"/>
+        </w:pBdr>
+        <w:shd w:val="clear" w:color="auto" w:fill="F4F4F4"/>
+      </w:pPr>
+      <w:r>
+        <w:rPr>
+          <w:rFonts w:ascii="Consolas" w:eastAsia="Consolas" w:hAnsi="Consolas" w:cs="Consolas"/>
+          <w:sz w:val="18"/>
+          <w:szCs w:val="18"/>
+        </w:rPr>
+        <w:t xml:space="preserve">            &amp;&amp; student.getUserInfo().getId().equals(user.getId());</w:t>
+      </w:r>
+    </w:p>
+    <w:p>
+      <w:pPr>
+        <w:pBdr>
+          <w:left w:val="single" w:sz="18" w:space="6" w:color="C0C0C0"/>
+          <w:bottom w:val="single" w:sz="4" w:space="3" w:color="D9D9D9"/>
+        </w:pBdr>
+        <w:shd w:val="clear" w:color="auto" w:fill="F4F4F4"/>
+      </w:pPr>
+      <w:r>
+        <w:rPr>
+          <w:rFonts w:ascii="Consolas" w:eastAsia="Consolas" w:hAnsi="Consolas" w:cs="Consolas"/>
+          <w:sz w:val="18"/>
+          <w:szCs w:val="18"/>
+        </w:rPr>
+        <w:t>}</w:t>
+      </w:r>
+    </w:p>
+    <w:p>
+      <w:pPr>
+        <w:spacing w:after="100" w:line="276" w:lineRule="auto"/>
+      </w:pPr>
+      <w:r>
+        <w:t>그런데</w:t>
+      </w:r>
+      <w:r>
+        <w:t xml:space="preserve"> </w:t>
+      </w:r>
+      <w:r>
+        <w:t>위</w:t>
+      </w:r>
+      <w:r>
+        <w:rPr>
+          <w:rFonts w:hint="eastAsia"/>
+        </w:rPr>
+        <w:t xml:space="preserve"> 코드의</w:t>
+      </w:r>
+      <w:r>
+        <w:t xml:space="preserve"> </w:t>
+      </w:r>
+      <w:r>
+        <w:t xml:space="preserve">isAdmin()/isOwner() </w:t>
+      </w:r>
+      <w:r>
+        <w:rPr>
+          <w:rFonts w:hint="eastAsia"/>
+        </w:rPr>
+        <w:t>메서드</w:t>
+      </w:r>
+      <w:r>
+        <w:t>는</w:t>
+      </w:r>
+      <w:r>
+        <w:t xml:space="preserve"> </w:t>
+      </w:r>
+      <w:r>
+        <w:rPr>
+          <w:b/>
+          <w:bCs/>
+        </w:rPr>
+        <w:t>StudentService</w:t>
+      </w:r>
+      <w:r>
+        <w:rPr>
+          <w:b/>
+          <w:bCs/>
+        </w:rPr>
+        <w:t>와</w:t>
+      </w:r>
+      <w:r>
+        <w:rPr>
+          <w:b/>
+          <w:bCs/>
+        </w:rPr>
+        <w:t xml:space="preserve"> StudentDetailService</w:t>
+      </w:r>
+      <w:r>
+        <w:rPr>
+          <w:b/>
+          <w:bCs/>
+        </w:rPr>
+        <w:t>에</w:t>
+      </w:r>
+      <w:r>
+        <w:rPr>
+          <w:b/>
+          <w:bCs/>
+        </w:rPr>
+        <w:t xml:space="preserve"> </w:t>
+      </w:r>
+      <w:r>
+        <w:rPr>
+          <w:b/>
+          <w:bCs/>
+        </w:rPr>
+        <w:t>그대로</w:t>
+      </w:r>
+      <w:r>
+        <w:rPr>
+          <w:b/>
+          <w:bCs/>
+        </w:rPr>
+        <w:t xml:space="preserve"> </w:t>
+      </w:r>
+      <w:r>
+        <w:rPr>
+          <w:b/>
+          <w:bCs/>
+        </w:rPr>
+        <w:t>중복</w:t>
+      </w:r>
+      <w:r>
+        <w:t>돼</w:t>
+      </w:r>
+      <w:r>
+        <w:t xml:space="preserve"> </w:t>
+      </w:r>
+      <w:r>
+        <w:t>있었다</w:t>
+      </w:r>
+      <w:r>
+        <w:t xml:space="preserve">. </w:t>
+      </w:r>
+      <w:r>
+        <w:t>이를</w:t>
+      </w:r>
+      <w:r>
+        <w:t xml:space="preserve"> </w:t>
+      </w:r>
+      <w:r>
+        <w:t>제거하기</w:t>
+      </w:r>
+      <w:r>
+        <w:t xml:space="preserve"> </w:t>
+      </w:r>
+      <w:r>
+        <w:t>위해</w:t>
+      </w:r>
+      <w:r>
+        <w:t xml:space="preserve"> isAdmin()</w:t>
+      </w:r>
+      <w:r>
+        <w:t>은</w:t>
+      </w:r>
+      <w:r>
+        <w:t xml:space="preserve"> </w:t>
+      </w:r>
+      <w:r>
+        <w:rPr>
+          <w:b/>
+          <w:bCs/>
+        </w:rPr>
+        <w:t xml:space="preserve">UserInfo </w:t>
+      </w:r>
+      <w:r>
+        <w:rPr>
+          <w:b/>
+          <w:bCs/>
+        </w:rPr>
+        <w:t>엔티티의</w:t>
+      </w:r>
+      <w:r>
+        <w:rPr>
+          <w:b/>
+          <w:bCs/>
+        </w:rPr>
+        <w:t xml:space="preserve"> </w:t>
+      </w:r>
+      <w:r>
+        <w:rPr>
+          <w:b/>
+          <w:bCs/>
+        </w:rPr>
+        <w:t>메서드</w:t>
+      </w:r>
+      <w:r>
+        <w:t>로</w:t>
+      </w:r>
+      <w:r>
+        <w:t>, isOwner()</w:t>
+      </w:r>
+      <w:r>
+        <w:t>는</w:t>
+      </w:r>
+      <w:r>
+        <w:t xml:space="preserve"> </w:t>
+      </w:r>
+      <w:r>
+        <w:t>별도의</w:t>
+      </w:r>
+      <w:r>
+        <w:t xml:space="preserve"> </w:t>
+      </w:r>
+      <w:r>
+        <w:rPr>
+          <w:b/>
+          <w:bCs/>
+        </w:rPr>
+        <w:t xml:space="preserve">AccessControl </w:t>
+      </w:r>
+      <w:r>
+        <w:rPr>
+          <w:b/>
+          <w:bCs/>
+        </w:rPr>
+        <w:t>유틸리티</w:t>
+      </w:r>
+      <w:r>
+        <w:rPr>
+          <w:b/>
+          <w:bCs/>
+        </w:rPr>
+        <w:t xml:space="preserve"> </w:t>
+      </w:r>
+      <w:r>
+        <w:rPr>
+          <w:b/>
+          <w:bCs/>
+        </w:rPr>
+        <w:t>클래스</w:t>
+      </w:r>
+      <w:r>
+        <w:t>로</w:t>
+      </w:r>
+      <w:r>
+        <w:t xml:space="preserve"> </w:t>
+      </w:r>
+      <w:r>
+        <w:t>옮겼다</w:t>
+      </w:r>
+      <w:r>
+        <w:t>.</w:t>
+      </w:r>
+    </w:p>
+    <w:p>
+      <w:pPr>
+        <w:spacing w:after="100" w:line="276" w:lineRule="auto"/>
+      </w:pPr>
+      <w:r>
+        <w:t xml:space="preserve">UserInfo.java — isAdmin() </w:t>
+      </w:r>
+      <w:r>
+        <w:t>을</w:t>
+      </w:r>
+      <w:r>
+        <w:t xml:space="preserve"> </w:t>
+      </w:r>
+      <w:r>
+        <w:t>엔티티</w:t>
+      </w:r>
+      <w:r>
+        <w:t xml:space="preserve"> </w:t>
+      </w:r>
+      <w:r>
+        <w:t>메서드로</w:t>
+      </w:r>
+      <w:r>
+        <w:t xml:space="preserve"> </w:t>
+      </w:r>
+      <w:r>
+        <w:t>이동</w:t>
+      </w:r>
+    </w:p>
+    <w:p>
+      <w:pPr>
+        <w:pBdr>
+          <w:top w:val="single" w:sz="4" w:space="3" w:color="D9D9D9"/>
+          <w:left w:val="single" w:sz="18" w:space="6" w:color="C0C0C0"/>
+        </w:pBdr>
+        <w:shd w:val="clear" w:color="auto" w:fill="F4F4F4"/>
+      </w:pPr>
+      <w:r>
+        <w:rPr>
+          <w:rFonts w:ascii="Consolas" w:eastAsia="Consolas" w:hAnsi="Consolas" w:cs="Consolas"/>
+          <w:sz w:val="18"/>
+          <w:szCs w:val="18"/>
+        </w:rPr>
+        <w:t>public boolean isAdmin() {</w:t>
+      </w:r>
+    </w:p>
+    <w:p>
+      <w:pPr>
+        <w:pBdr>
+          <w:left w:val="single" w:sz="18" w:space="6" w:color="C0C0C0"/>
+        </w:pBdr>
+        <w:shd w:val="clear" w:color="auto" w:fill="F4F4F4"/>
+      </w:pPr>
+      <w:r>
+        <w:rPr>
+          <w:rFonts w:ascii="Consolas" w:eastAsia="Consolas" w:hAnsi="Consolas" w:cs="Consolas"/>
+          <w:sz w:val="18"/>
+          <w:szCs w:val="18"/>
+        </w:rPr>
+        <w:t xml:space="preserve">    String value = roles == null ? "" : roles;</w:t>
+      </w:r>
+    </w:p>
+    <w:p>
+      <w:pPr>
+        <w:pBdr>
+          <w:left w:val="single" w:sz="18" w:space="6" w:color="C0C0C0"/>
+        </w:pBdr>
+        <w:shd w:val="clear" w:color="auto" w:fill="F4F4F4"/>
+      </w:pPr>
+      <w:r>
+        <w:rPr>
+          <w:rFonts w:ascii="Consolas" w:eastAsia="Consolas" w:hAnsi="Consolas" w:cs="Consolas"/>
+          <w:sz w:val="18"/>
+          <w:szCs w:val="18"/>
+        </w:rPr>
+        <w:t xml:space="preserve">    return Arrays.stream(value.split(","))</w:t>
+      </w:r>
+    </w:p>
+    <w:p>
+      <w:pPr>
+        <w:pBdr>
+          <w:left w:val="single" w:sz="18" w:space="6" w:color="C0C0C0"/>
+        </w:pBdr>
+        <w:shd w:val="clear" w:color="auto" w:fill="F4F4F4"/>
+      </w:pPr>
+      <w:r>
+        <w:rPr>
+          <w:rFonts w:ascii="Consolas" w:eastAsia="Consolas" w:hAnsi="Consolas" w:cs="Consolas"/>
+          <w:sz w:val="18"/>
+          <w:szCs w:val="18"/>
+        </w:rPr>
+        <w:t xml:space="preserve">            .map(String::trim)</w:t>
+      </w:r>
+    </w:p>
+    <w:p>
+      <w:pPr>
+        <w:pBdr>
+          <w:left w:val="single" w:sz="18" w:space="6" w:color="C0C0C0"/>
+        </w:pBdr>
+        <w:shd w:val="clear" w:color="auto" w:fill="F4F4F4"/>
+      </w:pPr>
+      <w:r>
+        <w:rPr>
+          <w:rFonts w:ascii="Consolas" w:eastAsia="Consolas" w:hAnsi="Consolas" w:cs="Consolas"/>
+          <w:sz w:val="18"/>
+          <w:szCs w:val="18"/>
+        </w:rPr>
+        <w:t xml:space="preserve">            .anyMatch("ROLE_ADMIN"::equals);</w:t>
+      </w:r>
+    </w:p>
+    <w:p>
+      <w:pPr>
+        <w:pBdr>
+          <w:left w:val="single" w:sz="18" w:space="6" w:color="C0C0C0"/>
+          <w:bottom w:val="single" w:sz="4" w:space="3" w:color="D9D9D9"/>
+        </w:pBdr>
+        <w:shd w:val="clear" w:color="auto" w:fill="F4F4F4"/>
+      </w:pPr>
+      <w:r>
+        <w:rPr>
+          <w:rFonts w:ascii="Consolas" w:eastAsia="Consolas" w:hAnsi="Consolas" w:cs="Consolas"/>
+          <w:sz w:val="18"/>
+          <w:szCs w:val="18"/>
+        </w:rPr>
+        <w:t>}</w:t>
+      </w:r>
+    </w:p>
+    <w:p>
+      <w:pPr>
+        <w:spacing w:after="100" w:line="276" w:lineRule="auto"/>
+      </w:pPr>
+      <w:r>
+        <w:t>AccessControl.java (</w:t>
+      </w:r>
+      <w:r>
+        <w:t>신규</w:t>
+      </w:r>
+      <w:r>
+        <w:t xml:space="preserve">) — isOwner() </w:t>
+      </w:r>
+      <w:r>
+        <w:t>를</w:t>
+      </w:r>
+      <w:r>
+        <w:t xml:space="preserve"> static </w:t>
+      </w:r>
+      <w:r>
+        <w:t>유틸</w:t>
+      </w:r>
+      <w:r>
+        <w:t xml:space="preserve"> </w:t>
+      </w:r>
+      <w:r>
+        <w:t>메서드로</w:t>
+      </w:r>
+      <w:r>
+        <w:t xml:space="preserve"> </w:t>
+      </w:r>
+      <w:r>
+        <w:t>분리</w:t>
+      </w:r>
+    </w:p>
+    <w:p>
+      <w:pPr>
+        <w:pBdr>
+          <w:top w:val="single" w:sz="4" w:space="3" w:color="D9D9D9"/>
+          <w:left w:val="single" w:sz="18" w:space="6" w:color="C0C0C0"/>
+        </w:pBdr>
+        <w:shd w:val="clear" w:color="auto" w:fill="F4F4F4"/>
+      </w:pPr>
+      <w:r>
+        <w:rPr>
+          <w:rFonts w:ascii="Consolas" w:eastAsia="Consolas" w:hAnsi="Consolas" w:cs="Consolas"/>
+          <w:sz w:val="18"/>
+          <w:szCs w:val="18"/>
+        </w:rPr>
+        <w:t>public static boolean isOwner(Student student, UserInfo user) {</w:t>
+      </w:r>
+    </w:p>
+    <w:p>
+      <w:pPr>
+        <w:pBdr>
+          <w:left w:val="single" w:sz="18" w:space="6" w:color="C0C0C0"/>
+        </w:pBdr>
+        <w:shd w:val="clear" w:color="auto" w:fill="F4F4F4"/>
+      </w:pPr>
+      <w:r>
+        <w:rPr>
+          <w:rFonts w:ascii="Consolas" w:eastAsia="Consolas" w:hAnsi="Consolas" w:cs="Consolas"/>
+          <w:sz w:val="18"/>
+          <w:szCs w:val="18"/>
+        </w:rPr>
+        <w:t xml:space="preserve">    return student.getUserInfo() != null</w:t>
+      </w:r>
+    </w:p>
+    <w:p>
+      <w:pPr>
+        <w:pBdr>
+          <w:left w:val="single" w:sz="18" w:space="6" w:color="C0C0C0"/>
+        </w:pBdr>
+        <w:shd w:val="clear" w:color="auto" w:fill="F4F4F4"/>
+      </w:pPr>
+      <w:r>
+        <w:rPr>
+          <w:rFonts w:ascii="Consolas" w:eastAsia="Consolas" w:hAnsi="Consolas" w:cs="Consolas"/>
+          <w:sz w:val="18"/>
+          <w:szCs w:val="18"/>
+        </w:rPr>
+        <w:t xml:space="preserve">            &amp;&amp; student.getUserInfo().getId().equals(user.getId());</w:t>
+      </w:r>
+    </w:p>
+    <w:p>
+      <w:pPr>
+        <w:pBdr>
+          <w:left w:val="single" w:sz="18" w:space="6" w:color="C0C0C0"/>
+          <w:bottom w:val="single" w:sz="4" w:space="3" w:color="D9D9D9"/>
+        </w:pBdr>
+        <w:shd w:val="clear" w:color="auto" w:fill="F4F4F4"/>
+      </w:pPr>
+      <w:r>
+        <w:rPr>
+          <w:rFonts w:ascii="Consolas" w:eastAsia="Consolas" w:hAnsi="Consolas" w:cs="Consolas"/>
+          <w:sz w:val="18"/>
+          <w:szCs w:val="18"/>
+        </w:rPr>
+        <w:t>}</w:t>
+      </w:r>
+    </w:p>
+    <w:p>
+      <w:pPr>
+        <w:spacing w:after="100" w:line="276" w:lineRule="auto"/>
+      </w:pPr>
+      <w:r>
+        <w:t xml:space="preserve">StudentService/StudentDetailService </w:t>
+      </w:r>
+      <w:r>
+        <w:t>의</w:t>
+      </w:r>
+      <w:r>
+        <w:t xml:space="preserve"> </w:t>
+      </w:r>
+      <w:r>
+        <w:t>호출부도</w:t>
+      </w:r>
+      <w:r>
+        <w:t xml:space="preserve"> </w:t>
+      </w:r>
+      <w:r>
+        <w:t>함께</w:t>
+      </w:r>
+      <w:r>
+        <w:t xml:space="preserve"> </w:t>
+      </w:r>
+      <w:r>
+        <w:t>바뀌었다</w:t>
+      </w:r>
+      <w:r>
+        <w:t>.</w:t>
+      </w:r>
+    </w:p>
+    <w:p>
+      <w:pPr>
+        <w:pBdr>
+          <w:top w:val="single" w:sz="4" w:space="3" w:color="D9D9D9"/>
+          <w:left w:val="single" w:sz="18" w:space="6" w:color="C0C0C0"/>
+        </w:pBdr>
+        <w:shd w:val="clear" w:color="auto" w:fill="F4F4F4"/>
+      </w:pPr>
+      <w:r>
+        <w:rPr>
+          <w:rFonts w:ascii="Consolas" w:eastAsia="Consolas" w:hAnsi="Consolas" w:cs="Consolas"/>
+          <w:sz w:val="18"/>
+          <w:szCs w:val="18"/>
+        </w:rPr>
+        <w:t>if (!currentUser.isAdmin() &amp;&amp; !AccessControl.isOwner(student, currentUser)) {</w:t>
+      </w:r>
+    </w:p>
+    <w:p>
+      <w:pPr>
+        <w:pBdr>
+          <w:left w:val="single" w:sz="18" w:space="6" w:color="C0C0C0"/>
+        </w:pBdr>
+        <w:shd w:val="clear" w:color="auto" w:fill="F4F4F4"/>
+      </w:pPr>
+      <w:r>
+        <w:rPr>
+          <w:rFonts w:ascii="Consolas" w:eastAsia="Consolas" w:hAnsi="Consolas" w:cs="Consolas"/>
+          <w:sz w:val="18"/>
+          <w:szCs w:val="18"/>
+        </w:rPr>
+        <w:t xml:space="preserve">    throw new AccessDeniedException("</w:t>
+      </w:r>
+      <w:r>
+        <w:rPr>
+          <w:rFonts w:ascii="Consolas" w:eastAsia="Consolas" w:hAnsi="Consolas" w:cs="Consolas"/>
+          <w:sz w:val="18"/>
+          <w:szCs w:val="18"/>
+        </w:rPr>
+        <w:t>본인</w:t>
+      </w:r>
+      <w:r>
+        <w:rPr>
+          <w:rFonts w:ascii="Consolas" w:eastAsia="Consolas" w:hAnsi="Consolas" w:cs="Consolas"/>
+          <w:sz w:val="18"/>
+          <w:szCs w:val="18"/>
+        </w:rPr>
+        <w:t xml:space="preserve"> </w:t>
+      </w:r>
+      <w:r>
+        <w:rPr>
+          <w:rFonts w:ascii="Consolas" w:eastAsia="Consolas" w:hAnsi="Consolas" w:cs="Consolas"/>
+          <w:sz w:val="18"/>
+          <w:szCs w:val="18"/>
+        </w:rPr>
+        <w:t>정보만</w:t>
+      </w:r>
+      <w:r>
+        <w:rPr>
+          <w:rFonts w:ascii="Consolas" w:eastAsia="Consolas" w:hAnsi="Consolas" w:cs="Consolas"/>
+          <w:sz w:val="18"/>
+          <w:szCs w:val="18"/>
+        </w:rPr>
+        <w:t xml:space="preserve"> </w:t>
+      </w:r>
+      <w:r>
+        <w:rPr>
+          <w:rFonts w:ascii="Consolas" w:eastAsia="Consolas" w:hAnsi="Consolas" w:cs="Consolas"/>
+          <w:sz w:val="18"/>
+          <w:szCs w:val="18"/>
+        </w:rPr>
+        <w:t>조회할</w:t>
+      </w:r>
+      <w:r>
+        <w:rPr>
+          <w:rFonts w:ascii="Consolas" w:eastAsia="Consolas" w:hAnsi="Consolas" w:cs="Consolas"/>
+          <w:sz w:val="18"/>
+          <w:szCs w:val="18"/>
+        </w:rPr>
+        <w:t xml:space="preserve"> </w:t>
+      </w:r>
+      <w:r>
+        <w:rPr>
+          <w:rFonts w:ascii="Consolas" w:eastAsia="Consolas" w:hAnsi="Consolas" w:cs="Consolas"/>
+          <w:sz w:val="18"/>
+          <w:szCs w:val="18"/>
+        </w:rPr>
+        <w:t>수</w:t>
+      </w:r>
+      <w:r>
+        <w:rPr>
+          <w:rFonts w:ascii="Consolas" w:eastAsia="Consolas" w:hAnsi="Consolas" w:cs="Consolas"/>
+          <w:sz w:val="18"/>
+          <w:szCs w:val="18"/>
+        </w:rPr>
+        <w:t xml:space="preserve"> </w:t>
+      </w:r>
+      <w:r>
+        <w:rPr>
+          <w:rFonts w:ascii="Consolas" w:eastAsia="Consolas" w:hAnsi="Consolas" w:cs="Consolas"/>
+          <w:sz w:val="18"/>
+          <w:szCs w:val="18"/>
+        </w:rPr>
+        <w:t>있습니다</w:t>
+      </w:r>
+      <w:r>
+        <w:rPr>
+          <w:rFonts w:ascii="Consolas" w:eastAsia="Consolas" w:hAnsi="Consolas" w:cs="Consolas"/>
+          <w:sz w:val="18"/>
+          <w:szCs w:val="18"/>
+        </w:rPr>
+        <w:t>");</w:t>
+      </w:r>
+    </w:p>
+    <w:p>
+      <w:pPr>
+        <w:pBdr>
+          <w:left w:val="single" w:sz="18" w:space="6" w:color="C0C0C0"/>
+          <w:bottom w:val="single" w:sz="4" w:space="3" w:color="D9D9D9"/>
+        </w:pBdr>
+        <w:shd w:val="clear" w:color="auto" w:fill="F4F4F4"/>
+      </w:pPr>
+      <w:r>
+        <w:rPr>
+          <w:rFonts w:ascii="Consolas" w:eastAsia="Consolas" w:hAnsi="Consolas" w:cs="Consolas"/>
+          <w:sz w:val="18"/>
+          <w:szCs w:val="18"/>
+        </w:rPr>
+        <w:t>}</w:t>
+      </w:r>
+    </w:p>
+    <w:p>
+      <w:pPr>
+        <w:rPr>
+          <w:b/>
+          <w:bCs/>
+          <w:color w:val="2E5496"/>
+          <w:sz w:val="24"/>
+          <w:szCs w:val="24"/>
+        </w:rPr>
+      </w:pPr>
+      <w:r>
+        <w:rPr>
+          <w:b/>
+          <w:bCs/>
+          <w:color w:val="2E5496"/>
+        </w:rPr>
+        <w:br w:type="page"/>
+      </w:r>
+    </w:p>
+    <w:p>
+      <w:pPr>
+        <w:pStyle w:val="3"/>
+        <w:spacing w:before="200" w:after="90"/>
+      </w:pPr>
       <w:bookmarkStart w:id="0" w:name="_GoBack"/>
       <w:bookmarkEnd w:id="0"/>
       <w:r>
-        <w:t>(StudentController, StudentDetailController 동일 적용).</w:t>
+        <w:rPr>
+          <w:b/>
+          <w:bCs/>
+          <w:color w:val="2E5496"/>
+        </w:rPr>
+        <w:lastRenderedPageBreak/>
+        <w:t>실습: curl로 검증</w:t>
+      </w:r>
+    </w:p>
+    <w:p>
+      <w:pPr>
+        <w:spacing w:after="100" w:line="276" w:lineRule="auto"/>
+      </w:pPr>
+      <w:r>
+        <w:t>전체 목록 조회(GET /api/students)와 단건 조회 모두 역할·소유권에 따라 응답이 달라지는 것을 확인한다.</w:t>
+      </w:r>
+    </w:p>
+    <w:p>
+      <w:pPr>
+        <w:spacing w:after="100" w:line="276" w:lineRule="auto"/>
+      </w:pPr>
+      <w:r>
+        <w:t>(1) 관리자(admin@aa.com)로 전체 목록 조회 → 200</w:t>
       </w:r>
     </w:p>
     <w:p>
@@ -2689,23 +3369,39 @@
           <w:sz w:val="18"/>
           <w:szCs w:val="18"/>
         </w:rPr>
-        <w:t>if (!isAdmin(currentUser) &amp;&amp; !isOwner(student, currentUser)) {</w:t>
-      </w:r>
-    </w:p>
-    <w:p>
-      <w:pPr>
-        <w:pBdr>
-          <w:left w:val="single" w:sz="18" w:space="6" w:color="C0C0C0"/>
-        </w:pBdr>
-        <w:shd w:val="clear" w:color="auto" w:fill="F4F4F4"/>
-      </w:pPr>
-      <w:r>
-        <w:rPr>
-          <w:rFonts w:ascii="Consolas" w:eastAsia="Consolas" w:hAnsi="Consolas" w:cs="Consolas"/>
-          <w:sz w:val="18"/>
-          <w:szCs w:val="18"/>
-        </w:rPr>
-        <w:t xml:space="preserve">    throw new AccessDeniedException("본인 정보만 조회할 수 있습니다");</w:t>
+        <w:t>ADMIN_TOKEN=$(curl -s -X POST http://localhost:8080/api/userinfos/login \</w:t>
+      </w:r>
+    </w:p>
+    <w:p>
+      <w:pPr>
+        <w:pBdr>
+          <w:left w:val="single" w:sz="18" w:space="6" w:color="C0C0C0"/>
+        </w:pBdr>
+        <w:shd w:val="clear" w:color="auto" w:fill="F4F4F4"/>
+      </w:pPr>
+      <w:r>
+        <w:rPr>
+          <w:rFonts w:ascii="Consolas" w:eastAsia="Consolas" w:hAnsi="Consolas" w:cs="Consolas"/>
+          <w:sz w:val="18"/>
+          <w:szCs w:val="18"/>
+        </w:rPr>
+        <w:t xml:space="preserve">  -H "Content-Type: application/json" \</w:t>
+      </w:r>
+    </w:p>
+    <w:p>
+      <w:pPr>
+        <w:pBdr>
+          <w:left w:val="single" w:sz="18" w:space="6" w:color="C0C0C0"/>
+        </w:pBdr>
+        <w:shd w:val="clear" w:color="auto" w:fill="F4F4F4"/>
+      </w:pPr>
+      <w:r>
+        <w:rPr>
+          <w:rFonts w:ascii="Consolas" w:eastAsia="Consolas" w:hAnsi="Consolas" w:cs="Consolas"/>
+          <w:sz w:val="18"/>
+          <w:szCs w:val="18"/>
+        </w:rPr>
+        <w:t xml:space="preserve">  -d '{"email":"admin@aa.com","password":"pwd1"}' \</w:t>
       </w:r>
     </w:p>
     <w:p>
@@ -2722,7 +3418,43 @@
           <w:sz w:val="18"/>
           <w:szCs w:val="18"/>
         </w:rPr>
-        <w:t>}</w:t>
+        <w:t xml:space="preserve">  | sed -n 's/.*"accessToken":"\([^"]*\)".*/\1/p')</w:t>
+      </w:r>
+    </w:p>
+    <w:p>
+      <w:pPr>
+        <w:pBdr>
+          <w:top w:val="single" w:sz="4" w:space="3" w:color="D9D9D9"/>
+          <w:left w:val="single" w:sz="18" w:space="6" w:color="C0C0C0"/>
+          <w:bottom w:val="single" w:sz="4" w:space="3" w:color="D9D9D9"/>
+        </w:pBdr>
+        <w:shd w:val="clear" w:color="auto" w:fill="F4F4F4"/>
+      </w:pPr>
+      <w:r>
+        <w:rPr>
+          <w:rFonts w:ascii="Consolas" w:eastAsia="Consolas" w:hAnsi="Consolas" w:cs="Consolas"/>
+          <w:sz w:val="18"/>
+          <w:szCs w:val="18"/>
+        </w:rPr>
+        <w:t>curl -H "Authorization: Bearer $ADMIN_TOKEN" http://localhost:8080/api/students</w:t>
+      </w:r>
+    </w:p>
+    <w:p>
+      <w:pPr>
+        <w:pBdr>
+          <w:top w:val="single" w:sz="4" w:space="3" w:color="D9D9D9"/>
+          <w:left w:val="single" w:sz="18" w:space="6" w:color="C0C0C0"/>
+          <w:bottom w:val="single" w:sz="4" w:space="3" w:color="D9D9D9"/>
+        </w:pBdr>
+        <w:shd w:val="clear" w:color="auto" w:fill="F4F4F4"/>
+      </w:pPr>
+      <w:r>
+        <w:rPr>
+          <w:rFonts w:ascii="Consolas" w:eastAsia="Consolas" w:hAnsi="Consolas" w:cs="Consolas"/>
+          <w:sz w:val="18"/>
+          <w:szCs w:val="18"/>
+        </w:rPr>
+        <w:t>HTTP 200  (전체 학생 목록이 그대로 반환된다)</w:t>
       </w:r>
     </w:p>
     <w:p>
@@ -2730,510 +3462,273 @@
         <w:spacing w:after="100" w:line="276" w:lineRule="auto"/>
       </w:pPr>
       <w:r>
-        <w:t>위</w:t>
-      </w:r>
-      <w:r>
+        <w:t>(2) 일반 사용자(user@aa.com)로 전체 목록 조회 → 403</w:t>
+      </w:r>
+    </w:p>
+    <w:p>
+      <w:pPr>
+        <w:pBdr>
+          <w:top w:val="single" w:sz="4" w:space="3" w:color="D9D9D9"/>
+          <w:left w:val="single" w:sz="18" w:space="6" w:color="C0C0C0"/>
+          <w:bottom w:val="single" w:sz="4" w:space="3" w:color="D9D9D9"/>
+        </w:pBdr>
+        <w:shd w:val="clear" w:color="auto" w:fill="F4F4F4"/>
+      </w:pPr>
+      <w:r>
+        <w:rPr>
+          <w:rFonts w:ascii="Consolas" w:eastAsia="Consolas" w:hAnsi="Consolas" w:cs="Consolas"/>
+          <w:sz w:val="18"/>
+          <w:szCs w:val="18"/>
+        </w:rPr>
+        <w:t>curl -H "Authorization: Bearer $USER_TOKEN" http://localhost:8080/api/students</w:t>
+      </w:r>
+    </w:p>
+    <w:p>
+      <w:pPr>
+        <w:pBdr>
+          <w:top w:val="single" w:sz="4" w:space="3" w:color="D9D9D9"/>
+          <w:left w:val="single" w:sz="18" w:space="6" w:color="C0C0C0"/>
+          <w:bottom w:val="single" w:sz="4" w:space="3" w:color="D9D9D9"/>
+        </w:pBdr>
+        <w:shd w:val="clear" w:color="auto" w:fill="F4F4F4"/>
+      </w:pPr>
+      <w:r>
+        <w:rPr>
+          <w:rFonts w:ascii="Consolas" w:eastAsia="Consolas" w:hAnsi="Consolas" w:cs="Consolas"/>
+          <w:sz w:val="18"/>
+          <w:szCs w:val="18"/>
+        </w:rPr>
+        <w:t>{"statusCode":403,"message":"Access Denied", ...}</w:t>
+      </w:r>
+    </w:p>
+    <w:p>
+      <w:pPr>
+        <w:spacing w:after="100" w:line="276" w:lineRule="auto"/>
+      </w:pPr>
+      <w:r>
+        <w:t>(3) 일반 사용자(user@aa.com)로 단건 조회(학생 1번) → 403</w:t>
+      </w:r>
+    </w:p>
+    <w:p>
+      <w:pPr>
+        <w:pBdr>
+          <w:top w:val="single" w:sz="4" w:space="3" w:color="D9D9D9"/>
+          <w:left w:val="single" w:sz="18" w:space="6" w:color="C0C0C0"/>
+          <w:bottom w:val="single" w:sz="4" w:space="3" w:color="D9D9D9"/>
+        </w:pBdr>
+        <w:shd w:val="clear" w:color="auto" w:fill="F4F4F4"/>
+      </w:pPr>
+      <w:r>
+        <w:rPr>
+          <w:rFonts w:ascii="Consolas" w:eastAsia="Consolas" w:hAnsi="Consolas" w:cs="Consolas"/>
+          <w:sz w:val="18"/>
+          <w:szCs w:val="18"/>
+        </w:rPr>
+        <w:t>curl -H "Authorization: Bearer $USER_TOKEN" http://localhost:8080/api/students/1</w:t>
+      </w:r>
+    </w:p>
+    <w:p>
+      <w:pPr>
+        <w:pBdr>
+          <w:top w:val="single" w:sz="4" w:space="3" w:color="D9D9D9"/>
+          <w:left w:val="single" w:sz="18" w:space="6" w:color="C0C0C0"/>
+          <w:bottom w:val="single" w:sz="4" w:space="3" w:color="D9D9D9"/>
+        </w:pBdr>
+        <w:shd w:val="clear" w:color="auto" w:fill="F4F4F4"/>
+      </w:pPr>
+      <w:r>
+        <w:rPr>
+          <w:rFonts w:ascii="Consolas" w:eastAsia="Consolas" w:hAnsi="Consolas" w:cs="Consolas"/>
+          <w:sz w:val="18"/>
+          <w:szCs w:val="18"/>
+        </w:rPr>
+        <w:t>{"statusCode":403,"message":"본인 정보만 조회할 수 있습니다", ...}</w:t>
+      </w:r>
+    </w:p>
+    <w:p>
+      <w:pPr>
+        <w:spacing w:after="100" w:line="276" w:lineRule="auto"/>
+      </w:pPr>
+      <w:r>
+        <w:t>본인 소유 계정(cs001@aa.com, 1번 학생 Alice의 소유자)으로 로그인한다.</w:t>
+      </w:r>
+    </w:p>
+    <w:p>
+      <w:pPr>
+        <w:pBdr>
+          <w:top w:val="single" w:sz="4" w:space="3" w:color="D9D9D9"/>
+          <w:left w:val="single" w:sz="18" w:space="6" w:color="C0C0C0"/>
+        </w:pBdr>
+        <w:shd w:val="clear" w:color="auto" w:fill="F4F4F4"/>
+      </w:pPr>
+      <w:r>
+        <w:rPr>
+          <w:rFonts w:ascii="Consolas" w:eastAsia="Consolas" w:hAnsi="Consolas" w:cs="Consolas"/>
+          <w:sz w:val="18"/>
+          <w:szCs w:val="18"/>
+        </w:rPr>
+        <w:t>TOKEN=$(curl -s -X POST http://localhost:8080/api/userinfos/login \</w:t>
+      </w:r>
+    </w:p>
+    <w:p>
+      <w:pPr>
+        <w:pBdr>
+          <w:left w:val="single" w:sz="18" w:space="6" w:color="C0C0C0"/>
+        </w:pBdr>
+        <w:shd w:val="clear" w:color="auto" w:fill="F4F4F4"/>
+      </w:pPr>
+      <w:r>
+        <w:rPr>
+          <w:rFonts w:ascii="Consolas" w:eastAsia="Consolas" w:hAnsi="Consolas" w:cs="Consolas"/>
+          <w:sz w:val="18"/>
+          <w:szCs w:val="18"/>
+        </w:rPr>
+        <w:t xml:space="preserve">  -H "Content-Type: application/json" \</w:t>
+      </w:r>
+    </w:p>
+    <w:p>
+      <w:pPr>
+        <w:pBdr>
+          <w:left w:val="single" w:sz="18" w:space="6" w:color="C0C0C0"/>
+        </w:pBdr>
+        <w:shd w:val="clear" w:color="auto" w:fill="F4F4F4"/>
+      </w:pPr>
+      <w:r>
+        <w:rPr>
+          <w:rFonts w:ascii="Consolas" w:eastAsia="Consolas" w:hAnsi="Consolas" w:cs="Consolas"/>
+          <w:sz w:val="18"/>
+          <w:szCs w:val="18"/>
+        </w:rPr>
+        <w:t xml:space="preserve">  -d '{"email":"cs001@aa.com","password":"pwd1234"}' \</w:t>
+      </w:r>
+    </w:p>
+    <w:p>
+      <w:pPr>
+        <w:pBdr>
+          <w:left w:val="single" w:sz="18" w:space="6" w:color="C0C0C0"/>
+          <w:bottom w:val="single" w:sz="4" w:space="3" w:color="D9D9D9"/>
+        </w:pBdr>
+        <w:shd w:val="clear" w:color="auto" w:fill="F4F4F4"/>
+      </w:pPr>
+      <w:r>
+        <w:rPr>
+          <w:rFonts w:ascii="Consolas" w:eastAsia="Consolas" w:hAnsi="Consolas" w:cs="Consolas"/>
+          <w:sz w:val="18"/>
+          <w:szCs w:val="18"/>
+        </w:rPr>
+        <w:t xml:space="preserve">  | sed -n 's/.*"accessToken":"\([^"]*\)".*/\1/p')</w:t>
+      </w:r>
+    </w:p>
+    <w:p>
+      <w:pPr>
+        <w:spacing w:after="100" w:line="276" w:lineRule="auto"/>
+      </w:pPr>
+      <w:r>
+        <w:t>본인 학생(1번) 조회 → 200</w:t>
+      </w:r>
+    </w:p>
+    <w:p>
+      <w:pPr>
+        <w:pBdr>
+          <w:top w:val="single" w:sz="4" w:space="3" w:color="D9D9D9"/>
+          <w:left w:val="single" w:sz="18" w:space="6" w:color="C0C0C0"/>
+          <w:bottom w:val="single" w:sz="4" w:space="3" w:color="D9D9D9"/>
+        </w:pBdr>
+        <w:shd w:val="clear" w:color="auto" w:fill="F4F4F4"/>
+      </w:pPr>
+      <w:r>
+        <w:rPr>
+          <w:rFonts w:ascii="Consolas" w:eastAsia="Consolas" w:hAnsi="Consolas" w:cs="Consolas"/>
+          <w:sz w:val="18"/>
+          <w:szCs w:val="18"/>
+        </w:rPr>
+        <w:t>curl -H "Authorization: Bearer $TOKEN" http://localhost:8080/api/students/1</w:t>
+      </w:r>
+    </w:p>
+    <w:p>
+      <w:pPr>
+        <w:pBdr>
+          <w:top w:val="single" w:sz="4" w:space="3" w:color="D9D9D9"/>
+          <w:left w:val="single" w:sz="18" w:space="6" w:color="C0C0C0"/>
+          <w:bottom w:val="single" w:sz="4" w:space="3" w:color="D9D9D9"/>
+        </w:pBdr>
+        <w:shd w:val="clear" w:color="auto" w:fill="F4F4F4"/>
+      </w:pPr>
+      <w:r>
+        <w:rPr>
+          <w:rFonts w:ascii="Consolas" w:eastAsia="Consolas" w:hAnsi="Consolas" w:cs="Consolas"/>
+          <w:sz w:val="18"/>
+          <w:szCs w:val="18"/>
+        </w:rPr>
+        <w:t>{"id":1,"name":"Alice Johnson","studentNumber":"CS001","department":{"id":1,"name":"Computer Science","code":"CS"},"detail":{"id":1,"address":"123 Tech Street","phoneNumber":"010-1234-5678","email":"alice@example.com","dateOfBirth":"1998-03-15"}}</w:t>
+      </w:r>
+    </w:p>
+    <w:p>
+      <w:pPr>
+        <w:spacing w:after="100" w:line="276" w:lineRule="auto"/>
+      </w:pPr>
+      <w:r>
+        <w:t>타인 학생(2번, Bob) 조회 → 403</w:t>
+      </w:r>
+    </w:p>
+    <w:p>
+      <w:pPr>
+        <w:pBdr>
+          <w:top w:val="single" w:sz="4" w:space="3" w:color="D9D9D9"/>
+          <w:left w:val="single" w:sz="18" w:space="6" w:color="C0C0C0"/>
+          <w:bottom w:val="single" w:sz="4" w:space="3" w:color="D9D9D9"/>
+        </w:pBdr>
+        <w:shd w:val="clear" w:color="auto" w:fill="F4F4F4"/>
+      </w:pPr>
+      <w:r>
+        <w:rPr>
+          <w:rFonts w:ascii="Consolas" w:eastAsia="Consolas" w:hAnsi="Consolas" w:cs="Consolas"/>
+          <w:sz w:val="18"/>
+          <w:szCs w:val="18"/>
+        </w:rPr>
+        <w:t>curl -H "Authorization: Bearer $TOKEN" http://localhost:8080/api/students/2</w:t>
+      </w:r>
+    </w:p>
+    <w:p>
+      <w:pPr>
+        <w:pBdr>
+          <w:top w:val="single" w:sz="4" w:space="3" w:color="D9D9D9"/>
+          <w:left w:val="single" w:sz="18" w:space="6" w:color="C0C0C0"/>
+          <w:bottom w:val="single" w:sz="4" w:space="3" w:color="D9D9D9"/>
+        </w:pBdr>
+        <w:shd w:val="clear" w:color="auto" w:fill="F4F4F4"/>
+      </w:pPr>
+      <w:r>
+        <w:rPr>
+          <w:rFonts w:ascii="Consolas" w:eastAsia="Consolas" w:hAnsi="Consolas" w:cs="Consolas"/>
+          <w:sz w:val="18"/>
+          <w:szCs w:val="18"/>
+        </w:rPr>
+        <w:t>{"statusCode":403,"message":"본인 정보만 조회할 수 있습니다", ...}</w:t>
+      </w:r>
+    </w:p>
+    <w:p>
+      <w:pPr>
+        <w:spacing w:after="100" w:line="276" w:lineRule="auto"/>
+      </w:pPr>
+      <w:r>
+        <w:rPr>
+          <w:b/>
+          <w:bCs/>
+        </w:rPr>
+        <w:t xml:space="preserve">참고: </w:t>
+      </w:r>
+      <w:r>
+        <w:t>자신의 학생이 없는 일반 사용자(user@aa.com)로 로그인</w:t>
+      </w:r>
+      <w:r>
+        <w:rPr>
+          <w:rFonts w:hint="eastAsia"/>
+        </w:rPr>
         <w:t xml:space="preserve"> </w:t>
       </w:r>
       <w:r>
-        <w:t>코드는</w:t>
-      </w:r>
-      <w:r>
-        <w:t xml:space="preserve"> </w:t>
-      </w:r>
-      <w:r>
-        <w:rPr>
-          <w:b/>
-          <w:bCs/>
-        </w:rPr>
-        <w:t>StudentService</w:t>
-      </w:r>
-      <w:r>
-        <w:t xml:space="preserve"> </w:t>
-      </w:r>
-      <w:r>
-        <w:t>클래스의</w:t>
-      </w:r>
-      <w:r>
-        <w:t xml:space="preserve"> getStudentById()/getStudentByStudentNumber() </w:t>
-      </w:r>
-      <w:r>
-        <w:t>에</w:t>
-      </w:r>
-      <w:r>
-        <w:t xml:space="preserve"> </w:t>
-      </w:r>
-      <w:r>
-        <w:t>있으며</w:t>
-      </w:r>
-      <w:r>
-        <w:t xml:space="preserve">, </w:t>
-      </w:r>
-      <w:r>
-        <w:t>아래</w:t>
-      </w:r>
-      <w:r>
-        <w:t xml:space="preserve"> </w:t>
-      </w:r>
-      <w:r>
-        <w:t>두</w:t>
-      </w:r>
-      <w:r>
-        <w:t xml:space="preserve"> private </w:t>
-      </w:r>
-      <w:r>
-        <w:t>메서드를</w:t>
-      </w:r>
-      <w:r>
-        <w:t xml:space="preserve"> </w:t>
-      </w:r>
-      <w:r>
-        <w:t>사용한다</w:t>
-      </w:r>
-      <w:r>
-        <w:t>.</w:t>
-      </w:r>
-    </w:p>
-    <w:p>
-      <w:pPr>
-        <w:pBdr>
-          <w:top w:val="single" w:sz="4" w:space="3" w:color="D9D9D9"/>
-          <w:left w:val="single" w:sz="18" w:space="6" w:color="C0C0C0"/>
-        </w:pBdr>
-        <w:shd w:val="clear" w:color="auto" w:fill="F4F4F4"/>
-      </w:pPr>
-      <w:r>
-        <w:rPr>
-          <w:rFonts w:ascii="Consolas" w:eastAsia="Consolas" w:hAnsi="Consolas" w:cs="Consolas"/>
-          <w:sz w:val="18"/>
-          <w:szCs w:val="18"/>
-        </w:rPr>
-        <w:t xml:space="preserve">// roles </w:t>
-      </w:r>
-      <w:r>
-        <w:rPr>
-          <w:rFonts w:ascii="Consolas" w:eastAsia="Consolas" w:hAnsi="Consolas" w:cs="Consolas"/>
-          <w:sz w:val="18"/>
-          <w:szCs w:val="18"/>
-        </w:rPr>
-        <w:t>는</w:t>
-      </w:r>
-      <w:r>
-        <w:rPr>
-          <w:rFonts w:ascii="Consolas" w:eastAsia="Consolas" w:hAnsi="Consolas" w:cs="Consolas"/>
-          <w:sz w:val="18"/>
-          <w:szCs w:val="18"/>
-        </w:rPr>
-        <w:t xml:space="preserve"> "ROLE_USER" </w:t>
-      </w:r>
-      <w:r>
-        <w:rPr>
-          <w:rFonts w:ascii="Consolas" w:eastAsia="Consolas" w:hAnsi="Consolas" w:cs="Consolas"/>
-          <w:sz w:val="18"/>
-          <w:szCs w:val="18"/>
-        </w:rPr>
-        <w:t>또는</w:t>
-      </w:r>
-      <w:r>
-        <w:rPr>
-          <w:rFonts w:ascii="Consolas" w:eastAsia="Consolas" w:hAnsi="Consolas" w:cs="Consolas"/>
-          <w:sz w:val="18"/>
-          <w:szCs w:val="18"/>
-        </w:rPr>
-        <w:t xml:space="preserve"> "ROLE_ADMIN,ROLE_USER" </w:t>
-      </w:r>
-      <w:r>
-        <w:rPr>
-          <w:rFonts w:ascii="Consolas" w:eastAsia="Consolas" w:hAnsi="Consolas" w:cs="Consolas"/>
-          <w:sz w:val="18"/>
-          <w:szCs w:val="18"/>
-        </w:rPr>
-        <w:t>처럼</w:t>
-      </w:r>
-      <w:r>
-        <w:rPr>
-          <w:rFonts w:ascii="Consolas" w:eastAsia="Consolas" w:hAnsi="Consolas" w:cs="Consolas"/>
-          <w:sz w:val="18"/>
-          <w:szCs w:val="18"/>
-        </w:rPr>
-        <w:t xml:space="preserve"> </w:t>
-      </w:r>
-      <w:r>
-        <w:rPr>
-          <w:rFonts w:ascii="Consolas" w:eastAsia="Consolas" w:hAnsi="Consolas" w:cs="Consolas"/>
-          <w:sz w:val="18"/>
-          <w:szCs w:val="18"/>
-        </w:rPr>
-        <w:t>쉼표로</w:t>
-      </w:r>
-      <w:r>
-        <w:rPr>
-          <w:rFonts w:ascii="Consolas" w:eastAsia="Consolas" w:hAnsi="Consolas" w:cs="Consolas"/>
-          <w:sz w:val="18"/>
-          <w:szCs w:val="18"/>
-        </w:rPr>
-        <w:t xml:space="preserve"> </w:t>
-      </w:r>
-      <w:r>
-        <w:rPr>
-          <w:rFonts w:ascii="Consolas" w:eastAsia="Consolas" w:hAnsi="Consolas" w:cs="Consolas"/>
-          <w:sz w:val="18"/>
-          <w:szCs w:val="18"/>
-        </w:rPr>
-        <w:t>구분된</w:t>
-      </w:r>
-      <w:r>
-        <w:rPr>
-          <w:rFonts w:ascii="Consolas" w:eastAsia="Consolas" w:hAnsi="Consolas" w:cs="Consolas"/>
-          <w:sz w:val="18"/>
-          <w:szCs w:val="18"/>
-        </w:rPr>
-        <w:t xml:space="preserve"> </w:t>
-      </w:r>
-      <w:r>
-        <w:rPr>
-          <w:rFonts w:ascii="Consolas" w:eastAsia="Consolas" w:hAnsi="Consolas" w:cs="Consolas"/>
-          <w:sz w:val="18"/>
-          <w:szCs w:val="18"/>
-        </w:rPr>
-        <w:t>문자열이다</w:t>
-      </w:r>
-    </w:p>
-    <w:p>
-      <w:pPr>
-        <w:pBdr>
-          <w:left w:val="single" w:sz="18" w:space="6" w:color="C0C0C0"/>
-        </w:pBdr>
-        <w:shd w:val="clear" w:color="auto" w:fill="F4F4F4"/>
-      </w:pPr>
-      <w:r>
-        <w:rPr>
-          <w:rFonts w:ascii="Consolas" w:eastAsia="Consolas" w:hAnsi="Consolas" w:cs="Consolas"/>
-          <w:sz w:val="18"/>
-          <w:szCs w:val="18"/>
-        </w:rPr>
-        <w:t>private boolean isAdmin(UserInfo user) {</w:t>
-      </w:r>
-    </w:p>
-    <w:p>
-      <w:pPr>
-        <w:pBdr>
-          <w:left w:val="single" w:sz="18" w:space="6" w:color="C0C0C0"/>
-        </w:pBdr>
-        <w:shd w:val="clear" w:color="auto" w:fill="F4F4F4"/>
-      </w:pPr>
-      <w:r>
-        <w:rPr>
-          <w:rFonts w:ascii="Consolas" w:eastAsia="Consolas" w:hAnsi="Consolas" w:cs="Consolas"/>
-          <w:sz w:val="18"/>
-          <w:szCs w:val="18"/>
-        </w:rPr>
-        <w:t xml:space="preserve">    String roles = user.getRoles()</w:t>
-      </w:r>
-      <w:r>
-        <w:rPr>
-          <w:rFonts w:ascii="Consolas" w:eastAsia="Consolas" w:hAnsi="Consolas" w:cs="Consolas"/>
-          <w:sz w:val="18"/>
-          <w:szCs w:val="18"/>
-        </w:rPr>
-        <w:t xml:space="preserve"> == null ? "" : user.getRoles();</w:t>
-      </w:r>
-    </w:p>
-    <w:p>
-      <w:pPr>
-        <w:pBdr>
-          <w:left w:val="single" w:sz="18" w:space="6" w:color="C0C0C0"/>
-        </w:pBdr>
-        <w:shd w:val="clear" w:color="auto" w:fill="F4F4F4"/>
-      </w:pPr>
-      <w:r>
-        <w:rPr>
-          <w:rFonts w:ascii="Consolas" w:eastAsia="Consolas" w:hAnsi="Consolas" w:cs="Consolas"/>
-          <w:sz w:val="18"/>
-          <w:szCs w:val="18"/>
-        </w:rPr>
-        <w:t xml:space="preserve">    return Arrays.stream(roles.split(","))</w:t>
-      </w:r>
-    </w:p>
-    <w:p>
-      <w:pPr>
-        <w:pBdr>
-          <w:left w:val="single" w:sz="18" w:space="6" w:color="C0C0C0"/>
-        </w:pBdr>
-        <w:shd w:val="clear" w:color="auto" w:fill="F4F4F4"/>
-      </w:pPr>
-      <w:r>
-        <w:rPr>
-          <w:rFonts w:ascii="Consolas" w:eastAsia="Consolas" w:hAnsi="Consolas" w:cs="Consolas"/>
-          <w:sz w:val="18"/>
-          <w:szCs w:val="18"/>
-        </w:rPr>
-        <w:t xml:space="preserve">            .map(String::trim)</w:t>
-      </w:r>
-    </w:p>
-    <w:p>
-      <w:pPr>
-        <w:pBdr>
-          <w:left w:val="single" w:sz="18" w:space="6" w:color="C0C0C0"/>
-        </w:pBdr>
-        <w:shd w:val="clear" w:color="auto" w:fill="F4F4F4"/>
-      </w:pPr>
-      <w:r>
-        <w:rPr>
-          <w:rFonts w:ascii="Consolas" w:eastAsia="Consolas" w:hAnsi="Consolas" w:cs="Consolas"/>
-          <w:sz w:val="18"/>
-          <w:szCs w:val="18"/>
-        </w:rPr>
-        <w:t xml:space="preserve">            .anyMatch("ROLE_ADMIN"::equals);</w:t>
-      </w:r>
-    </w:p>
-    <w:p>
-      <w:pPr>
-        <w:pBdr>
-          <w:left w:val="single" w:sz="18" w:space="6" w:color="C0C0C0"/>
-        </w:pBdr>
-        <w:shd w:val="clear" w:color="auto" w:fill="F4F4F4"/>
-      </w:pPr>
-      <w:r>
-        <w:rPr>
-          <w:rFonts w:ascii="Consolas" w:eastAsia="Consolas" w:hAnsi="Consolas" w:cs="Consolas"/>
-          <w:sz w:val="18"/>
-          <w:szCs w:val="18"/>
-        </w:rPr>
-        <w:t>}</w:t>
-      </w:r>
-    </w:p>
-    <w:p>
-      <w:pPr>
-        <w:pBdr>
-          <w:left w:val="single" w:sz="18" w:space="6" w:color="C0C0C0"/>
-        </w:pBdr>
-        <w:shd w:val="clear" w:color="auto" w:fill="F4F4F4"/>
-      </w:pPr>
-    </w:p>
-    <w:p>
-      <w:pPr>
-        <w:pBdr>
-          <w:left w:val="single" w:sz="18" w:space="6" w:color="C0C0C0"/>
-        </w:pBdr>
-        <w:shd w:val="clear" w:color="auto" w:fill="F4F4F4"/>
-      </w:pPr>
-      <w:r>
-        <w:rPr>
-          <w:rFonts w:ascii="Consolas" w:eastAsia="Consolas" w:hAnsi="Consolas" w:cs="Consolas"/>
-          <w:sz w:val="18"/>
-          <w:szCs w:val="18"/>
-        </w:rPr>
-        <w:t xml:space="preserve">// </w:t>
-      </w:r>
-      <w:r>
-        <w:rPr>
-          <w:rFonts w:ascii="Consolas" w:eastAsia="Consolas" w:hAnsi="Consolas" w:cs="Consolas"/>
-          <w:sz w:val="18"/>
-          <w:szCs w:val="18"/>
-        </w:rPr>
-        <w:t>학생을</w:t>
-      </w:r>
-      <w:r>
-        <w:rPr>
-          <w:rFonts w:ascii="Consolas" w:eastAsia="Consolas" w:hAnsi="Consolas" w:cs="Consolas"/>
-          <w:sz w:val="18"/>
-          <w:szCs w:val="18"/>
-        </w:rPr>
-        <w:t xml:space="preserve"> </w:t>
-      </w:r>
-      <w:r>
-        <w:rPr>
-          <w:rFonts w:ascii="Consolas" w:eastAsia="Consolas" w:hAnsi="Consolas" w:cs="Consolas"/>
-          <w:sz w:val="18"/>
-          <w:szCs w:val="18"/>
-        </w:rPr>
-        <w:t>등록한</w:t>
-      </w:r>
-      <w:r>
-        <w:rPr>
-          <w:rFonts w:ascii="Consolas" w:eastAsia="Consolas" w:hAnsi="Consolas" w:cs="Consolas"/>
-          <w:sz w:val="18"/>
-          <w:szCs w:val="18"/>
-        </w:rPr>
-        <w:t xml:space="preserve"> </w:t>
-      </w:r>
-      <w:r>
-        <w:rPr>
-          <w:rFonts w:ascii="Consolas" w:eastAsia="Consolas" w:hAnsi="Consolas" w:cs="Consolas"/>
-          <w:sz w:val="18"/>
-          <w:szCs w:val="18"/>
-        </w:rPr>
-        <w:t>사용자</w:t>
-      </w:r>
-      <w:r>
-        <w:rPr>
-          <w:rFonts w:ascii="Consolas" w:eastAsia="Consolas" w:hAnsi="Consolas" w:cs="Consolas"/>
-          <w:sz w:val="18"/>
-          <w:szCs w:val="18"/>
-        </w:rPr>
-        <w:t xml:space="preserve">(student.userInfo) </w:t>
-      </w:r>
-      <w:r>
-        <w:rPr>
-          <w:rFonts w:ascii="Consolas" w:eastAsia="Consolas" w:hAnsi="Consolas" w:cs="Consolas"/>
-          <w:sz w:val="18"/>
-          <w:szCs w:val="18"/>
-        </w:rPr>
-        <w:t>와</w:t>
-      </w:r>
-      <w:r>
-        <w:rPr>
-          <w:rFonts w:ascii="Consolas" w:eastAsia="Consolas" w:hAnsi="Consolas" w:cs="Consolas"/>
-          <w:sz w:val="18"/>
-          <w:szCs w:val="18"/>
-        </w:rPr>
-        <w:t xml:space="preserve"> </w:t>
-      </w:r>
-      <w:r>
-        <w:rPr>
-          <w:rFonts w:ascii="Consolas" w:eastAsia="Consolas" w:hAnsi="Consolas" w:cs="Consolas"/>
-          <w:sz w:val="18"/>
-          <w:szCs w:val="18"/>
-        </w:rPr>
-        <w:t>현재</w:t>
-      </w:r>
-      <w:r>
-        <w:rPr>
-          <w:rFonts w:ascii="Consolas" w:eastAsia="Consolas" w:hAnsi="Consolas" w:cs="Consolas"/>
-          <w:sz w:val="18"/>
-          <w:szCs w:val="18"/>
-        </w:rPr>
-        <w:t xml:space="preserve"> </w:t>
-      </w:r>
-      <w:r>
-        <w:rPr>
-          <w:rFonts w:ascii="Consolas" w:eastAsia="Consolas" w:hAnsi="Consolas" w:cs="Consolas"/>
-          <w:sz w:val="18"/>
-          <w:szCs w:val="18"/>
-        </w:rPr>
-        <w:t>로그인한</w:t>
-      </w:r>
-      <w:r>
-        <w:rPr>
-          <w:rFonts w:ascii="Consolas" w:eastAsia="Consolas" w:hAnsi="Consolas" w:cs="Consolas"/>
-          <w:sz w:val="18"/>
-          <w:szCs w:val="18"/>
-        </w:rPr>
-        <w:t xml:space="preserve"> </w:t>
-      </w:r>
-      <w:r>
-        <w:rPr>
-          <w:rFonts w:ascii="Consolas" w:eastAsia="Consolas" w:hAnsi="Consolas" w:cs="Consolas"/>
-          <w:sz w:val="18"/>
-          <w:szCs w:val="18"/>
-        </w:rPr>
-        <w:t>사용자가</w:t>
-      </w:r>
-      <w:r>
-        <w:rPr>
-          <w:rFonts w:ascii="Consolas" w:eastAsia="Consolas" w:hAnsi="Consolas" w:cs="Consolas"/>
-          <w:sz w:val="18"/>
-          <w:szCs w:val="18"/>
-        </w:rPr>
-        <w:t xml:space="preserve"> </w:t>
-      </w:r>
-      <w:r>
-        <w:rPr>
-          <w:rFonts w:ascii="Consolas" w:eastAsia="Consolas" w:hAnsi="Consolas" w:cs="Consolas"/>
-          <w:sz w:val="18"/>
-          <w:szCs w:val="18"/>
-        </w:rPr>
-        <w:t>같은지</w:t>
-      </w:r>
-      <w:r>
-        <w:rPr>
-          <w:rFonts w:ascii="Consolas" w:eastAsia="Consolas" w:hAnsi="Consolas" w:cs="Consolas"/>
-          <w:sz w:val="18"/>
-          <w:szCs w:val="18"/>
-        </w:rPr>
-        <w:t xml:space="preserve"> </w:t>
-      </w:r>
-      <w:r>
-        <w:rPr>
-          <w:rFonts w:ascii="Consolas" w:eastAsia="Consolas" w:hAnsi="Consolas" w:cs="Consolas"/>
-          <w:sz w:val="18"/>
-          <w:szCs w:val="18"/>
-        </w:rPr>
-        <w:t>확인한다</w:t>
-      </w:r>
-    </w:p>
-    <w:p>
-      <w:pPr>
-        <w:pBdr>
-          <w:left w:val="single" w:sz="18" w:space="6" w:color="C0C0C0"/>
-        </w:pBdr>
-        <w:shd w:val="clear" w:color="auto" w:fill="F4F4F4"/>
-      </w:pPr>
-      <w:r>
-        <w:rPr>
-          <w:rFonts w:ascii="Consolas" w:eastAsia="Consolas" w:hAnsi="Consolas" w:cs="Consolas"/>
-          <w:sz w:val="18"/>
-          <w:szCs w:val="18"/>
-        </w:rPr>
-        <w:t>private boolean isOwner(Student student, Use</w:t>
-      </w:r>
-      <w:r>
-        <w:rPr>
-          <w:rFonts w:ascii="Consolas" w:eastAsia="Consolas" w:hAnsi="Consolas" w:cs="Consolas"/>
-          <w:sz w:val="18"/>
-          <w:szCs w:val="18"/>
-        </w:rPr>
-        <w:t>rInfo user) {</w:t>
-      </w:r>
-    </w:p>
-    <w:p>
-      <w:pPr>
-        <w:pBdr>
-          <w:left w:val="single" w:sz="18" w:space="6" w:color="C0C0C0"/>
-        </w:pBdr>
-        <w:shd w:val="clear" w:color="auto" w:fill="F4F4F4"/>
-      </w:pPr>
-      <w:r>
-        <w:rPr>
-          <w:rFonts w:ascii="Consolas" w:eastAsia="Consolas" w:hAnsi="Consolas" w:cs="Consolas"/>
-          <w:sz w:val="18"/>
-          <w:szCs w:val="18"/>
-        </w:rPr>
-        <w:t xml:space="preserve">    return student.getUserInfo() != null</w:t>
-      </w:r>
-    </w:p>
-    <w:p>
-      <w:pPr>
-        <w:pBdr>
-          <w:left w:val="single" w:sz="18" w:space="6" w:color="C0C0C0"/>
-        </w:pBdr>
-        <w:shd w:val="clear" w:color="auto" w:fill="F4F4F4"/>
-      </w:pPr>
-      <w:r>
-        <w:rPr>
-          <w:rFonts w:ascii="Consolas" w:eastAsia="Consolas" w:hAnsi="Consolas" w:cs="Consolas"/>
-          <w:sz w:val="18"/>
-          <w:szCs w:val="18"/>
-        </w:rPr>
-        <w:t xml:space="preserve">            &amp;&amp; student.getUserInfo().getId().equals(user.getId());</w:t>
-      </w:r>
-    </w:p>
-    <w:p>
-      <w:pPr>
-        <w:pBdr>
-          <w:left w:val="single" w:sz="18" w:space="6" w:color="C0C0C0"/>
-          <w:bottom w:val="single" w:sz="4" w:space="3" w:color="D9D9D9"/>
-        </w:pBdr>
-        <w:shd w:val="clear" w:color="auto" w:fill="F4F4F4"/>
-      </w:pPr>
-      <w:r>
-        <w:rPr>
-          <w:rFonts w:ascii="Consolas" w:eastAsia="Consolas" w:hAnsi="Consolas" w:cs="Consolas"/>
-          <w:sz w:val="18"/>
-          <w:szCs w:val="18"/>
-        </w:rPr>
-        <w:t>}</w:t>
+        <w:t>하면 1번이든 2번이든 모두 403이다.</w:t>
       </w:r>
     </w:p>
     <w:p>
@@ -3247,7 +3742,7 @@
           <w:bCs/>
           <w:color w:val="2E5496"/>
         </w:rPr>
-        <w:t>실습: curl로 검증</w:t>
+        <w:t>실습: 수정(PUT)도 소유자만 가능</w:t>
       </w:r>
     </w:p>
     <w:p>
@@ -3255,88 +3750,7 @@
         <w:spacing w:after="100" w:line="276" w:lineRule="auto"/>
       </w:pPr>
       <w:r>
-        <w:t>전체</w:t>
-      </w:r>
-      <w:r>
-        <w:t xml:space="preserve"> </w:t>
-      </w:r>
-      <w:r>
-        <w:t>목록</w:t>
-      </w:r>
-      <w:r>
-        <w:t xml:space="preserve"> </w:t>
-      </w:r>
-      <w:r>
-        <w:t>조회</w:t>
-      </w:r>
-      <w:r>
-        <w:t>(GET /api/students)</w:t>
-      </w:r>
-      <w:r>
-        <w:t>와</w:t>
-      </w:r>
-      <w:r>
-        <w:t xml:space="preserve"> </w:t>
-      </w:r>
-      <w:r>
-        <w:t>단건</w:t>
-      </w:r>
-      <w:r>
-        <w:t xml:space="preserve"> </w:t>
-      </w:r>
-      <w:r>
-        <w:t>조회</w:t>
-      </w:r>
-      <w:r>
-        <w:t xml:space="preserve"> </w:t>
-      </w:r>
-      <w:r>
-        <w:t>모두</w:t>
-      </w:r>
-      <w:r>
-        <w:t xml:space="preserve"> </w:t>
-      </w:r>
-      <w:r>
-        <w:t>역할</w:t>
-      </w:r>
-      <w:r>
-        <w:t>·</w:t>
-      </w:r>
-      <w:r>
-        <w:t>소유권에</w:t>
-      </w:r>
-      <w:r>
-        <w:t xml:space="preserve"> </w:t>
-      </w:r>
-      <w:r>
-        <w:t>따라</w:t>
-      </w:r>
-      <w:r>
-        <w:t xml:space="preserve"> </w:t>
-      </w:r>
-      <w:r>
-        <w:t>응답이</w:t>
-      </w:r>
-      <w:r>
-        <w:t xml:space="preserve"> </w:t>
-      </w:r>
-      <w:r>
-        <w:t>달라지는</w:t>
-      </w:r>
-      <w:r>
-        <w:t xml:space="preserve"> </w:t>
-      </w:r>
-      <w:r>
-        <w:t>것을</w:t>
-      </w:r>
-      <w:r>
-        <w:t xml:space="preserve"> </w:t>
-      </w:r>
-      <w:r>
-        <w:t>확인한다</w:t>
-      </w:r>
-      <w:r>
-        <w:t>.</w:t>
+        <w:t>단건 조회뿐 아니라 수정(PUT /api/students/{id})도 updateStudent() 에서 동일하게 소유권을 검사한다.</w:t>
       </w:r>
     </w:p>
     <w:p>
@@ -3344,37 +3758,7 @@
         <w:spacing w:after="100" w:line="276" w:lineRule="auto"/>
       </w:pPr>
       <w:r>
-        <w:t xml:space="preserve">(1) </w:t>
-      </w:r>
-      <w:r>
-        <w:t>관리자</w:t>
-      </w:r>
-      <w:r>
-        <w:t>(admin@aa.com)</w:t>
-      </w:r>
-      <w:r>
-        <w:t>로</w:t>
-      </w:r>
-      <w:r>
-        <w:t xml:space="preserve"> </w:t>
-      </w:r>
-      <w:r>
-        <w:t>전체</w:t>
-      </w:r>
-      <w:r>
-        <w:t xml:space="preserve"> </w:t>
-      </w:r>
-      <w:r>
-        <w:t>목록</w:t>
-      </w:r>
-      <w:r>
-        <w:t xml:space="preserve"> </w:t>
-      </w:r>
-      <w:r>
-        <w:t>조회</w:t>
-      </w:r>
-      <w:r>
-        <w:t xml:space="preserve"> → 200</w:t>
+        <w:t>(1) 소유자 계정(cs001@aa.com)으로 본인 학생(1번) 수정 → 200</w:t>
       </w:r>
     </w:p>
     <w:p>
@@ -3391,7 +3775,7 @@
           <w:sz w:val="18"/>
           <w:szCs w:val="18"/>
         </w:rPr>
-        <w:t>ADMIN_TOKEN=$(curl -s -X POST http://localhost:8080/api/userinfos/login \</w:t>
+        <w:t>OWNER_TOKEN=$(curl -s -X POST http://localhost:8080/api/userinfos/login \</w:t>
       </w:r>
     </w:p>
     <w:p>
@@ -3423,7 +3807,7 @@
           <w:sz w:val="18"/>
           <w:szCs w:val="18"/>
         </w:rPr>
-        <w:t xml:space="preserve">  -d '{"email":"admin@aa.com","password":"pwd1"}' \</w:t>
+        <w:t xml:space="preserve">  -d '{"email":"cs001@aa.com","password":"pwd1234"}' \</w:t>
       </w:r>
     </w:p>
     <w:p>
@@ -3448,6 +3832,70 @@
         <w:pBdr>
           <w:top w:val="single" w:sz="4" w:space="3" w:color="D9D9D9"/>
           <w:left w:val="single" w:sz="18" w:space="6" w:color="C0C0C0"/>
+        </w:pBdr>
+        <w:shd w:val="clear" w:color="auto" w:fill="F4F4F4"/>
+      </w:pPr>
+      <w:r>
+        <w:rPr>
+          <w:rFonts w:ascii="Consolas" w:eastAsia="Consolas" w:hAnsi="Consolas" w:cs="Consolas"/>
+          <w:sz w:val="18"/>
+          <w:szCs w:val="18"/>
+        </w:rPr>
+        <w:t>curl -X PUT -H "Authorization: Bearer $OWNER_TOKEN" -H "Content-Type: application/json" \</w:t>
+      </w:r>
+    </w:p>
+    <w:p>
+      <w:pPr>
+        <w:pBdr>
+          <w:left w:val="single" w:sz="18" w:space="6" w:color="C0C0C0"/>
+        </w:pBdr>
+        <w:shd w:val="clear" w:color="auto" w:fill="F4F4F4"/>
+      </w:pPr>
+      <w:r>
+        <w:rPr>
+          <w:rFonts w:ascii="Consolas" w:eastAsia="Consolas" w:hAnsi="Consolas" w:cs="Consolas"/>
+          <w:sz w:val="18"/>
+          <w:szCs w:val="18"/>
+        </w:rPr>
+        <w:t xml:space="preserve">  -d '{"name":"Alice Johnson","studentNumber":"CS001","departmentId":1,</w:t>
+      </w:r>
+    </w:p>
+    <w:p>
+      <w:pPr>
+        <w:pBdr>
+          <w:left w:val="single" w:sz="18" w:space="6" w:color="C0C0C0"/>
+        </w:pBdr>
+        <w:shd w:val="clear" w:color="auto" w:fill="F4F4F4"/>
+      </w:pPr>
+      <w:r>
+        <w:rPr>
+          <w:rFonts w:ascii="Consolas" w:eastAsia="Consolas" w:hAnsi="Consolas" w:cs="Consolas"/>
+          <w:sz w:val="18"/>
+          <w:szCs w:val="18"/>
+        </w:rPr>
+        <w:t xml:space="preserve">       "detailRequest":{"address":"123 Tech Street","phoneNumber":"010-1234-5678",</w:t>
+      </w:r>
+    </w:p>
+    <w:p>
+      <w:pPr>
+        <w:pBdr>
+          <w:left w:val="single" w:sz="18" w:space="6" w:color="C0C0C0"/>
+        </w:pBdr>
+        <w:shd w:val="clear" w:color="auto" w:fill="F4F4F4"/>
+      </w:pPr>
+      <w:r>
+        <w:rPr>
+          <w:rFonts w:ascii="Consolas" w:eastAsia="Consolas" w:hAnsi="Consolas" w:cs="Consolas"/>
+          <w:sz w:val="18"/>
+          <w:szCs w:val="18"/>
+        </w:rPr>
+        <w:t xml:space="preserve">                         "email":"alice@example.com","dateOfBirth":"1998-03-15"}}' \</w:t>
+      </w:r>
+    </w:p>
+    <w:p>
+      <w:pPr>
+        <w:pBdr>
+          <w:left w:val="single" w:sz="18" w:space="6" w:color="C0C0C0"/>
           <w:bottom w:val="single" w:sz="4" w:space="3" w:color="D9D9D9"/>
         </w:pBdr>
         <w:shd w:val="clear" w:color="auto" w:fill="F4F4F4"/>
@@ -3458,15 +3906,7 @@
           <w:sz w:val="18"/>
           <w:szCs w:val="18"/>
         </w:rPr>
-        <w:t>curl -H "Authorization: Bearer $ADMIN_T</w:t>
-      </w:r>
-      <w:r>
-        <w:rPr>
-          <w:rFonts w:ascii="Consolas" w:eastAsia="Consolas" w:hAnsi="Consolas" w:cs="Consolas"/>
-          <w:sz w:val="18"/>
-          <w:szCs w:val="18"/>
-        </w:rPr>
-        <w:t>OKEN" http://localhost:8080/api/students</w:t>
+        <w:t xml:space="preserve">  http://localhost:8080/api/students/1</w:t>
       </w:r>
     </w:p>
     <w:p>
@@ -3484,87 +3924,7 @@
           <w:sz w:val="18"/>
           <w:szCs w:val="18"/>
         </w:rPr>
-        <w:t>HTTP 200  (</w:t>
-      </w:r>
-      <w:r>
-        <w:rPr>
-          <w:rFonts w:ascii="Consolas" w:eastAsia="Consolas" w:hAnsi="Consolas" w:cs="Consolas"/>
-          <w:sz w:val="18"/>
-          <w:szCs w:val="18"/>
-        </w:rPr>
-        <w:t>전체</w:t>
-      </w:r>
-      <w:r>
-        <w:rPr>
-          <w:rFonts w:ascii="Consolas" w:eastAsia="Consolas" w:hAnsi="Consolas" w:cs="Consolas"/>
-          <w:sz w:val="18"/>
-          <w:szCs w:val="18"/>
-        </w:rPr>
-        <w:t xml:space="preserve"> </w:t>
-      </w:r>
-      <w:r>
-        <w:rPr>
-          <w:rFonts w:ascii="Consolas" w:eastAsia="Consolas" w:hAnsi="Consolas" w:cs="Consolas"/>
-          <w:sz w:val="18"/>
-          <w:szCs w:val="18"/>
-        </w:rPr>
-        <w:t>학생</w:t>
-      </w:r>
-      <w:r>
-        <w:rPr>
-          <w:rFonts w:ascii="Consolas" w:eastAsia="Consolas" w:hAnsi="Consolas" w:cs="Consolas"/>
-          <w:sz w:val="18"/>
-          <w:szCs w:val="18"/>
-        </w:rPr>
-        <w:t xml:space="preserve"> </w:t>
-      </w:r>
-      <w:r>
-        <w:rPr>
-          <w:rFonts w:ascii="Consolas" w:eastAsia="Consolas" w:hAnsi="Consolas" w:cs="Consolas"/>
-          <w:sz w:val="18"/>
-          <w:szCs w:val="18"/>
-        </w:rPr>
-        <w:t>목록이</w:t>
-      </w:r>
-      <w:r>
-        <w:rPr>
-          <w:rFonts w:ascii="Consolas" w:eastAsia="Consolas" w:hAnsi="Consolas" w:cs="Consolas"/>
-          <w:sz w:val="18"/>
-          <w:szCs w:val="18"/>
-        </w:rPr>
-        <w:t xml:space="preserve"> </w:t>
-      </w:r>
-      <w:r>
-        <w:rPr>
-          <w:rFonts w:ascii="Consolas" w:eastAsia="Consolas" w:hAnsi="Consolas" w:cs="Consolas"/>
-          <w:sz w:val="18"/>
-          <w:szCs w:val="18"/>
-        </w:rPr>
-        <w:t>그대로</w:t>
-      </w:r>
-      <w:r>
-        <w:rPr>
-          <w:rFonts w:ascii="Consolas" w:eastAsia="Consolas" w:hAnsi="Consolas" w:cs="Consolas"/>
-          <w:sz w:val="18"/>
-          <w:szCs w:val="18"/>
-        </w:rPr>
-        <w:t xml:space="preserve"> </w:t>
-      </w:r>
-      <w:r>
-        <w:rPr>
-          <w:rFonts w:ascii="Consolas" w:eastAsia="Consolas" w:hAnsi="Consolas" w:cs="Consolas"/>
-          <w:sz w:val="18"/>
-          <w:szCs w:val="18"/>
-        </w:rPr>
-        <w:t>반환된다</w:t>
-      </w:r>
-      <w:r>
-        <w:rPr>
-          <w:rFonts w:ascii="Consolas" w:eastAsia="Consolas" w:hAnsi="Consolas" w:cs="Consolas"/>
-          <w:sz w:val="18"/>
-          <w:szCs w:val="18"/>
-        </w:rPr>
-        <w:t>)</w:t>
+        <w:t>HTTP 200  (본인 소유 학생이라 정상 수정된다)</w:t>
       </w:r>
     </w:p>
     <w:p>
@@ -3572,43 +3932,7 @@
         <w:spacing w:after="100" w:line="276" w:lineRule="auto"/>
       </w:pPr>
       <w:r>
-        <w:t xml:space="preserve">(2) </w:t>
-      </w:r>
-      <w:r>
-        <w:t>일반</w:t>
-      </w:r>
-      <w:r>
-        <w:t xml:space="preserve"> </w:t>
-      </w:r>
-      <w:r>
-        <w:t>사용자</w:t>
-      </w:r>
-      <w:r>
-        <w:t>(user@aa.com)</w:t>
-      </w:r>
-      <w:r>
-        <w:t>로</w:t>
-      </w:r>
-      <w:r>
-        <w:t xml:space="preserve"> </w:t>
-      </w:r>
-      <w:r>
-        <w:t>전체</w:t>
-      </w:r>
-      <w:r>
-        <w:t xml:space="preserve"> </w:t>
-      </w:r>
-      <w:r>
-        <w:t>목록</w:t>
-      </w:r>
-      <w:r>
-        <w:t xml:space="preserve"> </w:t>
-      </w:r>
-      <w:r>
-        <w:t>조회</w:t>
-      </w:r>
-      <w:r>
-        <w:t xml:space="preserve"> → 403</w:t>
+        <w:t>(2) 비소유자 계정(cs002@aa.com, 2번 학생 Bob의 소유자)으로 1번 학생(Alice) 수정 시도 → 403</w:t>
       </w:r>
     </w:p>
     <w:p>
@@ -3616,6 +3940,63 @@
         <w:pBdr>
           <w:top w:val="single" w:sz="4" w:space="3" w:color="D9D9D9"/>
           <w:left w:val="single" w:sz="18" w:space="6" w:color="C0C0C0"/>
+        </w:pBdr>
+        <w:shd w:val="clear" w:color="auto" w:fill="F4F4F4"/>
+      </w:pPr>
+      <w:r>
+        <w:rPr>
+          <w:rFonts w:ascii="Consolas" w:eastAsia="Consolas" w:hAnsi="Consolas" w:cs="Consolas"/>
+          <w:sz w:val="18"/>
+          <w:szCs w:val="18"/>
+        </w:rPr>
+        <w:lastRenderedPageBreak/>
+        <w:t>OTHER_TOKEN=$(curl -s -X POST ht</w:t>
+      </w:r>
+      <w:r>
+        <w:rPr>
+          <w:rFonts w:ascii="Consolas" w:eastAsia="Consolas" w:hAnsi="Consolas" w:cs="Consolas"/>
+          <w:sz w:val="18"/>
+          <w:szCs w:val="18"/>
+        </w:rPr>
+        <w:t>tp://localhost:8080/api/userinfos/login \</w:t>
+      </w:r>
+    </w:p>
+    <w:p>
+      <w:pPr>
+        <w:pBdr>
+          <w:left w:val="single" w:sz="18" w:space="6" w:color="C0C0C0"/>
+        </w:pBdr>
+        <w:shd w:val="clear" w:color="auto" w:fill="F4F4F4"/>
+      </w:pPr>
+      <w:r>
+        <w:rPr>
+          <w:rFonts w:ascii="Consolas" w:eastAsia="Consolas" w:hAnsi="Consolas" w:cs="Consolas"/>
+          <w:sz w:val="18"/>
+          <w:szCs w:val="18"/>
+        </w:rPr>
+        <w:t xml:space="preserve">  -H "Content-Type: application/json" \</w:t>
+      </w:r>
+    </w:p>
+    <w:p>
+      <w:pPr>
+        <w:pBdr>
+          <w:left w:val="single" w:sz="18" w:space="6" w:color="C0C0C0"/>
+        </w:pBdr>
+        <w:shd w:val="clear" w:color="auto" w:fill="F4F4F4"/>
+      </w:pPr>
+      <w:r>
+        <w:rPr>
+          <w:rFonts w:ascii="Consolas" w:eastAsia="Consolas" w:hAnsi="Consolas" w:cs="Consolas"/>
+          <w:sz w:val="18"/>
+          <w:szCs w:val="18"/>
+        </w:rPr>
+        <w:t xml:space="preserve">  -d '{"email":"cs002@aa.com","password":"pwd1234"}' \</w:t>
+      </w:r>
+    </w:p>
+    <w:p>
+      <w:pPr>
+        <w:pBdr>
+          <w:left w:val="single" w:sz="18" w:space="6" w:color="C0C0C0"/>
           <w:bottom w:val="single" w:sz="4" w:space="3" w:color="D9D9D9"/>
         </w:pBdr>
         <w:shd w:val="clear" w:color="auto" w:fill="F4F4F4"/>
@@ -3626,7 +4007,7 @@
           <w:sz w:val="18"/>
           <w:szCs w:val="18"/>
         </w:rPr>
-        <w:t>curl -H "Authorization: Bearer $USER_TOKEN" http://localhost:8080/api/students</w:t>
+        <w:t xml:space="preserve">  | sed -n 's/.*"accessToken":"\([^"]*\)".*/\1/p')</w:t>
       </w:r>
     </w:p>
     <w:p>
@@ -3644,60 +4025,7 @@
           <w:sz w:val="18"/>
           <w:szCs w:val="18"/>
         </w:rPr>
-        <w:t>{"statusCode":403,"message":"Access Denied", ...}</w:t>
-      </w:r>
-    </w:p>
-    <w:p>
-      <w:pPr>
-        <w:spacing w:after="100" w:line="276" w:lineRule="auto"/>
-      </w:pPr>
-      <w:r>
-        <w:t xml:space="preserve">(3) </w:t>
-      </w:r>
-      <w:r>
-        <w:t>일반</w:t>
-      </w:r>
-      <w:r>
-        <w:t xml:space="preserve"> </w:t>
-      </w:r>
-      <w:r>
-        <w:t>사용자</w:t>
-      </w:r>
-      <w:r>
-        <w:t>(user</w:t>
-      </w:r>
-      <w:r>
-        <w:t>@aa.com)</w:t>
-      </w:r>
-      <w:r>
-        <w:t>로</w:t>
-      </w:r>
-      <w:r>
-        <w:t xml:space="preserve"> </w:t>
-      </w:r>
-      <w:r>
-        <w:t>단건</w:t>
-      </w:r>
-      <w:r>
-        <w:t xml:space="preserve"> </w:t>
-      </w:r>
-      <w:r>
-        <w:t>조회</w:t>
-      </w:r>
-      <w:r>
-        <w:t>(</w:t>
-      </w:r>
-      <w:r>
-        <w:t>학생</w:t>
-      </w:r>
-      <w:r>
-        <w:t xml:space="preserve"> 1</w:t>
-      </w:r>
-      <w:r>
-        <w:t>번</w:t>
-      </w:r>
-      <w:r>
-        <w:t>) → 403</w:t>
+        <w:t>curl -X PUT -H "Authorization: Bearer $OTHER_TOKEN" ... http://localhost:8080/api/students/1</w:t>
       </w:r>
     </w:p>
     <w:p>
@@ -3715,1021 +4043,7 @@
           <w:sz w:val="18"/>
           <w:szCs w:val="18"/>
         </w:rPr>
-        <w:t>curl -H "Authorization: Bearer $USER_TOKEN" http://localhost:8080/api/students/1</w:t>
-      </w:r>
-    </w:p>
-    <w:p>
-      <w:pPr>
-        <w:pBdr>
-          <w:top w:val="single" w:sz="4" w:space="3" w:color="D9D9D9"/>
-          <w:left w:val="single" w:sz="18" w:space="6" w:color="C0C0C0"/>
-          <w:bottom w:val="single" w:sz="4" w:space="3" w:color="D9D9D9"/>
-        </w:pBdr>
-        <w:shd w:val="clear" w:color="auto" w:fill="F4F4F4"/>
-      </w:pPr>
-      <w:r>
-        <w:rPr>
-          <w:rFonts w:ascii="Consolas" w:eastAsia="Consolas" w:hAnsi="Consolas" w:cs="Consolas"/>
-          <w:sz w:val="18"/>
-          <w:szCs w:val="18"/>
-        </w:rPr>
-        <w:t>{"statusCode":403,"message":"</w:t>
-      </w:r>
-      <w:r>
-        <w:rPr>
-          <w:rFonts w:ascii="Consolas" w:eastAsia="Consolas" w:hAnsi="Consolas" w:cs="Consolas"/>
-          <w:sz w:val="18"/>
-          <w:szCs w:val="18"/>
-        </w:rPr>
-        <w:t>본인</w:t>
-      </w:r>
-      <w:r>
-        <w:rPr>
-          <w:rFonts w:ascii="Consolas" w:eastAsia="Consolas" w:hAnsi="Consolas" w:cs="Consolas"/>
-          <w:sz w:val="18"/>
-          <w:szCs w:val="18"/>
-        </w:rPr>
-        <w:t xml:space="preserve"> </w:t>
-      </w:r>
-      <w:r>
-        <w:rPr>
-          <w:rFonts w:ascii="Consolas" w:eastAsia="Consolas" w:hAnsi="Consolas" w:cs="Consolas"/>
-          <w:sz w:val="18"/>
-          <w:szCs w:val="18"/>
-        </w:rPr>
-        <w:t>정보만</w:t>
-      </w:r>
-      <w:r>
-        <w:rPr>
-          <w:rFonts w:ascii="Consolas" w:eastAsia="Consolas" w:hAnsi="Consolas" w:cs="Consolas"/>
-          <w:sz w:val="18"/>
-          <w:szCs w:val="18"/>
-        </w:rPr>
-        <w:t xml:space="preserve"> </w:t>
-      </w:r>
-      <w:r>
-        <w:rPr>
-          <w:rFonts w:ascii="Consolas" w:eastAsia="Consolas" w:hAnsi="Consolas" w:cs="Consolas"/>
-          <w:sz w:val="18"/>
-          <w:szCs w:val="18"/>
-        </w:rPr>
-        <w:t>조회할</w:t>
-      </w:r>
-      <w:r>
-        <w:rPr>
-          <w:rFonts w:ascii="Consolas" w:eastAsia="Consolas" w:hAnsi="Consolas" w:cs="Consolas"/>
-          <w:sz w:val="18"/>
-          <w:szCs w:val="18"/>
-        </w:rPr>
-        <w:t xml:space="preserve"> </w:t>
-      </w:r>
-      <w:r>
-        <w:rPr>
-          <w:rFonts w:ascii="Consolas" w:eastAsia="Consolas" w:hAnsi="Consolas" w:cs="Consolas"/>
-          <w:sz w:val="18"/>
-          <w:szCs w:val="18"/>
-        </w:rPr>
-        <w:t>수</w:t>
-      </w:r>
-      <w:r>
-        <w:rPr>
-          <w:rFonts w:ascii="Consolas" w:eastAsia="Consolas" w:hAnsi="Consolas" w:cs="Consolas"/>
-          <w:sz w:val="18"/>
-          <w:szCs w:val="18"/>
-        </w:rPr>
-        <w:t xml:space="preserve"> </w:t>
-      </w:r>
-      <w:r>
-        <w:rPr>
-          <w:rFonts w:ascii="Consolas" w:eastAsia="Consolas" w:hAnsi="Consolas" w:cs="Consolas"/>
-          <w:sz w:val="18"/>
-          <w:szCs w:val="18"/>
-        </w:rPr>
-        <w:t>있습니다</w:t>
-      </w:r>
-      <w:r>
-        <w:rPr>
-          <w:rFonts w:ascii="Consolas" w:eastAsia="Consolas" w:hAnsi="Consolas" w:cs="Consolas"/>
-          <w:sz w:val="18"/>
-          <w:szCs w:val="18"/>
-        </w:rPr>
-        <w:t>", ...}</w:t>
-      </w:r>
-    </w:p>
-    <w:p>
-      <w:pPr>
-        <w:spacing w:after="100" w:line="276" w:lineRule="auto"/>
-      </w:pPr>
-      <w:r>
-        <w:t>본인 소유 계정(cs001@aa.com, 1번 학생 Alice의 소유자)으로 로그인한다.</w:t>
-      </w:r>
-    </w:p>
-    <w:p>
-      <w:pPr>
-        <w:pBdr>
-          <w:top w:val="single" w:sz="4" w:space="3" w:color="D9D9D9"/>
-          <w:left w:val="single" w:sz="18" w:space="6" w:color="C0C0C0"/>
-        </w:pBdr>
-        <w:shd w:val="clear" w:color="auto" w:fill="F4F4F4"/>
-      </w:pPr>
-      <w:r>
-        <w:rPr>
-          <w:rFonts w:ascii="Consolas" w:eastAsia="Consolas" w:hAnsi="Consolas" w:cs="Consolas"/>
-          <w:sz w:val="18"/>
-          <w:szCs w:val="18"/>
-        </w:rPr>
-        <w:t>TOKEN=$(curl -s -X POST http://localhost:8080/api/userinfos/login \</w:t>
-      </w:r>
-    </w:p>
-    <w:p>
-      <w:pPr>
-        <w:pBdr>
-          <w:left w:val="single" w:sz="18" w:space="6" w:color="C0C0C0"/>
-        </w:pBdr>
-        <w:shd w:val="clear" w:color="auto" w:fill="F4F4F4"/>
-      </w:pPr>
-      <w:r>
-        <w:rPr>
-          <w:rFonts w:ascii="Consolas" w:eastAsia="Consolas" w:hAnsi="Consolas" w:cs="Consolas"/>
-          <w:sz w:val="18"/>
-          <w:szCs w:val="18"/>
-        </w:rPr>
-        <w:t xml:space="preserve">  -H "Content-Type: application/json" \</w:t>
-      </w:r>
-    </w:p>
-    <w:p>
-      <w:pPr>
-        <w:pBdr>
-          <w:left w:val="single" w:sz="18" w:space="6" w:color="C0C0C0"/>
-        </w:pBdr>
-        <w:shd w:val="clear" w:color="auto" w:fill="F4F4F4"/>
-      </w:pPr>
-      <w:r>
-        <w:rPr>
-          <w:rFonts w:ascii="Consolas" w:eastAsia="Consolas" w:hAnsi="Consolas" w:cs="Consolas"/>
-          <w:sz w:val="18"/>
-          <w:szCs w:val="18"/>
-        </w:rPr>
-        <w:t xml:space="preserve">  -d '{"email":"cs001@aa.com","password":"pwd1234"}' \</w:t>
-      </w:r>
-    </w:p>
-    <w:p>
-      <w:pPr>
-        <w:pBdr>
-          <w:left w:val="single" w:sz="18" w:space="6" w:color="C0C0C0"/>
-          <w:bottom w:val="single" w:sz="4" w:space="3" w:color="D9D9D9"/>
-        </w:pBdr>
-        <w:shd w:val="clear" w:color="auto" w:fill="F4F4F4"/>
-      </w:pPr>
-      <w:r>
-        <w:rPr>
-          <w:rFonts w:ascii="Consolas" w:eastAsia="Consolas" w:hAnsi="Consolas" w:cs="Consolas"/>
-          <w:sz w:val="18"/>
-          <w:szCs w:val="18"/>
-        </w:rPr>
-        <w:t xml:space="preserve">  | sed -n 's/.*"accessToken":"\([^"]*\)".*/\1/p')</w:t>
-      </w:r>
-    </w:p>
-    <w:p>
-      <w:pPr>
-        <w:spacing w:after="100" w:line="276" w:lineRule="auto"/>
-      </w:pPr>
-      <w:r>
-        <w:t>본인 학생(1번) 조회 → 200</w:t>
-      </w:r>
-    </w:p>
-    <w:p>
-      <w:pPr>
-        <w:pBdr>
-          <w:top w:val="single" w:sz="4" w:space="3" w:color="D9D9D9"/>
-          <w:left w:val="single" w:sz="18" w:space="6" w:color="C0C0C0"/>
-          <w:bottom w:val="single" w:sz="4" w:space="3" w:color="D9D9D9"/>
-        </w:pBdr>
-        <w:shd w:val="clear" w:color="auto" w:fill="F4F4F4"/>
-      </w:pPr>
-      <w:r>
-        <w:rPr>
-          <w:rFonts w:ascii="Consolas" w:eastAsia="Consolas" w:hAnsi="Consolas" w:cs="Consolas"/>
-          <w:sz w:val="18"/>
-          <w:szCs w:val="18"/>
-        </w:rPr>
-        <w:lastRenderedPageBreak/>
-        <w:t>curl -H "Authorization: Bearer $TOKEN" http://localhost:8080/api/students/1</w:t>
-      </w:r>
-    </w:p>
-    <w:p>
-      <w:pPr>
-        <w:pBdr>
-          <w:top w:val="single" w:sz="4" w:space="3" w:color="D9D9D9"/>
-          <w:left w:val="single" w:sz="18" w:space="6" w:color="C0C0C0"/>
-          <w:bottom w:val="single" w:sz="4" w:space="3" w:color="D9D9D9"/>
-        </w:pBdr>
-        <w:shd w:val="clear" w:color="auto" w:fill="F4F4F4"/>
-      </w:pPr>
-      <w:r>
-        <w:rPr>
-          <w:rFonts w:ascii="Consolas" w:eastAsia="Consolas" w:hAnsi="Consolas" w:cs="Consolas"/>
-          <w:sz w:val="18"/>
-          <w:szCs w:val="18"/>
-        </w:rPr>
-        <w:t>{"id":1,"name":"Alice Johnson","studentNumber":"CS001","department":{"id":1,"name":"Computer Science","code":"CS"},"detail":{"id":1,"address":"123 Tech Street","phoneNumber":"010-1234-5678","email":"alice@example.com","dateOfBirth":"1998-03-15"}}</w:t>
-      </w:r>
-    </w:p>
-    <w:p>
-      <w:pPr>
-        <w:spacing w:after="100" w:line="276" w:lineRule="auto"/>
-      </w:pPr>
-      <w:r>
-        <w:t>타인 학생(2번, Bob) 조회 → 403</w:t>
-      </w:r>
-    </w:p>
-    <w:p>
-      <w:pPr>
-        <w:pBdr>
-          <w:top w:val="single" w:sz="4" w:space="3" w:color="D9D9D9"/>
-          <w:left w:val="single" w:sz="18" w:space="6" w:color="C0C0C0"/>
-          <w:bottom w:val="single" w:sz="4" w:space="3" w:color="D9D9D9"/>
-        </w:pBdr>
-        <w:shd w:val="clear" w:color="auto" w:fill="F4F4F4"/>
-      </w:pPr>
-      <w:r>
-        <w:rPr>
-          <w:rFonts w:ascii="Consolas" w:eastAsia="Consolas" w:hAnsi="Consolas" w:cs="Consolas"/>
-          <w:sz w:val="18"/>
-          <w:szCs w:val="18"/>
-        </w:rPr>
-        <w:t>curl -H "Authorization: Bearer $TOKEN" http://localhost:8080/api/students/2</w:t>
-      </w:r>
-    </w:p>
-    <w:p>
-      <w:pPr>
-        <w:pBdr>
-          <w:top w:val="single" w:sz="4" w:space="3" w:color="D9D9D9"/>
-          <w:left w:val="single" w:sz="18" w:space="6" w:color="C0C0C0"/>
-          <w:bottom w:val="single" w:sz="4" w:space="3" w:color="D9D9D9"/>
-        </w:pBdr>
-        <w:shd w:val="clear" w:color="auto" w:fill="F4F4F4"/>
-      </w:pPr>
-      <w:r>
-        <w:rPr>
-          <w:rFonts w:ascii="Consolas" w:eastAsia="Consolas" w:hAnsi="Consolas" w:cs="Consolas"/>
-          <w:sz w:val="18"/>
-          <w:szCs w:val="18"/>
-        </w:rPr>
-        <w:t>{"statusCode":403,"message":"본인 정보만 조회할 수 있습니다", ...}</w:t>
-      </w:r>
-    </w:p>
-    <w:p>
-      <w:pPr>
-        <w:spacing w:after="100" w:line="276" w:lineRule="auto"/>
-      </w:pPr>
-      <w:r>
-        <w:rPr>
-          <w:b/>
-          <w:bCs/>
-        </w:rPr>
-        <w:t xml:space="preserve">참고: </w:t>
-      </w:r>
-      <w:r>
-        <w:t>자신의 학생이 없는 일반 사용자(user@aa.com)로 로그인</w:t>
-      </w:r>
-      <w:r>
-        <w:rPr>
-          <w:rFonts w:hint="eastAsia"/>
-        </w:rPr>
-        <w:t xml:space="preserve"> </w:t>
-      </w:r>
-      <w:r>
-        <w:t>하면 1번이든 2번이든 모두 403이다.</w:t>
-      </w:r>
-    </w:p>
-    <w:p>
-      <w:pPr>
-        <w:pStyle w:val="3"/>
-        <w:spacing w:before="200" w:after="90"/>
-      </w:pPr>
-      <w:r>
-        <w:rPr>
-          <w:b/>
-          <w:bCs/>
-          <w:color w:val="2E5496"/>
-        </w:rPr>
-        <w:t>실습</w:t>
-      </w:r>
-      <w:r>
-        <w:rPr>
-          <w:b/>
-          <w:bCs/>
-          <w:color w:val="2E5496"/>
-        </w:rPr>
-        <w:t xml:space="preserve">: </w:t>
-      </w:r>
-      <w:r>
-        <w:rPr>
-          <w:b/>
-          <w:bCs/>
-          <w:color w:val="2E5496"/>
-        </w:rPr>
-        <w:t>수정</w:t>
-      </w:r>
-      <w:r>
-        <w:rPr>
-          <w:b/>
-          <w:bCs/>
-          <w:color w:val="2E5496"/>
-        </w:rPr>
-        <w:t>(PUT)</w:t>
-      </w:r>
-      <w:r>
-        <w:rPr>
-          <w:b/>
-          <w:bCs/>
-          <w:color w:val="2E5496"/>
-        </w:rPr>
-        <w:t>도</w:t>
-      </w:r>
-      <w:r>
-        <w:rPr>
-          <w:b/>
-          <w:bCs/>
-          <w:color w:val="2E5496"/>
-        </w:rPr>
-        <w:t xml:space="preserve"> </w:t>
-      </w:r>
-      <w:r>
-        <w:rPr>
-          <w:b/>
-          <w:bCs/>
-          <w:color w:val="2E5496"/>
-        </w:rPr>
-        <w:t>소유자만</w:t>
-      </w:r>
-      <w:r>
-        <w:rPr>
-          <w:b/>
-          <w:bCs/>
-          <w:color w:val="2E5496"/>
-        </w:rPr>
-        <w:t xml:space="preserve"> </w:t>
-      </w:r>
-      <w:r>
-        <w:rPr>
-          <w:b/>
-          <w:bCs/>
-          <w:color w:val="2E5496"/>
-        </w:rPr>
-        <w:t>가능</w:t>
-      </w:r>
-    </w:p>
-    <w:p>
-      <w:pPr>
-        <w:spacing w:after="100" w:line="276" w:lineRule="auto"/>
-      </w:pPr>
-      <w:r>
-        <w:t>단건</w:t>
-      </w:r>
-      <w:r>
-        <w:t xml:space="preserve"> </w:t>
-      </w:r>
-      <w:r>
-        <w:t>조회뿐</w:t>
-      </w:r>
-      <w:r>
-        <w:t xml:space="preserve"> </w:t>
-      </w:r>
-      <w:r>
-        <w:t>아니라</w:t>
-      </w:r>
-      <w:r>
-        <w:t xml:space="preserve"> </w:t>
-      </w:r>
-      <w:r>
-        <w:t>수정</w:t>
-      </w:r>
-      <w:r>
-        <w:t>(PUT /api/students/{id})</w:t>
-      </w:r>
-      <w:r>
-        <w:t>도</w:t>
-      </w:r>
-      <w:r>
-        <w:t xml:space="preserve"> updateStudent() </w:t>
-      </w:r>
-      <w:r>
-        <w:t>에서</w:t>
-      </w:r>
-      <w:r>
-        <w:t xml:space="preserve"> </w:t>
-      </w:r>
-      <w:r>
-        <w:t>동일하게</w:t>
-      </w:r>
-      <w:r>
-        <w:t xml:space="preserve"> </w:t>
-      </w:r>
-      <w:r>
-        <w:t>소유권을</w:t>
-      </w:r>
-      <w:r>
-        <w:t xml:space="preserve"> </w:t>
-      </w:r>
-      <w:r>
-        <w:t>검사한다</w:t>
-      </w:r>
-      <w:r>
-        <w:t>.</w:t>
-      </w:r>
-    </w:p>
-    <w:p>
-      <w:pPr>
-        <w:spacing w:after="100" w:line="276" w:lineRule="auto"/>
-      </w:pPr>
-      <w:r>
-        <w:t xml:space="preserve">(1) </w:t>
-      </w:r>
-      <w:r>
-        <w:t>소유자</w:t>
-      </w:r>
-      <w:r>
-        <w:t xml:space="preserve"> </w:t>
-      </w:r>
-      <w:r>
-        <w:t>계정</w:t>
-      </w:r>
-      <w:r>
-        <w:t>(cs001@aa.com)</w:t>
-      </w:r>
-      <w:r>
-        <w:t>으로</w:t>
-      </w:r>
-      <w:r>
-        <w:t xml:space="preserve"> </w:t>
-      </w:r>
-      <w:r>
-        <w:t>본인</w:t>
-      </w:r>
-      <w:r>
-        <w:t xml:space="preserve"> </w:t>
-      </w:r>
-      <w:r>
-        <w:t>학생</w:t>
-      </w:r>
-      <w:r>
-        <w:t>(1</w:t>
-      </w:r>
-      <w:r>
-        <w:t>번</w:t>
-      </w:r>
-      <w:r>
-        <w:t xml:space="preserve">) </w:t>
-      </w:r>
-      <w:r>
-        <w:t>수정</w:t>
-      </w:r>
-      <w:r>
-        <w:t xml:space="preserve"> → 200</w:t>
-      </w:r>
-    </w:p>
-    <w:p>
-      <w:pPr>
-        <w:pBdr>
-          <w:top w:val="single" w:sz="4" w:space="3" w:color="D9D9D9"/>
-          <w:left w:val="single" w:sz="18" w:space="6" w:color="C0C0C0"/>
-        </w:pBdr>
-        <w:shd w:val="clear" w:color="auto" w:fill="F4F4F4"/>
-      </w:pPr>
-      <w:r>
-        <w:rPr>
-          <w:rFonts w:ascii="Consolas" w:eastAsia="Consolas" w:hAnsi="Consolas" w:cs="Consolas"/>
-          <w:sz w:val="18"/>
-          <w:szCs w:val="18"/>
-        </w:rPr>
-        <w:t>OWNER_TOKEN=$(curl -s -X POST http://localhost:8080/api/userinfos/login \</w:t>
-      </w:r>
-    </w:p>
-    <w:p>
-      <w:pPr>
-        <w:pBdr>
-          <w:left w:val="single" w:sz="18" w:space="6" w:color="C0C0C0"/>
-        </w:pBdr>
-        <w:shd w:val="clear" w:color="auto" w:fill="F4F4F4"/>
-      </w:pPr>
-      <w:r>
-        <w:rPr>
-          <w:rFonts w:ascii="Consolas" w:eastAsia="Consolas" w:hAnsi="Consolas" w:cs="Consolas"/>
-          <w:sz w:val="18"/>
-          <w:szCs w:val="18"/>
-        </w:rPr>
-        <w:t xml:space="preserve">  -H "Content-Type: application/json" \</w:t>
-      </w:r>
-    </w:p>
-    <w:p>
-      <w:pPr>
-        <w:pBdr>
-          <w:left w:val="single" w:sz="18" w:space="6" w:color="C0C0C0"/>
-        </w:pBdr>
-        <w:shd w:val="clear" w:color="auto" w:fill="F4F4F4"/>
-      </w:pPr>
-      <w:r>
-        <w:rPr>
-          <w:rFonts w:ascii="Consolas" w:eastAsia="Consolas" w:hAnsi="Consolas" w:cs="Consolas"/>
-          <w:sz w:val="18"/>
-          <w:szCs w:val="18"/>
-        </w:rPr>
-        <w:t xml:space="preserve">  -d '{"email":"cs001@aa.com","password":"pwd1234"}' \</w:t>
-      </w:r>
-    </w:p>
-    <w:p>
-      <w:pPr>
-        <w:pBdr>
-          <w:left w:val="single" w:sz="18" w:space="6" w:color="C0C0C0"/>
-          <w:bottom w:val="single" w:sz="4" w:space="3" w:color="D9D9D9"/>
-        </w:pBdr>
-        <w:shd w:val="clear" w:color="auto" w:fill="F4F4F4"/>
-      </w:pPr>
-      <w:r>
-        <w:rPr>
-          <w:rFonts w:ascii="Consolas" w:eastAsia="Consolas" w:hAnsi="Consolas" w:cs="Consolas"/>
-          <w:sz w:val="18"/>
-          <w:szCs w:val="18"/>
-        </w:rPr>
-        <w:t xml:space="preserve">  | sed -n 's/.*"accessToken":"\([^"]*\)".*/\1/p')</w:t>
-      </w:r>
-    </w:p>
-    <w:p>
-      <w:pPr>
-        <w:pBdr>
-          <w:top w:val="single" w:sz="4" w:space="3" w:color="D9D9D9"/>
-          <w:left w:val="single" w:sz="18" w:space="6" w:color="C0C0C0"/>
-        </w:pBdr>
-        <w:shd w:val="clear" w:color="auto" w:fill="F4F4F4"/>
-      </w:pPr>
-      <w:r>
-        <w:rPr>
-          <w:rFonts w:ascii="Consolas" w:eastAsia="Consolas" w:hAnsi="Consolas" w:cs="Consolas"/>
-          <w:sz w:val="18"/>
-          <w:szCs w:val="18"/>
-        </w:rPr>
-        <w:t>curl -X PUT -H "Authorization: Bearer $OWNER_TOKEN" -H "Content-Type: application/json" \</w:t>
-      </w:r>
-    </w:p>
-    <w:p>
-      <w:pPr>
-        <w:pBdr>
-          <w:left w:val="single" w:sz="18" w:space="6" w:color="C0C0C0"/>
-        </w:pBdr>
-        <w:shd w:val="clear" w:color="auto" w:fill="F4F4F4"/>
-      </w:pPr>
-      <w:r>
-        <w:rPr>
-          <w:rFonts w:ascii="Consolas" w:eastAsia="Consolas" w:hAnsi="Consolas" w:cs="Consolas"/>
-          <w:sz w:val="18"/>
-          <w:szCs w:val="18"/>
-        </w:rPr>
-        <w:t xml:space="preserve">  -d '{"name":"Alice Johnson","stude</w:t>
-      </w:r>
-      <w:r>
-        <w:rPr>
-          <w:rFonts w:ascii="Consolas" w:eastAsia="Consolas" w:hAnsi="Consolas" w:cs="Consolas"/>
-          <w:sz w:val="18"/>
-          <w:szCs w:val="18"/>
-        </w:rPr>
-        <w:t>ntNumber":"CS001","departmentId":1,</w:t>
-      </w:r>
-    </w:p>
-    <w:p>
-      <w:pPr>
-        <w:pBdr>
-          <w:left w:val="single" w:sz="18" w:space="6" w:color="C0C0C0"/>
-        </w:pBdr>
-        <w:shd w:val="clear" w:color="auto" w:fill="F4F4F4"/>
-      </w:pPr>
-      <w:r>
-        <w:rPr>
-          <w:rFonts w:ascii="Consolas" w:eastAsia="Consolas" w:hAnsi="Consolas" w:cs="Consolas"/>
-          <w:sz w:val="18"/>
-          <w:szCs w:val="18"/>
-        </w:rPr>
-        <w:t xml:space="preserve">       "detailRequest":{"address":"123 Tech Street","phoneNumber":"010-1234-5678",</w:t>
-      </w:r>
-    </w:p>
-    <w:p>
-      <w:pPr>
-        <w:pBdr>
-          <w:left w:val="single" w:sz="18" w:space="6" w:color="C0C0C0"/>
-        </w:pBdr>
-        <w:shd w:val="clear" w:color="auto" w:fill="F4F4F4"/>
-      </w:pPr>
-      <w:r>
-        <w:rPr>
-          <w:rFonts w:ascii="Consolas" w:eastAsia="Consolas" w:hAnsi="Consolas" w:cs="Consolas"/>
-          <w:sz w:val="18"/>
-          <w:szCs w:val="18"/>
-        </w:rPr>
-        <w:t xml:space="preserve">                         "email":"alice@example.com","dateOfBirth":"1998-03-15"}}' \</w:t>
-      </w:r>
-    </w:p>
-    <w:p>
-      <w:pPr>
-        <w:pBdr>
-          <w:left w:val="single" w:sz="18" w:space="6" w:color="C0C0C0"/>
-          <w:bottom w:val="single" w:sz="4" w:space="3" w:color="D9D9D9"/>
-        </w:pBdr>
-        <w:shd w:val="clear" w:color="auto" w:fill="F4F4F4"/>
-      </w:pPr>
-      <w:r>
-        <w:rPr>
-          <w:rFonts w:ascii="Consolas" w:eastAsia="Consolas" w:hAnsi="Consolas" w:cs="Consolas"/>
-          <w:sz w:val="18"/>
-          <w:szCs w:val="18"/>
-        </w:rPr>
-        <w:t xml:space="preserve">  http://localhost:8080/api/students/1</w:t>
-      </w:r>
-    </w:p>
-    <w:p>
-      <w:pPr>
-        <w:pBdr>
-          <w:top w:val="single" w:sz="4" w:space="3" w:color="D9D9D9"/>
-          <w:left w:val="single" w:sz="18" w:space="6" w:color="C0C0C0"/>
-          <w:bottom w:val="single" w:sz="4" w:space="3" w:color="D9D9D9"/>
-        </w:pBdr>
-        <w:shd w:val="clear" w:color="auto" w:fill="F4F4F4"/>
-      </w:pPr>
-      <w:r>
-        <w:rPr>
-          <w:rFonts w:ascii="Consolas" w:eastAsia="Consolas" w:hAnsi="Consolas" w:cs="Consolas"/>
-          <w:sz w:val="18"/>
-          <w:szCs w:val="18"/>
-        </w:rPr>
-        <w:t>HTTP 200  (</w:t>
-      </w:r>
-      <w:r>
-        <w:rPr>
-          <w:rFonts w:ascii="Consolas" w:eastAsia="Consolas" w:hAnsi="Consolas" w:cs="Consolas"/>
-          <w:sz w:val="18"/>
-          <w:szCs w:val="18"/>
-        </w:rPr>
-        <w:t>본인</w:t>
-      </w:r>
-      <w:r>
-        <w:rPr>
-          <w:rFonts w:ascii="Consolas" w:eastAsia="Consolas" w:hAnsi="Consolas" w:cs="Consolas"/>
-          <w:sz w:val="18"/>
-          <w:szCs w:val="18"/>
-        </w:rPr>
-        <w:t xml:space="preserve"> </w:t>
-      </w:r>
-      <w:r>
-        <w:rPr>
-          <w:rFonts w:ascii="Consolas" w:eastAsia="Consolas" w:hAnsi="Consolas" w:cs="Consolas"/>
-          <w:sz w:val="18"/>
-          <w:szCs w:val="18"/>
-        </w:rPr>
-        <w:t>소유</w:t>
-      </w:r>
-      <w:r>
-        <w:rPr>
-          <w:rFonts w:ascii="Consolas" w:eastAsia="Consolas" w:hAnsi="Consolas" w:cs="Consolas"/>
-          <w:sz w:val="18"/>
-          <w:szCs w:val="18"/>
-        </w:rPr>
-        <w:t xml:space="preserve"> </w:t>
-      </w:r>
-      <w:r>
-        <w:rPr>
-          <w:rFonts w:ascii="Consolas" w:eastAsia="Consolas" w:hAnsi="Consolas" w:cs="Consolas"/>
-          <w:sz w:val="18"/>
-          <w:szCs w:val="18"/>
-        </w:rPr>
-        <w:t>학생이라</w:t>
-      </w:r>
-      <w:r>
-        <w:rPr>
-          <w:rFonts w:ascii="Consolas" w:eastAsia="Consolas" w:hAnsi="Consolas" w:cs="Consolas"/>
-          <w:sz w:val="18"/>
-          <w:szCs w:val="18"/>
-        </w:rPr>
-        <w:t xml:space="preserve"> </w:t>
-      </w:r>
-      <w:r>
-        <w:rPr>
-          <w:rFonts w:ascii="Consolas" w:eastAsia="Consolas" w:hAnsi="Consolas" w:cs="Consolas"/>
-          <w:sz w:val="18"/>
-          <w:szCs w:val="18"/>
-        </w:rPr>
-        <w:t>정상</w:t>
-      </w:r>
-      <w:r>
-        <w:rPr>
-          <w:rFonts w:ascii="Consolas" w:eastAsia="Consolas" w:hAnsi="Consolas" w:cs="Consolas"/>
-          <w:sz w:val="18"/>
-          <w:szCs w:val="18"/>
-        </w:rPr>
-        <w:t xml:space="preserve"> </w:t>
-      </w:r>
-      <w:r>
-        <w:rPr>
-          <w:rFonts w:ascii="Consolas" w:eastAsia="Consolas" w:hAnsi="Consolas" w:cs="Consolas"/>
-          <w:sz w:val="18"/>
-          <w:szCs w:val="18"/>
-        </w:rPr>
-        <w:t>수정된다</w:t>
-      </w:r>
-      <w:r>
-        <w:rPr>
-          <w:rFonts w:ascii="Consolas" w:eastAsia="Consolas" w:hAnsi="Consolas" w:cs="Consolas"/>
-          <w:sz w:val="18"/>
-          <w:szCs w:val="18"/>
-        </w:rPr>
-        <w:t>)</w:t>
-      </w:r>
-    </w:p>
-    <w:p>
-      <w:pPr>
-        <w:spacing w:after="100" w:line="276" w:lineRule="auto"/>
-      </w:pPr>
-      <w:r>
-        <w:t xml:space="preserve">(2) </w:t>
-      </w:r>
-      <w:r>
-        <w:t>비소유자</w:t>
-      </w:r>
-      <w:r>
-        <w:t xml:space="preserve"> </w:t>
-      </w:r>
-      <w:r>
-        <w:t>계정</w:t>
-      </w:r>
-      <w:r>
-        <w:t>(cs002@aa.com, 2</w:t>
-      </w:r>
-      <w:r>
-        <w:t>번</w:t>
-      </w:r>
-      <w:r>
-        <w:t xml:space="preserve"> </w:t>
-      </w:r>
-      <w:r>
-        <w:t>학생</w:t>
-      </w:r>
-      <w:r>
-        <w:t xml:space="preserve"> Bob</w:t>
-      </w:r>
-      <w:r>
-        <w:t>의</w:t>
-      </w:r>
-      <w:r>
-        <w:t xml:space="preserve"> </w:t>
-      </w:r>
-      <w:r>
-        <w:t>소유자</w:t>
-      </w:r>
-      <w:r>
-        <w:t>)</w:t>
-      </w:r>
-      <w:r>
-        <w:t>으로</w:t>
-      </w:r>
-      <w:r>
-        <w:t xml:space="preserve"> 1</w:t>
-      </w:r>
-      <w:r>
-        <w:t>번</w:t>
-      </w:r>
-      <w:r>
-        <w:t xml:space="preserve"> </w:t>
-      </w:r>
-      <w:r>
-        <w:t>학생</w:t>
-      </w:r>
-      <w:r>
-        <w:t xml:space="preserve">(Alice) </w:t>
-      </w:r>
-      <w:r>
-        <w:t>수정</w:t>
-      </w:r>
-      <w:r>
-        <w:t xml:space="preserve"> </w:t>
-      </w:r>
-      <w:r>
-        <w:t>시도</w:t>
-      </w:r>
-      <w:r>
-        <w:t xml:space="preserve"> → 403</w:t>
-      </w:r>
-    </w:p>
-    <w:p>
-      <w:pPr>
-        <w:pBdr>
-          <w:top w:val="single" w:sz="4" w:space="3" w:color="D9D9D9"/>
-          <w:left w:val="single" w:sz="18" w:space="6" w:color="C0C0C0"/>
-        </w:pBdr>
-        <w:shd w:val="clear" w:color="auto" w:fill="F4F4F4"/>
-      </w:pPr>
-      <w:r>
-        <w:rPr>
-          <w:rFonts w:ascii="Consolas" w:eastAsia="Consolas" w:hAnsi="Consolas" w:cs="Consolas"/>
-          <w:sz w:val="18"/>
-          <w:szCs w:val="18"/>
-        </w:rPr>
-        <w:t>OTHER_TOKEN=$(curl -s -X POST http://localhost:8080/api/userinfos/login \</w:t>
-      </w:r>
-    </w:p>
-    <w:p>
-      <w:pPr>
-        <w:pBdr>
-          <w:left w:val="single" w:sz="18" w:space="6" w:color="C0C0C0"/>
-        </w:pBdr>
-        <w:shd w:val="clear" w:color="auto" w:fill="F4F4F4"/>
-      </w:pPr>
-      <w:r>
-        <w:rPr>
-          <w:rFonts w:ascii="Consolas" w:eastAsia="Consolas" w:hAnsi="Consolas" w:cs="Consolas"/>
-          <w:sz w:val="18"/>
-          <w:szCs w:val="18"/>
-        </w:rPr>
-        <w:t xml:space="preserve">  -H "Content-Type: application/json" \</w:t>
-      </w:r>
-    </w:p>
-    <w:p>
-      <w:pPr>
-        <w:pBdr>
-          <w:left w:val="single" w:sz="18" w:space="6" w:color="C0C0C0"/>
-        </w:pBdr>
-        <w:shd w:val="clear" w:color="auto" w:fill="F4F4F4"/>
-      </w:pPr>
-      <w:r>
-        <w:rPr>
-          <w:rFonts w:ascii="Consolas" w:eastAsia="Consolas" w:hAnsi="Consolas" w:cs="Consolas"/>
-          <w:sz w:val="18"/>
-          <w:szCs w:val="18"/>
-        </w:rPr>
-        <w:t xml:space="preserve">  -d '{"email":"cs002@aa.com","password":"pwd1234"}' \</w:t>
-      </w:r>
-    </w:p>
-    <w:p>
-      <w:pPr>
-        <w:pBdr>
-          <w:left w:val="single" w:sz="18" w:space="6" w:color="C0C0C0"/>
-          <w:bottom w:val="single" w:sz="4" w:space="3" w:color="D9D9D9"/>
-        </w:pBdr>
-        <w:shd w:val="clear" w:color="auto" w:fill="F4F4F4"/>
-      </w:pPr>
-      <w:r>
-        <w:rPr>
-          <w:rFonts w:ascii="Consolas" w:eastAsia="Consolas" w:hAnsi="Consolas" w:cs="Consolas"/>
-          <w:sz w:val="18"/>
-          <w:szCs w:val="18"/>
-        </w:rPr>
-        <w:t xml:space="preserve">  | sed -n 's/.*"accessToken":"\([^"]*\)".*/\1/p')</w:t>
-      </w:r>
-    </w:p>
-    <w:p>
-      <w:pPr>
-        <w:pBdr>
-          <w:top w:val="single" w:sz="4" w:space="3" w:color="D9D9D9"/>
-          <w:left w:val="single" w:sz="18" w:space="6" w:color="C0C0C0"/>
-          <w:bottom w:val="single" w:sz="4" w:space="3" w:color="D9D9D9"/>
-        </w:pBdr>
-        <w:shd w:val="clear" w:color="auto" w:fill="F4F4F4"/>
-      </w:pPr>
-      <w:r>
-        <w:rPr>
-          <w:rFonts w:ascii="Consolas" w:eastAsia="Consolas" w:hAnsi="Consolas" w:cs="Consolas"/>
-          <w:sz w:val="18"/>
-          <w:szCs w:val="18"/>
-        </w:rPr>
-        <w:t>curl -X PUT -H "Authorization: Bearer $OTHER_TOKEN" ... http://localhost:8080/api/students/1</w:t>
-      </w:r>
-    </w:p>
-    <w:p>
-      <w:pPr>
-        <w:pBdr>
-          <w:top w:val="single" w:sz="4" w:space="3" w:color="D9D9D9"/>
-          <w:left w:val="single" w:sz="18" w:space="6" w:color="C0C0C0"/>
-          <w:bottom w:val="single" w:sz="4" w:space="3" w:color="D9D9D9"/>
-        </w:pBdr>
-        <w:shd w:val="clear" w:color="auto" w:fill="F4F4F4"/>
-      </w:pPr>
-      <w:r>
-        <w:rPr>
-          <w:rFonts w:ascii="Consolas" w:eastAsia="Consolas" w:hAnsi="Consolas" w:cs="Consolas"/>
-          <w:sz w:val="18"/>
-          <w:szCs w:val="18"/>
-        </w:rPr>
-        <w:t>{"statusCode":403,"message":"</w:t>
-      </w:r>
-      <w:r>
-        <w:rPr>
-          <w:rFonts w:ascii="Consolas" w:eastAsia="Consolas" w:hAnsi="Consolas" w:cs="Consolas"/>
-          <w:sz w:val="18"/>
-          <w:szCs w:val="18"/>
-        </w:rPr>
-        <w:t>본인이</w:t>
-      </w:r>
-      <w:r>
-        <w:rPr>
-          <w:rFonts w:ascii="Consolas" w:eastAsia="Consolas" w:hAnsi="Consolas" w:cs="Consolas"/>
-          <w:sz w:val="18"/>
-          <w:szCs w:val="18"/>
-        </w:rPr>
-        <w:t xml:space="preserve"> </w:t>
-      </w:r>
-      <w:r>
-        <w:rPr>
-          <w:rFonts w:ascii="Consolas" w:eastAsia="Consolas" w:hAnsi="Consolas" w:cs="Consolas"/>
-          <w:sz w:val="18"/>
-          <w:szCs w:val="18"/>
-        </w:rPr>
-        <w:t>등록한</w:t>
-      </w:r>
-      <w:r>
-        <w:rPr>
-          <w:rFonts w:ascii="Consolas" w:eastAsia="Consolas" w:hAnsi="Consolas" w:cs="Consolas"/>
-          <w:sz w:val="18"/>
-          <w:szCs w:val="18"/>
-        </w:rPr>
-        <w:t xml:space="preserve"> </w:t>
-      </w:r>
-      <w:r>
-        <w:rPr>
-          <w:rFonts w:ascii="Consolas" w:eastAsia="Consolas" w:hAnsi="Consolas" w:cs="Consolas"/>
-          <w:sz w:val="18"/>
-          <w:szCs w:val="18"/>
-        </w:rPr>
-        <w:t>학생</w:t>
-      </w:r>
-      <w:r>
-        <w:rPr>
-          <w:rFonts w:ascii="Consolas" w:eastAsia="Consolas" w:hAnsi="Consolas" w:cs="Consolas"/>
-          <w:sz w:val="18"/>
-          <w:szCs w:val="18"/>
-        </w:rPr>
-        <w:t xml:space="preserve"> </w:t>
-      </w:r>
-      <w:r>
-        <w:rPr>
-          <w:rFonts w:ascii="Consolas" w:eastAsia="Consolas" w:hAnsi="Consolas" w:cs="Consolas"/>
-          <w:sz w:val="18"/>
-          <w:szCs w:val="18"/>
-        </w:rPr>
-        <w:t>정보만</w:t>
-      </w:r>
-      <w:r>
-        <w:rPr>
-          <w:rFonts w:ascii="Consolas" w:eastAsia="Consolas" w:hAnsi="Consolas" w:cs="Consolas"/>
-          <w:sz w:val="18"/>
-          <w:szCs w:val="18"/>
-        </w:rPr>
-        <w:t xml:space="preserve"> </w:t>
-      </w:r>
-      <w:r>
-        <w:rPr>
-          <w:rFonts w:ascii="Consolas" w:eastAsia="Consolas" w:hAnsi="Consolas" w:cs="Consolas"/>
-          <w:sz w:val="18"/>
-          <w:szCs w:val="18"/>
-        </w:rPr>
-        <w:t>수정할</w:t>
-      </w:r>
-      <w:r>
-        <w:rPr>
-          <w:rFonts w:ascii="Consolas" w:eastAsia="Consolas" w:hAnsi="Consolas" w:cs="Consolas"/>
-          <w:sz w:val="18"/>
-          <w:szCs w:val="18"/>
-        </w:rPr>
-        <w:t xml:space="preserve"> </w:t>
-      </w:r>
-      <w:r>
-        <w:rPr>
-          <w:rFonts w:ascii="Consolas" w:eastAsia="Consolas" w:hAnsi="Consolas" w:cs="Consolas"/>
-          <w:sz w:val="18"/>
-          <w:szCs w:val="18"/>
-        </w:rPr>
-        <w:t>수</w:t>
-      </w:r>
-      <w:r>
-        <w:rPr>
-          <w:rFonts w:ascii="Consolas" w:eastAsia="Consolas" w:hAnsi="Consolas" w:cs="Consolas"/>
-          <w:sz w:val="18"/>
-          <w:szCs w:val="18"/>
-        </w:rPr>
-        <w:t xml:space="preserve"> </w:t>
-      </w:r>
-      <w:r>
-        <w:rPr>
-          <w:rFonts w:ascii="Consolas" w:eastAsia="Consolas" w:hAnsi="Consolas" w:cs="Consolas"/>
-          <w:sz w:val="18"/>
-          <w:szCs w:val="18"/>
-        </w:rPr>
-        <w:t>있습니다</w:t>
-      </w:r>
-      <w:r>
-        <w:rPr>
-          <w:rFonts w:ascii="Consolas" w:eastAsia="Consolas" w:hAnsi="Consolas" w:cs="Consolas"/>
-          <w:sz w:val="18"/>
-          <w:szCs w:val="18"/>
-        </w:rPr>
-        <w:t>", ...}</w:t>
+        <w:t>{"statusCode":403,"message":"본인이 등록한 학생 정보만 수정할 수 있습니다", ...}</w:t>
       </w:r>
     </w:p>
     <w:p>
@@ -5389,6 +4703,25 @@
     </w:p>
     <w:p>
       <w:pPr>
+        <w:rPr>
+          <w:b/>
+          <w:bCs/>
+          <w:color w:val="2E5496"/>
+          <w:sz w:val="24"/>
+          <w:szCs w:val="24"/>
+        </w:rPr>
+      </w:pPr>
+      <w:r>
+        <w:rPr>
+          <w:b/>
+          <w:bCs/>
+          <w:color w:val="2E5496"/>
+        </w:rPr>
+        <w:br w:type="page"/>
+      </w:r>
+    </w:p>
+    <w:p>
+      <w:pPr>
         <w:pStyle w:val="3"/>
         <w:spacing w:before="200" w:after="90"/>
       </w:pPr>
@@ -5398,6 +4731,7 @@
           <w:bCs/>
           <w:color w:val="2E5496"/>
         </w:rPr>
+        <w:lastRenderedPageBreak/>
         <w:t>7-2. 추가 방어 대책 (일반 대책)</w:t>
       </w:r>
     </w:p>
@@ -5418,7 +4752,6 @@
           <w:b/>
           <w:bCs/>
         </w:rPr>
-        <w:lastRenderedPageBreak/>
         <w:t xml:space="preserve">• 기본 거부(Deny by default) — </w:t>
       </w:r>
       <w:r>

</xml_diff>